<commit_message>
Fix missing figures in .docx: convert images to RGB PNG + full-width architecture figure
</commit_message>
<xml_diff>
--- a/paper/GraminSahay_IEEE_Paper.docx
+++ b/paper/GraminSahay_IEEE_Paper.docx
@@ -2173,7 +2173,7 @@
       <w:r>
         <w:drawing>
           <wp:inline distT="0" distB="0" distL="0" distR="0">
-            <wp:extent cx="2736000" cy="684000"/>
+            <wp:extent cx="2664000" cy="666000"/>
             <wp:docPr id="1" name="fig1"/>
             <a:graphic xmlns:a="http://schemas.openxmlformats.org/drawingml/2006/main">
               <a:graphicData uri="http://schemas.openxmlformats.org/drawingml/2006/picture">
@@ -2191,7 +2191,7 @@
                   <pic:spPr>
                     <a:xfrm>
                       <a:off x="0" y="0"/>
-                      <a:ext cx="2736000" cy="684000"/>
+                      <a:ext cx="2664000" cy="666000"/>
                     </a:xfrm>
                     <a:prstGeom prst="rect">
                       <a:avLst/>
@@ -2255,7 +2255,7 @@
       <w:r>
         <w:drawing>
           <wp:inline distT="0" distB="0" distL="0" distR="0">
-            <wp:extent cx="2736000" cy="1149120"/>
+            <wp:extent cx="2664000" cy="1118880"/>
             <wp:docPr id="2" name="fig2"/>
             <a:graphic xmlns:a="http://schemas.openxmlformats.org/drawingml/2006/main">
               <a:graphicData uri="http://schemas.openxmlformats.org/drawingml/2006/picture">
@@ -2273,7 +2273,7 @@
                   <pic:spPr>
                     <a:xfrm>
                       <a:off x="0" y="0"/>
-                      <a:ext cx="2736000" cy="1149120"/>
+                      <a:ext cx="2664000" cy="1118880"/>
                     </a:xfrm>
                     <a:prstGeom prst="rect">
                       <a:avLst/>
@@ -2470,13 +2470,23 @@
     </w:p>
     <w:p>
       <w:pPr>
+        <w:sectPr>
+          <w:type w:val="continuous"/>
+          <w:pgSz w:w="11906" w:h="16838"/>
+          <w:pgMar w:top="1000" w:right="850" w:bottom="1000" w:left="850"/>
+          <w:cols w:num="1"/>
+        </w:sectPr>
+      </w:pPr>
+    </w:p>
+    <w:p>
+      <w:pPr>
         <w:jc w:val="center"/>
         <w:spacing w:after="40"/>
       </w:pPr>
       <w:r>
         <w:drawing>
           <wp:inline distT="0" distB="0" distL="0" distR="0">
-            <wp:extent cx="2736000" cy="4256000"/>
+            <wp:extent cx="3960000" cy="6160000"/>
             <wp:docPr id="3" name="fig3"/>
             <a:graphic xmlns:a="http://schemas.openxmlformats.org/drawingml/2006/main">
               <a:graphicData uri="http://schemas.openxmlformats.org/drawingml/2006/picture">
@@ -2494,7 +2504,7 @@
                   <pic:spPr>
                     <a:xfrm>
                       <a:off x="0" y="0"/>
-                      <a:ext cx="2736000" cy="4256000"/>
+                      <a:ext cx="3960000" cy="6160000"/>
                     </a:xfrm>
                     <a:prstGeom prst="rect">
                       <a:avLst/>
@@ -2520,6 +2530,16 @@
         </w:rPr>
         <w:t xml:space="preserve">Fig. 3.  Layered system flow and architecture of GraminSahay.</w:t>
       </w:r>
+    </w:p>
+    <w:p>
+      <w:pPr>
+        <w:sectPr>
+          <w:type w:val="continuous"/>
+          <w:pgSz w:w="11906" w:h="16838"/>
+          <w:pgMar w:top="1000" w:right="850" w:bottom="1000" w:left="850" w:header="0" w:footer="0" w:gutter="0"/>
+          <w:cols w:num="2" w:space="360"/>
+        </w:sectPr>
+      </w:pPr>
     </w:p>
     <w:p>
       <w:pPr>
@@ -3701,7 +3721,7 @@
       <w:r>
         <w:drawing>
           <wp:inline distT="0" distB="0" distL="0" distR="0">
-            <wp:extent cx="2736000" cy="1856571"/>
+            <wp:extent cx="2664000" cy="1807714"/>
             <wp:docPr id="4" name="fig4"/>
             <a:graphic xmlns:a="http://schemas.openxmlformats.org/drawingml/2006/main">
               <a:graphicData uri="http://schemas.openxmlformats.org/drawingml/2006/picture">
@@ -3719,7 +3739,7 @@
                   <pic:spPr>
                     <a:xfrm>
                       <a:off x="0" y="0"/>
-                      <a:ext cx="2736000" cy="1856571"/>
+                      <a:ext cx="2664000" cy="1807714"/>
                     </a:xfrm>
                     <a:prstGeom prst="rect">
                       <a:avLst/>
@@ -3754,7 +3774,7 @@
       <w:r>
         <w:drawing>
           <wp:inline distT="0" distB="0" distL="0" distR="0">
-            <wp:extent cx="2736000" cy="1856571"/>
+            <wp:extent cx="2664000" cy="1807714"/>
             <wp:docPr id="5" name="fig5"/>
             <a:graphic xmlns:a="http://schemas.openxmlformats.org/drawingml/2006/main">
               <a:graphicData uri="http://schemas.openxmlformats.org/drawingml/2006/picture">
@@ -3772,7 +3792,7 @@
                   <pic:spPr>
                     <a:xfrm>
                       <a:off x="0" y="0"/>
-                      <a:ext cx="2736000" cy="1856571"/>
+                      <a:ext cx="2664000" cy="1807714"/>
                     </a:xfrm>
                     <a:prstGeom prst="rect">
                       <a:avLst/>

</xml_diff>

<commit_message>
Fix missing Existing/Proposed/Architecture figures: single-column layout, correct section handling
</commit_message>
<xml_diff>
--- a/paper/GraminSahay_IEEE_Paper.docx
+++ b/paper/GraminSahay_IEEE_Paper.docx
@@ -324,16 +324,6 @@
     </w:p>
     <w:p>
       <w:pPr>
-        <w:sectPr>
-          <w:type w:val="continuous"/>
-          <w:pgSz w:w="11906" w:h="16838"/>
-          <w:pgMar w:top="1000" w:right="850" w:bottom="1000" w:left="850"/>
-          <w:cols w:num="1"/>
-        </w:sectPr>
-      </w:pPr>
-    </w:p>
-    <w:p>
-      <w:pPr>
         <w:jc w:val="both"/>
         <w:spacing w:after="80" w:line="230" w:lineRule="auto"/>
       </w:pPr>
@@ -2173,7 +2163,7 @@
       <w:r>
         <w:drawing>
           <wp:inline distT="0" distB="0" distL="0" distR="0">
-            <wp:extent cx="2664000" cy="666000"/>
+            <wp:extent cx="5760000" cy="1440000"/>
             <wp:docPr id="1" name="fig1"/>
             <a:graphic xmlns:a="http://schemas.openxmlformats.org/drawingml/2006/main">
               <a:graphicData uri="http://schemas.openxmlformats.org/drawingml/2006/picture">
@@ -2191,7 +2181,7 @@
                   <pic:spPr>
                     <a:xfrm>
                       <a:off x="0" y="0"/>
-                      <a:ext cx="2664000" cy="666000"/>
+                      <a:ext cx="5760000" cy="1440000"/>
                     </a:xfrm>
                     <a:prstGeom prst="rect">
                       <a:avLst/>
@@ -2255,7 +2245,7 @@
       <w:r>
         <w:drawing>
           <wp:inline distT="0" distB="0" distL="0" distR="0">
-            <wp:extent cx="2664000" cy="1118880"/>
+            <wp:extent cx="5760000" cy="2419200"/>
             <wp:docPr id="2" name="fig2"/>
             <a:graphic xmlns:a="http://schemas.openxmlformats.org/drawingml/2006/main">
               <a:graphicData uri="http://schemas.openxmlformats.org/drawingml/2006/picture">
@@ -2273,7 +2263,7 @@
                   <pic:spPr>
                     <a:xfrm>
                       <a:off x="0" y="0"/>
-                      <a:ext cx="2664000" cy="1118880"/>
+                      <a:ext cx="5760000" cy="2419200"/>
                     </a:xfrm>
                     <a:prstGeom prst="rect">
                       <a:avLst/>
@@ -2470,23 +2460,13 @@
     </w:p>
     <w:p>
       <w:pPr>
-        <w:sectPr>
-          <w:type w:val="continuous"/>
-          <w:pgSz w:w="11906" w:h="16838"/>
-          <w:pgMar w:top="1000" w:right="850" w:bottom="1000" w:left="850"/>
-          <w:cols w:num="1"/>
-        </w:sectPr>
-      </w:pPr>
-    </w:p>
-    <w:p>
-      <w:pPr>
         <w:jc w:val="center"/>
         <w:spacing w:after="40"/>
       </w:pPr>
       <w:r>
         <w:drawing>
           <wp:inline distT="0" distB="0" distL="0" distR="0">
-            <wp:extent cx="3960000" cy="6160000"/>
+            <wp:extent cx="3780000" cy="5880000"/>
             <wp:docPr id="3" name="fig3"/>
             <a:graphic xmlns:a="http://schemas.openxmlformats.org/drawingml/2006/main">
               <a:graphicData uri="http://schemas.openxmlformats.org/drawingml/2006/picture">
@@ -2504,7 +2484,7 @@
                   <pic:spPr>
                     <a:xfrm>
                       <a:off x="0" y="0"/>
-                      <a:ext cx="3960000" cy="6160000"/>
+                      <a:ext cx="3780000" cy="5880000"/>
                     </a:xfrm>
                     <a:prstGeom prst="rect">
                       <a:avLst/>
@@ -2530,16 +2510,6 @@
         </w:rPr>
         <w:t xml:space="preserve">Fig. 3.  Layered system flow and architecture of GraminSahay.</w:t>
       </w:r>
-    </w:p>
-    <w:p>
-      <w:pPr>
-        <w:sectPr>
-          <w:type w:val="continuous"/>
-          <w:pgSz w:w="11906" w:h="16838"/>
-          <w:pgMar w:top="1000" w:right="850" w:bottom="1000" w:left="850" w:header="0" w:footer="0" w:gutter="0"/>
-          <w:cols w:num="2" w:space="360"/>
-        </w:sectPr>
-      </w:pPr>
     </w:p>
     <w:p>
       <w:pPr>
@@ -3721,7 +3691,7 @@
       <w:r>
         <w:drawing>
           <wp:inline distT="0" distB="0" distL="0" distR="0">
-            <wp:extent cx="2664000" cy="1807714"/>
+            <wp:extent cx="3960000" cy="2687142"/>
             <wp:docPr id="4" name="fig4"/>
             <a:graphic xmlns:a="http://schemas.openxmlformats.org/drawingml/2006/main">
               <a:graphicData uri="http://schemas.openxmlformats.org/drawingml/2006/picture">
@@ -3739,7 +3709,7 @@
                   <pic:spPr>
                     <a:xfrm>
                       <a:off x="0" y="0"/>
-                      <a:ext cx="2664000" cy="1807714"/>
+                      <a:ext cx="3960000" cy="2687142"/>
                     </a:xfrm>
                     <a:prstGeom prst="rect">
                       <a:avLst/>
@@ -3774,7 +3744,7 @@
       <w:r>
         <w:drawing>
           <wp:inline distT="0" distB="0" distL="0" distR="0">
-            <wp:extent cx="2664000" cy="1807714"/>
+            <wp:extent cx="3960000" cy="2687142"/>
             <wp:docPr id="5" name="fig5"/>
             <a:graphic xmlns:a="http://schemas.openxmlformats.org/drawingml/2006/main">
               <a:graphicData uri="http://schemas.openxmlformats.org/drawingml/2006/picture">
@@ -3792,7 +3762,7 @@
                   <pic:spPr>
                     <a:xfrm>
                       <a:off x="0" y="0"/>
-                      <a:ext cx="2664000" cy="1807714"/>
+                      <a:ext cx="3960000" cy="2687142"/>
                     </a:xfrm>
                     <a:prstGeom prst="rect">
                       <a:avLst/>
@@ -4239,8 +4209,8 @@
     <w:sectPr>
       <w:type w:val="continuous"/>
       <w:pgSz w:w="11906" w:h="16838"/>
-      <w:pgMar w:top="1000" w:right="850" w:bottom="1000" w:left="850" w:header="0" w:footer="0" w:gutter="0"/>
-      <w:cols w:num="2" w:space="360"/>
+      <w:pgMar w:top="1000" w:right="850" w:bottom="1000" w:left="850"/>
+      <w:cols w:num="1"/>
     </w:sectPr>
   </w:body>
 </w:document>

</xml_diff>

<commit_message>
Redraw figures with Times New Roman (clean B&W): PNG + SVG + editable .drawio; update .docx
</commit_message>
<xml_diff>
--- a/paper/GraminSahay_IEEE_Paper.docx
+++ b/paper/GraminSahay_IEEE_Paper.docx
@@ -2163,7 +2163,7 @@
       <w:r>
         <w:drawing>
           <wp:inline distT="0" distB="0" distL="0" distR="0">
-            <wp:extent cx="5760000" cy="1440000"/>
+            <wp:extent cx="5760000" cy="1475121"/>
             <wp:docPr id="1" name="fig1"/>
             <a:graphic xmlns:a="http://schemas.openxmlformats.org/drawingml/2006/main">
               <a:graphicData uri="http://schemas.openxmlformats.org/drawingml/2006/picture">
@@ -2181,7 +2181,7 @@
                   <pic:spPr>
                     <a:xfrm>
                       <a:off x="0" y="0"/>
-                      <a:ext cx="5760000" cy="1440000"/>
+                      <a:ext cx="5760000" cy="1475121"/>
                     </a:xfrm>
                     <a:prstGeom prst="rect">
                       <a:avLst/>
@@ -2245,7 +2245,7 @@
       <w:r>
         <w:drawing>
           <wp:inline distT="0" distB="0" distL="0" distR="0">
-            <wp:extent cx="5760000" cy="2419200"/>
+            <wp:extent cx="5760000" cy="2270117"/>
             <wp:docPr id="2" name="fig2"/>
             <a:graphic xmlns:a="http://schemas.openxmlformats.org/drawingml/2006/main">
               <a:graphicData uri="http://schemas.openxmlformats.org/drawingml/2006/picture">
@@ -2263,7 +2263,7 @@
                   <pic:spPr>
                     <a:xfrm>
                       <a:off x="0" y="0"/>
-                      <a:ext cx="5760000" cy="2419200"/>
+                      <a:ext cx="5760000" cy="2270117"/>
                     </a:xfrm>
                     <a:prstGeom prst="rect">
                       <a:avLst/>
@@ -2466,7 +2466,7 @@
       <w:r>
         <w:drawing>
           <wp:inline distT="0" distB="0" distL="0" distR="0">
-            <wp:extent cx="3780000" cy="5880000"/>
+            <wp:extent cx="3780000" cy="4494512"/>
             <wp:docPr id="3" name="fig3"/>
             <a:graphic xmlns:a="http://schemas.openxmlformats.org/drawingml/2006/main">
               <a:graphicData uri="http://schemas.openxmlformats.org/drawingml/2006/picture">
@@ -2484,7 +2484,7 @@
                   <pic:spPr>
                     <a:xfrm>
                       <a:off x="0" y="0"/>
-                      <a:ext cx="3780000" cy="5880000"/>
+                      <a:ext cx="3780000" cy="4494512"/>
                     </a:xfrm>
                     <a:prstGeom prst="rect">
                       <a:avLst/>
@@ -3691,7 +3691,7 @@
       <w:r>
         <w:drawing>
           <wp:inline distT="0" distB="0" distL="0" distR="0">
-            <wp:extent cx="3960000" cy="2687142"/>
+            <wp:extent cx="3960000" cy="2439642"/>
             <wp:docPr id="4" name="fig4"/>
             <a:graphic xmlns:a="http://schemas.openxmlformats.org/drawingml/2006/main">
               <a:graphicData uri="http://schemas.openxmlformats.org/drawingml/2006/picture">
@@ -3709,7 +3709,7 @@
                   <pic:spPr>
                     <a:xfrm>
                       <a:off x="0" y="0"/>
-                      <a:ext cx="3960000" cy="2687142"/>
+                      <a:ext cx="3960000" cy="2439642"/>
                     </a:xfrm>
                     <a:prstGeom prst="rect">
                       <a:avLst/>
@@ -3744,7 +3744,7 @@
       <w:r>
         <w:drawing>
           <wp:inline distT="0" distB="0" distL="0" distR="0">
-            <wp:extent cx="3960000" cy="2687142"/>
+            <wp:extent cx="3960000" cy="2439642"/>
             <wp:docPr id="5" name="fig5"/>
             <a:graphic xmlns:a="http://schemas.openxmlformats.org/drawingml/2006/main">
               <a:graphicData uri="http://schemas.openxmlformats.org/drawingml/2006/picture">
@@ -3762,7 +3762,7 @@
                   <pic:spPr>
                     <a:xfrm>
                       <a:off x="0" y="0"/>
-                      <a:ext cx="3960000" cy="2687142"/>
+                      <a:ext cx="3960000" cy="2439642"/>
                     </a:xfrm>
                     <a:prstGeom prst="rect">
                       <a:avLst/>

</xml_diff>

<commit_message>
Convert paper to two-column IEEE format; wide figures/tables span both columns
</commit_message>
<xml_diff>
--- a/paper/GraminSahay_IEEE_Paper.docx
+++ b/paper/GraminSahay_IEEE_Paper.docx
@@ -324,6 +324,16 @@
     </w:p>
     <w:p>
       <w:pPr>
+        <w:sectPr>
+          <w:type w:val="continuous"/>
+          <w:pgSz w:w="11906" w:h="16838"/>
+          <w:pgMar w:top="1000" w:right="850" w:bottom="1000" w:left="850"/>
+          <w:cols w:num="1"/>
+        </w:sectPr>
+      </w:pPr>
+    </w:p>
+    <w:p>
+      <w:pPr>
         <w:jc w:val="both"/>
         <w:spacing w:after="80" w:line="230" w:lineRule="auto"/>
       </w:pPr>
@@ -744,6 +754,17 @@
     </w:p>
     <w:p>
       <w:pPr>
+        <w:spacing w:after="0"/>
+        <w:sectPr>
+          <w:type w:val="continuous"/>
+          <w:pgSz w:w="11906" w:h="16838"/>
+          <w:pgMar w:top="1000" w:right="850" w:bottom="1000" w:left="850" w:header="0" w:footer="0" w:gutter="0"/>
+          <w:cols w:num="2" w:space="360"/>
+        </w:sectPr>
+      </w:pPr>
+    </w:p>
+    <w:p>
+      <w:pPr>
         <w:jc w:val="center"/>
         <w:spacing w:after="40" w:line="230" w:lineRule="auto"/>
       </w:pPr>
@@ -758,7 +779,8 @@
     </w:p>
     <w:tbl>
       <w:tblPr>
-        <w:tblW w:w="9000" w:type="dxa"/>
+        <w:tblW w:w="15000" w:type="dxa"/>
+        <w:jc w:val="center"/>
         <w:tblBorders>
           <w:top w:val="single" w:sz="4" w:space="0" w:color="000000"/>
           <w:left w:val="single" w:sz="4" w:space="0" w:color="000000"/>
@@ -770,10 +792,10 @@
       </w:tblPr>
       <w:tblGrid>
         <w:gridCol w:w="400"/>
-        <w:gridCol w:w="2600"/>
-        <w:gridCol w:w="2000"/>
-        <w:gridCol w:w="2000"/>
-        <w:gridCol w:w="2000"/>
+        <w:gridCol w:w="4400"/>
+        <w:gridCol w:w="3400"/>
+        <w:gridCol w:w="3400"/>
+        <w:gridCol w:w="3400"/>
       </w:tblGrid>
       <w:tr>
         <w:tc>
@@ -797,7 +819,7 @@
         </w:tc>
         <w:tc>
           <w:tcPr>
-            <w:tcW w:w="2600" w:type="dxa"/>
+            <w:tcW w:w="4400" w:type="dxa"/>
             <w:shd w:val="clear" w:fill="D9D9D9"/>
           </w:tcPr>
           <w:p>
@@ -816,7 +838,7 @@
         </w:tc>
         <w:tc>
           <w:tcPr>
-            <w:tcW w:w="2000" w:type="dxa"/>
+            <w:tcW w:w="3400" w:type="dxa"/>
             <w:shd w:val="clear" w:fill="D9D9D9"/>
           </w:tcPr>
           <w:p>
@@ -835,7 +857,7 @@
         </w:tc>
         <w:tc>
           <w:tcPr>
-            <w:tcW w:w="2000" w:type="dxa"/>
+            <w:tcW w:w="3400" w:type="dxa"/>
             <w:shd w:val="clear" w:fill="D9D9D9"/>
           </w:tcPr>
           <w:p>
@@ -854,7 +876,7 @@
         </w:tc>
         <w:tc>
           <w:tcPr>
-            <w:tcW w:w="2000" w:type="dxa"/>
+            <w:tcW w:w="3400" w:type="dxa"/>
             <w:shd w:val="clear" w:fill="D9D9D9"/>
           </w:tcPr>
           <w:p>
@@ -892,7 +914,7 @@
         </w:tc>
         <w:tc>
           <w:tcPr>
-            <w:tcW w:w="2600" w:type="dxa"/>
+            <w:tcW w:w="4400" w:type="dxa"/>
           </w:tcPr>
           <w:p>
             <w:pPr>
@@ -909,7 +931,7 @@
         </w:tc>
         <w:tc>
           <w:tcPr>
-            <w:tcW w:w="2000" w:type="dxa"/>
+            <w:tcW w:w="3400" w:type="dxa"/>
           </w:tcPr>
           <w:p>
             <w:pPr>
@@ -926,7 +948,7 @@
         </w:tc>
         <w:tc>
           <w:tcPr>
-            <w:tcW w:w="2000" w:type="dxa"/>
+            <w:tcW w:w="3400" w:type="dxa"/>
           </w:tcPr>
           <w:p>
             <w:pPr>
@@ -943,7 +965,7 @@
         </w:tc>
         <w:tc>
           <w:tcPr>
-            <w:tcW w:w="2000" w:type="dxa"/>
+            <w:tcW w:w="3400" w:type="dxa"/>
           </w:tcPr>
           <w:p>
             <w:pPr>
@@ -979,7 +1001,7 @@
         </w:tc>
         <w:tc>
           <w:tcPr>
-            <w:tcW w:w="2600" w:type="dxa"/>
+            <w:tcW w:w="4400" w:type="dxa"/>
           </w:tcPr>
           <w:p>
             <w:pPr>
@@ -996,7 +1018,7 @@
         </w:tc>
         <w:tc>
           <w:tcPr>
-            <w:tcW w:w="2000" w:type="dxa"/>
+            <w:tcW w:w="3400" w:type="dxa"/>
           </w:tcPr>
           <w:p>
             <w:pPr>
@@ -1013,7 +1035,7 @@
         </w:tc>
         <w:tc>
           <w:tcPr>
-            <w:tcW w:w="2000" w:type="dxa"/>
+            <w:tcW w:w="3400" w:type="dxa"/>
           </w:tcPr>
           <w:p>
             <w:pPr>
@@ -1030,7 +1052,7 @@
         </w:tc>
         <w:tc>
           <w:tcPr>
-            <w:tcW w:w="2000" w:type="dxa"/>
+            <w:tcW w:w="3400" w:type="dxa"/>
           </w:tcPr>
           <w:p>
             <w:pPr>
@@ -1066,7 +1088,7 @@
         </w:tc>
         <w:tc>
           <w:tcPr>
-            <w:tcW w:w="2600" w:type="dxa"/>
+            <w:tcW w:w="4400" w:type="dxa"/>
           </w:tcPr>
           <w:p>
             <w:pPr>
@@ -1083,7 +1105,7 @@
         </w:tc>
         <w:tc>
           <w:tcPr>
-            <w:tcW w:w="2000" w:type="dxa"/>
+            <w:tcW w:w="3400" w:type="dxa"/>
           </w:tcPr>
           <w:p>
             <w:pPr>
@@ -1100,7 +1122,7 @@
         </w:tc>
         <w:tc>
           <w:tcPr>
-            <w:tcW w:w="2000" w:type="dxa"/>
+            <w:tcW w:w="3400" w:type="dxa"/>
           </w:tcPr>
           <w:p>
             <w:pPr>
@@ -1117,7 +1139,7 @@
         </w:tc>
         <w:tc>
           <w:tcPr>
-            <w:tcW w:w="2000" w:type="dxa"/>
+            <w:tcW w:w="3400" w:type="dxa"/>
           </w:tcPr>
           <w:p>
             <w:pPr>
@@ -1153,7 +1175,7 @@
         </w:tc>
         <w:tc>
           <w:tcPr>
-            <w:tcW w:w="2600" w:type="dxa"/>
+            <w:tcW w:w="4400" w:type="dxa"/>
           </w:tcPr>
           <w:p>
             <w:pPr>
@@ -1170,7 +1192,7 @@
         </w:tc>
         <w:tc>
           <w:tcPr>
-            <w:tcW w:w="2000" w:type="dxa"/>
+            <w:tcW w:w="3400" w:type="dxa"/>
           </w:tcPr>
           <w:p>
             <w:pPr>
@@ -1187,7 +1209,7 @@
         </w:tc>
         <w:tc>
           <w:tcPr>
-            <w:tcW w:w="2000" w:type="dxa"/>
+            <w:tcW w:w="3400" w:type="dxa"/>
           </w:tcPr>
           <w:p>
             <w:pPr>
@@ -1204,7 +1226,7 @@
         </w:tc>
         <w:tc>
           <w:tcPr>
-            <w:tcW w:w="2000" w:type="dxa"/>
+            <w:tcW w:w="3400" w:type="dxa"/>
           </w:tcPr>
           <w:p>
             <w:pPr>
@@ -1240,7 +1262,7 @@
         </w:tc>
         <w:tc>
           <w:tcPr>
-            <w:tcW w:w="2600" w:type="dxa"/>
+            <w:tcW w:w="4400" w:type="dxa"/>
           </w:tcPr>
           <w:p>
             <w:pPr>
@@ -1257,7 +1279,7 @@
         </w:tc>
         <w:tc>
           <w:tcPr>
-            <w:tcW w:w="2000" w:type="dxa"/>
+            <w:tcW w:w="3400" w:type="dxa"/>
           </w:tcPr>
           <w:p>
             <w:pPr>
@@ -1274,7 +1296,7 @@
         </w:tc>
         <w:tc>
           <w:tcPr>
-            <w:tcW w:w="2000" w:type="dxa"/>
+            <w:tcW w:w="3400" w:type="dxa"/>
           </w:tcPr>
           <w:p>
             <w:pPr>
@@ -1291,7 +1313,7 @@
         </w:tc>
         <w:tc>
           <w:tcPr>
-            <w:tcW w:w="2000" w:type="dxa"/>
+            <w:tcW w:w="3400" w:type="dxa"/>
           </w:tcPr>
           <w:p>
             <w:pPr>
@@ -1327,7 +1349,7 @@
         </w:tc>
         <w:tc>
           <w:tcPr>
-            <w:tcW w:w="2600" w:type="dxa"/>
+            <w:tcW w:w="4400" w:type="dxa"/>
           </w:tcPr>
           <w:p>
             <w:pPr>
@@ -1344,7 +1366,7 @@
         </w:tc>
         <w:tc>
           <w:tcPr>
-            <w:tcW w:w="2000" w:type="dxa"/>
+            <w:tcW w:w="3400" w:type="dxa"/>
           </w:tcPr>
           <w:p>
             <w:pPr>
@@ -1361,7 +1383,7 @@
         </w:tc>
         <w:tc>
           <w:tcPr>
-            <w:tcW w:w="2000" w:type="dxa"/>
+            <w:tcW w:w="3400" w:type="dxa"/>
           </w:tcPr>
           <w:p>
             <w:pPr>
@@ -1378,7 +1400,7 @@
         </w:tc>
         <w:tc>
           <w:tcPr>
-            <w:tcW w:w="2000" w:type="dxa"/>
+            <w:tcW w:w="3400" w:type="dxa"/>
           </w:tcPr>
           <w:p>
             <w:pPr>
@@ -1414,7 +1436,7 @@
         </w:tc>
         <w:tc>
           <w:tcPr>
-            <w:tcW w:w="2600" w:type="dxa"/>
+            <w:tcW w:w="4400" w:type="dxa"/>
           </w:tcPr>
           <w:p>
             <w:pPr>
@@ -1431,7 +1453,7 @@
         </w:tc>
         <w:tc>
           <w:tcPr>
-            <w:tcW w:w="2000" w:type="dxa"/>
+            <w:tcW w:w="3400" w:type="dxa"/>
           </w:tcPr>
           <w:p>
             <w:pPr>
@@ -1448,7 +1470,7 @@
         </w:tc>
         <w:tc>
           <w:tcPr>
-            <w:tcW w:w="2000" w:type="dxa"/>
+            <w:tcW w:w="3400" w:type="dxa"/>
           </w:tcPr>
           <w:p>
             <w:pPr>
@@ -1465,7 +1487,7 @@
         </w:tc>
         <w:tc>
           <w:tcPr>
-            <w:tcW w:w="2000" w:type="dxa"/>
+            <w:tcW w:w="3400" w:type="dxa"/>
           </w:tcPr>
           <w:p>
             <w:pPr>
@@ -1501,7 +1523,7 @@
         </w:tc>
         <w:tc>
           <w:tcPr>
-            <w:tcW w:w="2600" w:type="dxa"/>
+            <w:tcW w:w="4400" w:type="dxa"/>
           </w:tcPr>
           <w:p>
             <w:pPr>
@@ -1518,7 +1540,7 @@
         </w:tc>
         <w:tc>
           <w:tcPr>
-            <w:tcW w:w="2000" w:type="dxa"/>
+            <w:tcW w:w="3400" w:type="dxa"/>
           </w:tcPr>
           <w:p>
             <w:pPr>
@@ -1535,7 +1557,7 @@
         </w:tc>
         <w:tc>
           <w:tcPr>
-            <w:tcW w:w="2000" w:type="dxa"/>
+            <w:tcW w:w="3400" w:type="dxa"/>
           </w:tcPr>
           <w:p>
             <w:pPr>
@@ -1552,7 +1574,7 @@
         </w:tc>
         <w:tc>
           <w:tcPr>
-            <w:tcW w:w="2000" w:type="dxa"/>
+            <w:tcW w:w="3400" w:type="dxa"/>
           </w:tcPr>
           <w:p>
             <w:pPr>
@@ -1588,7 +1610,7 @@
         </w:tc>
         <w:tc>
           <w:tcPr>
-            <w:tcW w:w="2600" w:type="dxa"/>
+            <w:tcW w:w="4400" w:type="dxa"/>
           </w:tcPr>
           <w:p>
             <w:pPr>
@@ -1605,7 +1627,7 @@
         </w:tc>
         <w:tc>
           <w:tcPr>
-            <w:tcW w:w="2000" w:type="dxa"/>
+            <w:tcW w:w="3400" w:type="dxa"/>
           </w:tcPr>
           <w:p>
             <w:pPr>
@@ -1622,7 +1644,7 @@
         </w:tc>
         <w:tc>
           <w:tcPr>
-            <w:tcW w:w="2000" w:type="dxa"/>
+            <w:tcW w:w="3400" w:type="dxa"/>
           </w:tcPr>
           <w:p>
             <w:pPr>
@@ -1639,7 +1661,7 @@
         </w:tc>
         <w:tc>
           <w:tcPr>
-            <w:tcW w:w="2000" w:type="dxa"/>
+            <w:tcW w:w="3400" w:type="dxa"/>
           </w:tcPr>
           <w:p>
             <w:pPr>
@@ -1675,7 +1697,7 @@
         </w:tc>
         <w:tc>
           <w:tcPr>
-            <w:tcW w:w="2600" w:type="dxa"/>
+            <w:tcW w:w="4400" w:type="dxa"/>
           </w:tcPr>
           <w:p>
             <w:pPr>
@@ -1692,7 +1714,7 @@
         </w:tc>
         <w:tc>
           <w:tcPr>
-            <w:tcW w:w="2000" w:type="dxa"/>
+            <w:tcW w:w="3400" w:type="dxa"/>
           </w:tcPr>
           <w:p>
             <w:pPr>
@@ -1709,7 +1731,7 @@
         </w:tc>
         <w:tc>
           <w:tcPr>
-            <w:tcW w:w="2000" w:type="dxa"/>
+            <w:tcW w:w="3400" w:type="dxa"/>
           </w:tcPr>
           <w:p>
             <w:pPr>
@@ -1726,7 +1748,7 @@
         </w:tc>
         <w:tc>
           <w:tcPr>
-            <w:tcW w:w="2000" w:type="dxa"/>
+            <w:tcW w:w="3400" w:type="dxa"/>
           </w:tcPr>
           <w:p>
             <w:pPr>
@@ -1746,6 +1768,17 @@
     <w:p>
       <w:pPr>
         <w:spacing w:after="80"/>
+      </w:pPr>
+    </w:p>
+    <w:p>
+      <w:pPr>
+        <w:spacing w:after="0"/>
+        <w:sectPr>
+          <w:type w:val="continuous"/>
+          <w:pgSz w:w="11906" w:h="16838"/>
+          <w:pgMar w:top="1000" w:right="850" w:bottom="1000" w:left="850"/>
+          <w:cols w:num="1"/>
+        </w:sectPr>
       </w:pPr>
     </w:p>
     <w:p>
@@ -2154,6 +2187,17 @@
         </w:rPr>
         <w:t xml:space="preserve">In the current approach, citizens manually search government portals and documents, typically needing to know a scheme’s name beforehand. Information is spread across multiple sources; eligibility and document requirements require manual interpretation; and personalized guidance is unavailable. The basic flow is shown in Fig. 1. Its principal limitations are manual search, limited personalization, language barriers, and no integrated conflict detection.</w:t>
       </w:r>
+    </w:p>
+    <w:p>
+      <w:pPr>
+        <w:spacing w:after="0"/>
+        <w:sectPr>
+          <w:type w:val="continuous"/>
+          <w:pgSz w:w="11906" w:h="16838"/>
+          <w:pgMar w:top="1000" w:right="850" w:bottom="1000" w:left="850" w:header="0" w:footer="0" w:gutter="0"/>
+          <w:cols w:num="2" w:space="360"/>
+        </w:sectPr>
+      </w:pPr>
     </w:p>
     <w:p>
       <w:pPr>
@@ -2210,6 +2254,17 @@
     </w:p>
     <w:p>
       <w:pPr>
+        <w:spacing w:after="0"/>
+        <w:sectPr>
+          <w:type w:val="continuous"/>
+          <w:pgSz w:w="11906" w:h="16838"/>
+          <w:pgMar w:top="1000" w:right="850" w:bottom="1000" w:left="850"/>
+          <w:cols w:num="1"/>
+        </w:sectPr>
+      </w:pPr>
+    </w:p>
+    <w:p>
+      <w:pPr>
         <w:jc w:val="left"/>
         <w:spacing w:after="60" w:line="230" w:lineRule="auto"/>
       </w:pPr>
@@ -2236,6 +2291,17 @@
         </w:rPr>
         <w:t xml:space="preserve">GraminSahay replaces name-based search with situation-first discovery, as illustrated in Fig. 2. A citizen’s spoken or typed description is converted to a structured profile; a RAG layer retrieves relevant passages from the official-document index; an LLM-based reasoning layer determines and explains eligibility; a conflict-detection layer warns about mutually exclusive benefits; and an application-guidance layer produces next steps. The final response is delivered as multilingual voice output in the citizen’s selected language.</w:t>
       </w:r>
+    </w:p>
+    <w:p>
+      <w:pPr>
+        <w:spacing w:after="0"/>
+        <w:sectPr>
+          <w:type w:val="continuous"/>
+          <w:pgSz w:w="11906" w:h="16838"/>
+          <w:pgMar w:top="1000" w:right="850" w:bottom="1000" w:left="850" w:header="0" w:footer="0" w:gutter="0"/>
+          <w:cols w:num="2" w:space="360"/>
+        </w:sectPr>
+      </w:pPr>
     </w:p>
     <w:p>
       <w:pPr>
@@ -2292,6 +2358,17 @@
     </w:p>
     <w:p>
       <w:pPr>
+        <w:spacing w:after="0"/>
+        <w:sectPr>
+          <w:type w:val="continuous"/>
+          <w:pgSz w:w="11906" w:h="16838"/>
+          <w:pgMar w:top="1000" w:right="850" w:bottom="1000" w:left="850"/>
+          <w:cols w:num="1"/>
+        </w:sectPr>
+      </w:pPr>
+    </w:p>
+    <w:p>
+      <w:pPr>
         <w:jc w:val="center"/>
         <w:spacing w:after="100" w:line="230" w:lineRule="auto"/>
       </w:pPr>
@@ -2460,13 +2537,24 @@
     </w:p>
     <w:p>
       <w:pPr>
+        <w:spacing w:after="0"/>
+        <w:sectPr>
+          <w:type w:val="continuous"/>
+          <w:pgSz w:w="11906" w:h="16838"/>
+          <w:pgMar w:top="1000" w:right="850" w:bottom="1000" w:left="850" w:header="0" w:footer="0" w:gutter="0"/>
+          <w:cols w:num="2" w:space="360"/>
+        </w:sectPr>
+      </w:pPr>
+    </w:p>
+    <w:p>
+      <w:pPr>
         <w:jc w:val="center"/>
         <w:spacing w:after="40"/>
       </w:pPr>
       <w:r>
         <w:drawing>
           <wp:inline distT="0" distB="0" distL="0" distR="0">
-            <wp:extent cx="3780000" cy="4494512"/>
+            <wp:extent cx="3960000" cy="4708536"/>
             <wp:docPr id="3" name="fig3"/>
             <a:graphic xmlns:a="http://schemas.openxmlformats.org/drawingml/2006/main">
               <a:graphicData uri="http://schemas.openxmlformats.org/drawingml/2006/picture">
@@ -2484,7 +2572,7 @@
                   <pic:spPr>
                     <a:xfrm>
                       <a:off x="0" y="0"/>
-                      <a:ext cx="3780000" cy="4494512"/>
+                      <a:ext cx="3960000" cy="4708536"/>
                     </a:xfrm>
                     <a:prstGeom prst="rect">
                       <a:avLst/>
@@ -2513,6 +2601,17 @@
     </w:p>
     <w:p>
       <w:pPr>
+        <w:spacing w:after="0"/>
+        <w:sectPr>
+          <w:type w:val="continuous"/>
+          <w:pgSz w:w="11906" w:h="16838"/>
+          <w:pgMar w:top="1000" w:right="850" w:bottom="1000" w:left="850"/>
+          <w:cols w:num="1"/>
+        </w:sectPr>
+      </w:pPr>
+    </w:p>
+    <w:p>
+      <w:pPr>
         <w:jc w:val="center"/>
         <w:spacing w:after="100" w:line="230" w:lineRule="auto"/>
       </w:pPr>
@@ -2570,6 +2669,17 @@
     </w:p>
     <w:p>
       <w:pPr>
+        <w:spacing w:after="0"/>
+        <w:sectPr>
+          <w:type w:val="continuous"/>
+          <w:pgSz w:w="11906" w:h="16838"/>
+          <w:pgMar w:top="1000" w:right="850" w:bottom="1000" w:left="850" w:header="0" w:footer="0" w:gutter="0"/>
+          <w:cols w:num="2" w:space="360"/>
+        </w:sectPr>
+      </w:pPr>
+    </w:p>
+    <w:p>
+      <w:pPr>
         <w:jc w:val="center"/>
         <w:spacing w:after="40" w:line="230" w:lineRule="auto"/>
       </w:pPr>
@@ -2585,6 +2695,7 @@
     <w:tbl>
       <w:tblPr>
         <w:tblW w:w="9000" w:type="dxa"/>
+        <w:jc w:val="center"/>
         <w:tblBorders>
           <w:top w:val="single" w:sz="4" w:space="0" w:color="000000"/>
           <w:left w:val="single" w:sz="4" w:space="0" w:color="000000"/>
@@ -3228,6 +3339,17 @@
     </w:p>
     <w:p>
       <w:pPr>
+        <w:spacing w:after="0"/>
+        <w:sectPr>
+          <w:type w:val="continuous"/>
+          <w:pgSz w:w="11906" w:h="16838"/>
+          <w:pgMar w:top="1000" w:right="850" w:bottom="1000" w:left="850"/>
+          <w:cols w:num="1"/>
+        </w:sectPr>
+      </w:pPr>
+    </w:p>
+    <w:p>
+      <w:pPr>
         <w:jc w:val="both"/>
         <w:ind w:firstLine="170"/>
         <w:spacing w:after="80" w:line="230" w:lineRule="auto"/>
@@ -3239,6 +3361,17 @@
         </w:rPr>
         <w:t xml:space="preserve">Table III contrasts GraminSahay with the existing manual approach on the qualitative capabilities identified as research gaps in Section III.</w:t>
       </w:r>
+    </w:p>
+    <w:p>
+      <w:pPr>
+        <w:spacing w:after="0"/>
+        <w:sectPr>
+          <w:type w:val="continuous"/>
+          <w:pgSz w:w="11906" w:h="16838"/>
+          <w:pgMar w:top="1000" w:right="850" w:bottom="1000" w:left="850" w:header="0" w:footer="0" w:gutter="0"/>
+          <w:cols w:num="2" w:space="360"/>
+        </w:sectPr>
+      </w:pPr>
     </w:p>
     <w:p>
       <w:pPr>
@@ -3257,6 +3390,7 @@
     <w:tbl>
       <w:tblPr>
         <w:tblW w:w="9000" w:type="dxa"/>
+        <w:jc w:val="center"/>
         <w:tblBorders>
           <w:top w:val="single" w:sz="4" w:space="0" w:color="000000"/>
           <w:left w:val="single" w:sz="4" w:space="0" w:color="000000"/>
@@ -3656,6 +3790,17 @@
     </w:p>
     <w:p>
       <w:pPr>
+        <w:spacing w:after="0"/>
+        <w:sectPr>
+          <w:type w:val="continuous"/>
+          <w:pgSz w:w="11906" w:h="16838"/>
+          <w:pgMar w:top="1000" w:right="850" w:bottom="1000" w:left="850"/>
+          <w:cols w:num="1"/>
+        </w:sectPr>
+      </w:pPr>
+    </w:p>
+    <w:p>
+      <w:pPr>
         <w:jc w:val="left"/>
         <w:spacing w:after="60" w:line="230" w:lineRule="auto"/>
       </w:pPr>
@@ -3691,7 +3836,7 @@
       <w:r>
         <w:drawing>
           <wp:inline distT="0" distB="0" distL="0" distR="0">
-            <wp:extent cx="3960000" cy="2439642"/>
+            <wp:extent cx="2880000" cy="1774285"/>
             <wp:docPr id="4" name="fig4"/>
             <a:graphic xmlns:a="http://schemas.openxmlformats.org/drawingml/2006/main">
               <a:graphicData uri="http://schemas.openxmlformats.org/drawingml/2006/picture">
@@ -3709,7 +3854,7 @@
                   <pic:spPr>
                     <a:xfrm>
                       <a:off x="0" y="0"/>
-                      <a:ext cx="3960000" cy="2439642"/>
+                      <a:ext cx="2880000" cy="1774285"/>
                     </a:xfrm>
                     <a:prstGeom prst="rect">
                       <a:avLst/>
@@ -3744,7 +3889,7 @@
       <w:r>
         <w:drawing>
           <wp:inline distT="0" distB="0" distL="0" distR="0">
-            <wp:extent cx="3960000" cy="2439642"/>
+            <wp:extent cx="2880000" cy="1774285"/>
             <wp:docPr id="5" name="fig5"/>
             <a:graphic xmlns:a="http://schemas.openxmlformats.org/drawingml/2006/main">
               <a:graphicData uri="http://schemas.openxmlformats.org/drawingml/2006/picture">
@@ -3762,7 +3907,7 @@
                   <pic:spPr>
                     <a:xfrm>
                       <a:off x="0" y="0"/>
-                      <a:ext cx="3960000" cy="2439642"/>
+                      <a:ext cx="2880000" cy="1774285"/>
                     </a:xfrm>
                     <a:prstGeom prst="rect">
                       <a:avLst/>
@@ -4209,8 +4354,8 @@
     <w:sectPr>
       <w:type w:val="continuous"/>
       <w:pgSz w:w="11906" w:h="16838"/>
-      <w:pgMar w:top="1000" w:right="850" w:bottom="1000" w:left="850"/>
-      <w:cols w:num="1"/>
+      <w:pgMar w:top="1000" w:right="850" w:bottom="1000" w:left="850" w:header="0" w:footer="0" w:gutter="0"/>
+      <w:cols w:num="2" w:space="360"/>
     </w:sectPr>
   </w:body>
 </w:document>

</xml_diff>

<commit_message>
Set paper font to Times New Roman throughout .docx
</commit_message>
<xml_diff>
--- a/paper/GraminSahay_IEEE_Paper.docx
+++ b/paper/GraminSahay_IEEE_Paper.docx
@@ -9,6 +9,7 @@
       </w:pPr>
       <w:r>
         <w:rPr>
+          <w:rFonts w:ascii="Times New Roman" w:hAnsi="Times New Roman" w:cs="Times New Roman"/>
           <w:b/>
           <w:sz w:val="30"/>
           <w:szCs w:val="30"/>
@@ -47,6 +48,7 @@
             </w:pPr>
             <w:r>
               <w:rPr>
+                <w:rFonts w:ascii="Times New Roman" w:hAnsi="Times New Roman" w:cs="Times New Roman"/>
                 <w:b/>
                 <w:sz w:val="18"/>
                 <w:szCs w:val="18"/>
@@ -61,6 +63,7 @@
             </w:pPr>
             <w:r>
               <w:rPr>
+                <w:rFonts w:ascii="Times New Roman" w:hAnsi="Times New Roman" w:cs="Times New Roman"/>
                 <w:sz w:val="16"/>
                 <w:szCs w:val="16"/>
               </w:rPr>
@@ -74,6 +77,7 @@
             </w:pPr>
             <w:r>
               <w:rPr>
+                <w:rFonts w:ascii="Times New Roman" w:hAnsi="Times New Roman" w:cs="Times New Roman"/>
                 <w:sz w:val="16"/>
                 <w:szCs w:val="16"/>
               </w:rPr>
@@ -87,6 +91,7 @@
             </w:pPr>
             <w:r>
               <w:rPr>
+                <w:rFonts w:ascii="Times New Roman" w:hAnsi="Times New Roman" w:cs="Times New Roman"/>
                 <w:sz w:val="16"/>
                 <w:szCs w:val="16"/>
               </w:rPr>
@@ -105,6 +110,7 @@
             </w:pPr>
             <w:r>
               <w:rPr>
+                <w:rFonts w:ascii="Times New Roman" w:hAnsi="Times New Roman" w:cs="Times New Roman"/>
                 <w:b/>
                 <w:sz w:val="18"/>
                 <w:szCs w:val="18"/>
@@ -119,6 +125,7 @@
             </w:pPr>
             <w:r>
               <w:rPr>
+                <w:rFonts w:ascii="Times New Roman" w:hAnsi="Times New Roman" w:cs="Times New Roman"/>
                 <w:sz w:val="16"/>
                 <w:szCs w:val="16"/>
               </w:rPr>
@@ -132,6 +139,7 @@
             </w:pPr>
             <w:r>
               <w:rPr>
+                <w:rFonts w:ascii="Times New Roman" w:hAnsi="Times New Roman" w:cs="Times New Roman"/>
                 <w:sz w:val="16"/>
                 <w:szCs w:val="16"/>
               </w:rPr>
@@ -145,6 +153,7 @@
             </w:pPr>
             <w:r>
               <w:rPr>
+                <w:rFonts w:ascii="Times New Roman" w:hAnsi="Times New Roman" w:cs="Times New Roman"/>
                 <w:sz w:val="16"/>
                 <w:szCs w:val="16"/>
               </w:rPr>
@@ -158,6 +167,7 @@
             </w:pPr>
             <w:r>
               <w:rPr>
+                <w:rFonts w:ascii="Times New Roman" w:hAnsi="Times New Roman" w:cs="Times New Roman"/>
                 <w:sz w:val="16"/>
                 <w:szCs w:val="16"/>
               </w:rPr>
@@ -176,6 +186,7 @@
             </w:pPr>
             <w:r>
               <w:rPr>
+                <w:rFonts w:ascii="Times New Roman" w:hAnsi="Times New Roman" w:cs="Times New Roman"/>
                 <w:b/>
                 <w:sz w:val="18"/>
                 <w:szCs w:val="18"/>
@@ -190,6 +201,7 @@
             </w:pPr>
             <w:r>
               <w:rPr>
+                <w:rFonts w:ascii="Times New Roman" w:hAnsi="Times New Roman" w:cs="Times New Roman"/>
                 <w:sz w:val="16"/>
                 <w:szCs w:val="16"/>
               </w:rPr>
@@ -203,6 +215,7 @@
             </w:pPr>
             <w:r>
               <w:rPr>
+                <w:rFonts w:ascii="Times New Roman" w:hAnsi="Times New Roman" w:cs="Times New Roman"/>
                 <w:sz w:val="16"/>
                 <w:szCs w:val="16"/>
               </w:rPr>
@@ -216,6 +229,7 @@
             </w:pPr>
             <w:r>
               <w:rPr>
+                <w:rFonts w:ascii="Times New Roman" w:hAnsi="Times New Roman" w:cs="Times New Roman"/>
                 <w:sz w:val="16"/>
                 <w:szCs w:val="16"/>
               </w:rPr>
@@ -229,6 +243,7 @@
             </w:pPr>
             <w:r>
               <w:rPr>
+                <w:rFonts w:ascii="Times New Roman" w:hAnsi="Times New Roman" w:cs="Times New Roman"/>
                 <w:sz w:val="16"/>
                 <w:szCs w:val="16"/>
               </w:rPr>
@@ -247,6 +262,7 @@
             </w:pPr>
             <w:r>
               <w:rPr>
+                <w:rFonts w:ascii="Times New Roman" w:hAnsi="Times New Roman" w:cs="Times New Roman"/>
                 <w:b/>
                 <w:sz w:val="18"/>
                 <w:szCs w:val="18"/>
@@ -261,6 +277,7 @@
             </w:pPr>
             <w:r>
               <w:rPr>
+                <w:rFonts w:ascii="Times New Roman" w:hAnsi="Times New Roman" w:cs="Times New Roman"/>
                 <w:sz w:val="16"/>
                 <w:szCs w:val="16"/>
               </w:rPr>
@@ -274,6 +291,7 @@
             </w:pPr>
             <w:r>
               <w:rPr>
+                <w:rFonts w:ascii="Times New Roman" w:hAnsi="Times New Roman" w:cs="Times New Roman"/>
                 <w:sz w:val="16"/>
                 <w:szCs w:val="16"/>
               </w:rPr>
@@ -287,6 +305,7 @@
             </w:pPr>
             <w:r>
               <w:rPr>
+                <w:rFonts w:ascii="Times New Roman" w:hAnsi="Times New Roman" w:cs="Times New Roman"/>
                 <w:sz w:val="16"/>
                 <w:szCs w:val="16"/>
               </w:rPr>
@@ -300,6 +319,7 @@
             </w:pPr>
             <w:r>
               <w:rPr>
+                <w:rFonts w:ascii="Times New Roman" w:hAnsi="Times New Roman" w:cs="Times New Roman"/>
                 <w:sz w:val="16"/>
                 <w:szCs w:val="16"/>
               </w:rPr>
@@ -316,6 +336,7 @@
       </w:pPr>
       <w:r>
         <w:rPr>
+          <w:rFonts w:ascii="Times New Roman" w:hAnsi="Times New Roman" w:cs="Times New Roman"/>
           <w:sz w:val="12"/>
           <w:szCs w:val="12"/>
         </w:rPr>
@@ -339,6 +360,7 @@
       </w:pPr>
       <w:r>
         <w:rPr>
+          <w:rFonts w:ascii="Times New Roman" w:hAnsi="Times New Roman" w:cs="Times New Roman"/>
           <w:b/>
           <w:i/>
           <w:sz w:val="19"/>
@@ -348,6 +370,7 @@
       </w:r>
       <w:r>
         <w:rPr>
+          <w:rFonts w:ascii="Times New Roman" w:hAnsi="Times New Roman" w:cs="Times New Roman"/>
           <w:b/>
           <w:i/>
           <w:sz w:val="19"/>
@@ -363,6 +386,7 @@
       </w:pPr>
       <w:r>
         <w:rPr>
+          <w:rFonts w:ascii="Times New Roman" w:hAnsi="Times New Roman" w:cs="Times New Roman"/>
           <w:b/>
           <w:i/>
           <w:sz w:val="19"/>
@@ -372,6 +396,7 @@
       </w:r>
       <w:r>
         <w:rPr>
+          <w:rFonts w:ascii="Times New Roman" w:hAnsi="Times New Roman" w:cs="Times New Roman"/>
           <w:b/>
           <w:i/>
           <w:sz w:val="19"/>
@@ -387,6 +412,7 @@
       </w:pPr>
       <w:r>
         <w:rPr>
+          <w:rFonts w:ascii="Times New Roman" w:hAnsi="Times New Roman" w:cs="Times New Roman"/>
           <w:b/>
           <w:sz w:val="20"/>
           <w:szCs w:val="20"/>
@@ -402,6 +428,7 @@
       </w:pPr>
       <w:r>
         <w:rPr>
+          <w:rFonts w:ascii="Times New Roman" w:hAnsi="Times New Roman" w:cs="Times New Roman"/>
           <w:sz w:val="19"/>
           <w:szCs w:val="19"/>
         </w:rPr>
@@ -416,6 +443,7 @@
       </w:pPr>
       <w:r>
         <w:rPr>
+          <w:rFonts w:ascii="Times New Roman" w:hAnsi="Times New Roman" w:cs="Times New Roman"/>
           <w:sz w:val="19"/>
           <w:szCs w:val="19"/>
         </w:rPr>
@@ -430,6 +458,7 @@
       </w:pPr>
       <w:r>
         <w:rPr>
+          <w:rFonts w:ascii="Times New Roman" w:hAnsi="Times New Roman" w:cs="Times New Roman"/>
           <w:sz w:val="19"/>
           <w:szCs w:val="19"/>
         </w:rPr>
@@ -444,6 +473,7 @@
       </w:pPr>
       <w:r>
         <w:rPr>
+          <w:rFonts w:ascii="Times New Roman" w:hAnsi="Times New Roman" w:cs="Times New Roman"/>
           <w:sz w:val="19"/>
           <w:szCs w:val="19"/>
         </w:rPr>
@@ -458,6 +488,7 @@
       </w:pPr>
       <w:r>
         <w:rPr>
+          <w:rFonts w:ascii="Times New Roman" w:hAnsi="Times New Roman" w:cs="Times New Roman"/>
           <w:sz w:val="19"/>
           <w:szCs w:val="19"/>
         </w:rPr>
@@ -472,6 +503,7 @@
       </w:pPr>
       <w:r>
         <w:rPr>
+          <w:rFonts w:ascii="Times New Roman" w:hAnsi="Times New Roman" w:cs="Times New Roman"/>
           <w:sz w:val="19"/>
           <w:szCs w:val="19"/>
         </w:rPr>
@@ -486,6 +518,7 @@
       </w:pPr>
       <w:r>
         <w:rPr>
+          <w:rFonts w:ascii="Times New Roman" w:hAnsi="Times New Roman" w:cs="Times New Roman"/>
           <w:sz w:val="19"/>
           <w:szCs w:val="19"/>
         </w:rPr>
@@ -499,6 +532,7 @@
       </w:pPr>
       <w:r>
         <w:rPr>
+          <w:rFonts w:ascii="Times New Roman" w:hAnsi="Times New Roman" w:cs="Times New Roman"/>
           <w:b/>
           <w:sz w:val="20"/>
           <w:szCs w:val="20"/>
@@ -514,6 +548,7 @@
       </w:pPr>
       <w:r>
         <w:rPr>
+          <w:rFonts w:ascii="Times New Roman" w:hAnsi="Times New Roman" w:cs="Times New Roman"/>
           <w:sz w:val="19"/>
           <w:szCs w:val="19"/>
         </w:rPr>
@@ -527,6 +562,7 @@
       </w:pPr>
       <w:r>
         <w:rPr>
+          <w:rFonts w:ascii="Times New Roman" w:hAnsi="Times New Roman" w:cs="Times New Roman"/>
           <w:b/>
           <w:i/>
           <w:sz w:val="19"/>
@@ -543,6 +579,7 @@
       </w:pPr>
       <w:r>
         <w:rPr>
+          <w:rFonts w:ascii="Times New Roman" w:hAnsi="Times New Roman" w:cs="Times New Roman"/>
           <w:sz w:val="19"/>
           <w:szCs w:val="19"/>
         </w:rPr>
@@ -556,6 +593,7 @@
       </w:pPr>
       <w:r>
         <w:rPr>
+          <w:rFonts w:ascii="Times New Roman" w:hAnsi="Times New Roman" w:cs="Times New Roman"/>
           <w:b/>
           <w:i/>
           <w:sz w:val="19"/>
@@ -572,6 +610,7 @@
       </w:pPr>
       <w:r>
         <w:rPr>
+          <w:rFonts w:ascii="Times New Roman" w:hAnsi="Times New Roman" w:cs="Times New Roman"/>
           <w:sz w:val="19"/>
           <w:szCs w:val="19"/>
         </w:rPr>
@@ -585,6 +624,7 @@
       </w:pPr>
       <w:r>
         <w:rPr>
+          <w:rFonts w:ascii="Times New Roman" w:hAnsi="Times New Roman" w:cs="Times New Roman"/>
           <w:b/>
           <w:i/>
           <w:sz w:val="19"/>
@@ -601,6 +641,7 @@
       </w:pPr>
       <w:r>
         <w:rPr>
+          <w:rFonts w:ascii="Times New Roman" w:hAnsi="Times New Roman" w:cs="Times New Roman"/>
           <w:sz w:val="19"/>
           <w:szCs w:val="19"/>
         </w:rPr>
@@ -614,6 +655,7 @@
       </w:pPr>
       <w:r>
         <w:rPr>
+          <w:rFonts w:ascii="Times New Roman" w:hAnsi="Times New Roman" w:cs="Times New Roman"/>
           <w:b/>
           <w:i/>
           <w:sz w:val="19"/>
@@ -630,6 +672,7 @@
       </w:pPr>
       <w:r>
         <w:rPr>
+          <w:rFonts w:ascii="Times New Roman" w:hAnsi="Times New Roman" w:cs="Times New Roman"/>
           <w:sz w:val="19"/>
           <w:szCs w:val="19"/>
         </w:rPr>
@@ -643,6 +686,7 @@
       </w:pPr>
       <w:r>
         <w:rPr>
+          <w:rFonts w:ascii="Times New Roman" w:hAnsi="Times New Roman" w:cs="Times New Roman"/>
           <w:b/>
           <w:i/>
           <w:sz w:val="19"/>
@@ -659,6 +703,7 @@
       </w:pPr>
       <w:r>
         <w:rPr>
+          <w:rFonts w:ascii="Times New Roman" w:hAnsi="Times New Roman" w:cs="Times New Roman"/>
           <w:sz w:val="19"/>
           <w:szCs w:val="19"/>
         </w:rPr>
@@ -672,6 +717,7 @@
       </w:pPr>
       <w:r>
         <w:rPr>
+          <w:rFonts w:ascii="Times New Roman" w:hAnsi="Times New Roman" w:cs="Times New Roman"/>
           <w:b/>
           <w:i/>
           <w:sz w:val="19"/>
@@ -688,6 +734,7 @@
       </w:pPr>
       <w:r>
         <w:rPr>
+          <w:rFonts w:ascii="Times New Roman" w:hAnsi="Times New Roman" w:cs="Times New Roman"/>
           <w:sz w:val="19"/>
           <w:szCs w:val="19"/>
         </w:rPr>
@@ -701,6 +748,7 @@
       </w:pPr>
       <w:r>
         <w:rPr>
+          <w:rFonts w:ascii="Times New Roman" w:hAnsi="Times New Roman" w:cs="Times New Roman"/>
           <w:b/>
           <w:i/>
           <w:sz w:val="19"/>
@@ -717,6 +765,7 @@
       </w:pPr>
       <w:r>
         <w:rPr>
+          <w:rFonts w:ascii="Times New Roman" w:hAnsi="Times New Roman" w:cs="Times New Roman"/>
           <w:sz w:val="19"/>
           <w:szCs w:val="19"/>
         </w:rPr>
@@ -730,6 +779,7 @@
       </w:pPr>
       <w:r>
         <w:rPr>
+          <w:rFonts w:ascii="Times New Roman" w:hAnsi="Times New Roman" w:cs="Times New Roman"/>
           <w:b/>
           <w:i/>
           <w:sz w:val="19"/>
@@ -746,6 +796,7 @@
       </w:pPr>
       <w:r>
         <w:rPr>
+          <w:rFonts w:ascii="Times New Roman" w:hAnsi="Times New Roman" w:cs="Times New Roman"/>
           <w:sz w:val="19"/>
           <w:szCs w:val="19"/>
         </w:rPr>
@@ -770,6 +821,7 @@
       </w:pPr>
       <w:r>
         <w:rPr>
+          <w:rFonts w:ascii="Times New Roman" w:hAnsi="Times New Roman" w:cs="Times New Roman"/>
           <w:b/>
           <w:sz w:val="16"/>
           <w:szCs w:val="16"/>
@@ -809,6 +861,7 @@
             </w:pPr>
             <w:r>
               <w:rPr>
+                <w:rFonts w:ascii="Times New Roman" w:hAnsi="Times New Roman" w:cs="Times New Roman"/>
                 <w:b/>
                 <w:sz w:val="15"/>
                 <w:szCs w:val="15"/>
@@ -828,6 +881,7 @@
             </w:pPr>
             <w:r>
               <w:rPr>
+                <w:rFonts w:ascii="Times New Roman" w:hAnsi="Times New Roman" w:cs="Times New Roman"/>
                 <w:b/>
                 <w:sz w:val="15"/>
                 <w:szCs w:val="15"/>
@@ -847,6 +901,7 @@
             </w:pPr>
             <w:r>
               <w:rPr>
+                <w:rFonts w:ascii="Times New Roman" w:hAnsi="Times New Roman" w:cs="Times New Roman"/>
                 <w:b/>
                 <w:sz w:val="15"/>
                 <w:szCs w:val="15"/>
@@ -866,6 +921,7 @@
             </w:pPr>
             <w:r>
               <w:rPr>
+                <w:rFonts w:ascii="Times New Roman" w:hAnsi="Times New Roman" w:cs="Times New Roman"/>
                 <w:b/>
                 <w:sz w:val="15"/>
                 <w:szCs w:val="15"/>
@@ -885,6 +941,7 @@
             </w:pPr>
             <w:r>
               <w:rPr>
+                <w:rFonts w:ascii="Times New Roman" w:hAnsi="Times New Roman" w:cs="Times New Roman"/>
                 <w:b/>
                 <w:sz w:val="15"/>
                 <w:szCs w:val="15"/>
@@ -905,6 +962,7 @@
             </w:pPr>
             <w:r>
               <w:rPr>
+                <w:rFonts w:ascii="Times New Roman" w:hAnsi="Times New Roman" w:cs="Times New Roman"/>
                 <w:sz w:val="15"/>
                 <w:szCs w:val="15"/>
               </w:rPr>
@@ -922,6 +980,7 @@
             </w:pPr>
             <w:r>
               <w:rPr>
+                <w:rFonts w:ascii="Times New Roman" w:hAnsi="Times New Roman" w:cs="Times New Roman"/>
                 <w:sz w:val="15"/>
                 <w:szCs w:val="15"/>
               </w:rPr>
@@ -939,6 +998,7 @@
             </w:pPr>
             <w:r>
               <w:rPr>
+                <w:rFonts w:ascii="Times New Roman" w:hAnsi="Times New Roman" w:cs="Times New Roman"/>
                 <w:sz w:val="15"/>
                 <w:szCs w:val="15"/>
               </w:rPr>
@@ -956,6 +1016,7 @@
             </w:pPr>
             <w:r>
               <w:rPr>
+                <w:rFonts w:ascii="Times New Roman" w:hAnsi="Times New Roman" w:cs="Times New Roman"/>
                 <w:sz w:val="15"/>
                 <w:szCs w:val="15"/>
               </w:rPr>
@@ -973,6 +1034,7 @@
             </w:pPr>
             <w:r>
               <w:rPr>
+                <w:rFonts w:ascii="Times New Roman" w:hAnsi="Times New Roman" w:cs="Times New Roman"/>
                 <w:sz w:val="15"/>
                 <w:szCs w:val="15"/>
               </w:rPr>
@@ -992,6 +1054,7 @@
             </w:pPr>
             <w:r>
               <w:rPr>
+                <w:rFonts w:ascii="Times New Roman" w:hAnsi="Times New Roman" w:cs="Times New Roman"/>
                 <w:sz w:val="15"/>
                 <w:szCs w:val="15"/>
               </w:rPr>
@@ -1009,6 +1072,7 @@
             </w:pPr>
             <w:r>
               <w:rPr>
+                <w:rFonts w:ascii="Times New Roman" w:hAnsi="Times New Roman" w:cs="Times New Roman"/>
                 <w:sz w:val="15"/>
                 <w:szCs w:val="15"/>
               </w:rPr>
@@ -1026,6 +1090,7 @@
             </w:pPr>
             <w:r>
               <w:rPr>
+                <w:rFonts w:ascii="Times New Roman" w:hAnsi="Times New Roman" w:cs="Times New Roman"/>
                 <w:sz w:val="15"/>
                 <w:szCs w:val="15"/>
               </w:rPr>
@@ -1043,6 +1108,7 @@
             </w:pPr>
             <w:r>
               <w:rPr>
+                <w:rFonts w:ascii="Times New Roman" w:hAnsi="Times New Roman" w:cs="Times New Roman"/>
                 <w:sz w:val="15"/>
                 <w:szCs w:val="15"/>
               </w:rPr>
@@ -1060,6 +1126,7 @@
             </w:pPr>
             <w:r>
               <w:rPr>
+                <w:rFonts w:ascii="Times New Roman" w:hAnsi="Times New Roman" w:cs="Times New Roman"/>
                 <w:sz w:val="15"/>
                 <w:szCs w:val="15"/>
               </w:rPr>
@@ -1079,6 +1146,7 @@
             </w:pPr>
             <w:r>
               <w:rPr>
+                <w:rFonts w:ascii="Times New Roman" w:hAnsi="Times New Roman" w:cs="Times New Roman"/>
                 <w:sz w:val="15"/>
                 <w:szCs w:val="15"/>
               </w:rPr>
@@ -1096,6 +1164,7 @@
             </w:pPr>
             <w:r>
               <w:rPr>
+                <w:rFonts w:ascii="Times New Roman" w:hAnsi="Times New Roman" w:cs="Times New Roman"/>
                 <w:sz w:val="15"/>
                 <w:szCs w:val="15"/>
               </w:rPr>
@@ -1113,6 +1182,7 @@
             </w:pPr>
             <w:r>
               <w:rPr>
+                <w:rFonts w:ascii="Times New Roman" w:hAnsi="Times New Roman" w:cs="Times New Roman"/>
                 <w:sz w:val="15"/>
                 <w:szCs w:val="15"/>
               </w:rPr>
@@ -1130,6 +1200,7 @@
             </w:pPr>
             <w:r>
               <w:rPr>
+                <w:rFonts w:ascii="Times New Roman" w:hAnsi="Times New Roman" w:cs="Times New Roman"/>
                 <w:sz w:val="15"/>
                 <w:szCs w:val="15"/>
               </w:rPr>
@@ -1147,6 +1218,7 @@
             </w:pPr>
             <w:r>
               <w:rPr>
+                <w:rFonts w:ascii="Times New Roman" w:hAnsi="Times New Roman" w:cs="Times New Roman"/>
                 <w:sz w:val="15"/>
                 <w:szCs w:val="15"/>
               </w:rPr>
@@ -1166,6 +1238,7 @@
             </w:pPr>
             <w:r>
               <w:rPr>
+                <w:rFonts w:ascii="Times New Roman" w:hAnsi="Times New Roman" w:cs="Times New Roman"/>
                 <w:sz w:val="15"/>
                 <w:szCs w:val="15"/>
               </w:rPr>
@@ -1183,6 +1256,7 @@
             </w:pPr>
             <w:r>
               <w:rPr>
+                <w:rFonts w:ascii="Times New Roman" w:hAnsi="Times New Roman" w:cs="Times New Roman"/>
                 <w:sz w:val="15"/>
                 <w:szCs w:val="15"/>
               </w:rPr>
@@ -1200,6 +1274,7 @@
             </w:pPr>
             <w:r>
               <w:rPr>
+                <w:rFonts w:ascii="Times New Roman" w:hAnsi="Times New Roman" w:cs="Times New Roman"/>
                 <w:sz w:val="15"/>
                 <w:szCs w:val="15"/>
               </w:rPr>
@@ -1217,6 +1292,7 @@
             </w:pPr>
             <w:r>
               <w:rPr>
+                <w:rFonts w:ascii="Times New Roman" w:hAnsi="Times New Roman" w:cs="Times New Roman"/>
                 <w:sz w:val="15"/>
                 <w:szCs w:val="15"/>
               </w:rPr>
@@ -1234,6 +1310,7 @@
             </w:pPr>
             <w:r>
               <w:rPr>
+                <w:rFonts w:ascii="Times New Roman" w:hAnsi="Times New Roman" w:cs="Times New Roman"/>
                 <w:sz w:val="15"/>
                 <w:szCs w:val="15"/>
               </w:rPr>
@@ -1253,6 +1330,7 @@
             </w:pPr>
             <w:r>
               <w:rPr>
+                <w:rFonts w:ascii="Times New Roman" w:hAnsi="Times New Roman" w:cs="Times New Roman"/>
                 <w:sz w:val="15"/>
                 <w:szCs w:val="15"/>
               </w:rPr>
@@ -1270,6 +1348,7 @@
             </w:pPr>
             <w:r>
               <w:rPr>
+                <w:rFonts w:ascii="Times New Roman" w:hAnsi="Times New Roman" w:cs="Times New Roman"/>
                 <w:sz w:val="15"/>
                 <w:szCs w:val="15"/>
               </w:rPr>
@@ -1287,6 +1366,7 @@
             </w:pPr>
             <w:r>
               <w:rPr>
+                <w:rFonts w:ascii="Times New Roman" w:hAnsi="Times New Roman" w:cs="Times New Roman"/>
                 <w:sz w:val="15"/>
                 <w:szCs w:val="15"/>
               </w:rPr>
@@ -1304,6 +1384,7 @@
             </w:pPr>
             <w:r>
               <w:rPr>
+                <w:rFonts w:ascii="Times New Roman" w:hAnsi="Times New Roman" w:cs="Times New Roman"/>
                 <w:sz w:val="15"/>
                 <w:szCs w:val="15"/>
               </w:rPr>
@@ -1321,6 +1402,7 @@
             </w:pPr>
             <w:r>
               <w:rPr>
+                <w:rFonts w:ascii="Times New Roman" w:hAnsi="Times New Roman" w:cs="Times New Roman"/>
                 <w:sz w:val="15"/>
                 <w:szCs w:val="15"/>
               </w:rPr>
@@ -1340,6 +1422,7 @@
             </w:pPr>
             <w:r>
               <w:rPr>
+                <w:rFonts w:ascii="Times New Roman" w:hAnsi="Times New Roman" w:cs="Times New Roman"/>
                 <w:sz w:val="15"/>
                 <w:szCs w:val="15"/>
               </w:rPr>
@@ -1357,6 +1440,7 @@
             </w:pPr>
             <w:r>
               <w:rPr>
+                <w:rFonts w:ascii="Times New Roman" w:hAnsi="Times New Roman" w:cs="Times New Roman"/>
                 <w:sz w:val="15"/>
                 <w:szCs w:val="15"/>
               </w:rPr>
@@ -1374,6 +1458,7 @@
             </w:pPr>
             <w:r>
               <w:rPr>
+                <w:rFonts w:ascii="Times New Roman" w:hAnsi="Times New Roman" w:cs="Times New Roman"/>
                 <w:sz w:val="15"/>
                 <w:szCs w:val="15"/>
               </w:rPr>
@@ -1391,6 +1476,7 @@
             </w:pPr>
             <w:r>
               <w:rPr>
+                <w:rFonts w:ascii="Times New Roman" w:hAnsi="Times New Roman" w:cs="Times New Roman"/>
                 <w:sz w:val="15"/>
                 <w:szCs w:val="15"/>
               </w:rPr>
@@ -1408,6 +1494,7 @@
             </w:pPr>
             <w:r>
               <w:rPr>
+                <w:rFonts w:ascii="Times New Roman" w:hAnsi="Times New Roman" w:cs="Times New Roman"/>
                 <w:sz w:val="15"/>
                 <w:szCs w:val="15"/>
               </w:rPr>
@@ -1427,6 +1514,7 @@
             </w:pPr>
             <w:r>
               <w:rPr>
+                <w:rFonts w:ascii="Times New Roman" w:hAnsi="Times New Roman" w:cs="Times New Roman"/>
                 <w:sz w:val="15"/>
                 <w:szCs w:val="15"/>
               </w:rPr>
@@ -1444,6 +1532,7 @@
             </w:pPr>
             <w:r>
               <w:rPr>
+                <w:rFonts w:ascii="Times New Roman" w:hAnsi="Times New Roman" w:cs="Times New Roman"/>
                 <w:sz w:val="15"/>
                 <w:szCs w:val="15"/>
               </w:rPr>
@@ -1461,6 +1550,7 @@
             </w:pPr>
             <w:r>
               <w:rPr>
+                <w:rFonts w:ascii="Times New Roman" w:hAnsi="Times New Roman" w:cs="Times New Roman"/>
                 <w:sz w:val="15"/>
                 <w:szCs w:val="15"/>
               </w:rPr>
@@ -1478,6 +1568,7 @@
             </w:pPr>
             <w:r>
               <w:rPr>
+                <w:rFonts w:ascii="Times New Roman" w:hAnsi="Times New Roman" w:cs="Times New Roman"/>
                 <w:sz w:val="15"/>
                 <w:szCs w:val="15"/>
               </w:rPr>
@@ -1495,6 +1586,7 @@
             </w:pPr>
             <w:r>
               <w:rPr>
+                <w:rFonts w:ascii="Times New Roman" w:hAnsi="Times New Roman" w:cs="Times New Roman"/>
                 <w:sz w:val="15"/>
                 <w:szCs w:val="15"/>
               </w:rPr>
@@ -1514,6 +1606,7 @@
             </w:pPr>
             <w:r>
               <w:rPr>
+                <w:rFonts w:ascii="Times New Roman" w:hAnsi="Times New Roman" w:cs="Times New Roman"/>
                 <w:sz w:val="15"/>
                 <w:szCs w:val="15"/>
               </w:rPr>
@@ -1531,6 +1624,7 @@
             </w:pPr>
             <w:r>
               <w:rPr>
+                <w:rFonts w:ascii="Times New Roman" w:hAnsi="Times New Roman" w:cs="Times New Roman"/>
                 <w:sz w:val="15"/>
                 <w:szCs w:val="15"/>
               </w:rPr>
@@ -1548,6 +1642,7 @@
             </w:pPr>
             <w:r>
               <w:rPr>
+                <w:rFonts w:ascii="Times New Roman" w:hAnsi="Times New Roman" w:cs="Times New Roman"/>
                 <w:sz w:val="15"/>
                 <w:szCs w:val="15"/>
               </w:rPr>
@@ -1565,6 +1660,7 @@
             </w:pPr>
             <w:r>
               <w:rPr>
+                <w:rFonts w:ascii="Times New Roman" w:hAnsi="Times New Roman" w:cs="Times New Roman"/>
                 <w:sz w:val="15"/>
                 <w:szCs w:val="15"/>
               </w:rPr>
@@ -1582,6 +1678,7 @@
             </w:pPr>
             <w:r>
               <w:rPr>
+                <w:rFonts w:ascii="Times New Roman" w:hAnsi="Times New Roman" w:cs="Times New Roman"/>
                 <w:sz w:val="15"/>
                 <w:szCs w:val="15"/>
               </w:rPr>
@@ -1601,6 +1698,7 @@
             </w:pPr>
             <w:r>
               <w:rPr>
+                <w:rFonts w:ascii="Times New Roman" w:hAnsi="Times New Roman" w:cs="Times New Roman"/>
                 <w:sz w:val="15"/>
                 <w:szCs w:val="15"/>
               </w:rPr>
@@ -1618,6 +1716,7 @@
             </w:pPr>
             <w:r>
               <w:rPr>
+                <w:rFonts w:ascii="Times New Roman" w:hAnsi="Times New Roman" w:cs="Times New Roman"/>
                 <w:sz w:val="15"/>
                 <w:szCs w:val="15"/>
               </w:rPr>
@@ -1635,6 +1734,7 @@
             </w:pPr>
             <w:r>
               <w:rPr>
+                <w:rFonts w:ascii="Times New Roman" w:hAnsi="Times New Roman" w:cs="Times New Roman"/>
                 <w:sz w:val="15"/>
                 <w:szCs w:val="15"/>
               </w:rPr>
@@ -1652,6 +1752,7 @@
             </w:pPr>
             <w:r>
               <w:rPr>
+                <w:rFonts w:ascii="Times New Roman" w:hAnsi="Times New Roman" w:cs="Times New Roman"/>
                 <w:sz w:val="15"/>
                 <w:szCs w:val="15"/>
               </w:rPr>
@@ -1669,6 +1770,7 @@
             </w:pPr>
             <w:r>
               <w:rPr>
+                <w:rFonts w:ascii="Times New Roman" w:hAnsi="Times New Roman" w:cs="Times New Roman"/>
                 <w:sz w:val="15"/>
                 <w:szCs w:val="15"/>
               </w:rPr>
@@ -1688,6 +1790,7 @@
             </w:pPr>
             <w:r>
               <w:rPr>
+                <w:rFonts w:ascii="Times New Roman" w:hAnsi="Times New Roman" w:cs="Times New Roman"/>
                 <w:sz w:val="15"/>
                 <w:szCs w:val="15"/>
               </w:rPr>
@@ -1705,6 +1808,7 @@
             </w:pPr>
             <w:r>
               <w:rPr>
+                <w:rFonts w:ascii="Times New Roman" w:hAnsi="Times New Roman" w:cs="Times New Roman"/>
                 <w:sz w:val="15"/>
                 <w:szCs w:val="15"/>
               </w:rPr>
@@ -1722,6 +1826,7 @@
             </w:pPr>
             <w:r>
               <w:rPr>
+                <w:rFonts w:ascii="Times New Roman" w:hAnsi="Times New Roman" w:cs="Times New Roman"/>
                 <w:sz w:val="15"/>
                 <w:szCs w:val="15"/>
               </w:rPr>
@@ -1739,6 +1844,7 @@
             </w:pPr>
             <w:r>
               <w:rPr>
+                <w:rFonts w:ascii="Times New Roman" w:hAnsi="Times New Roman" w:cs="Times New Roman"/>
                 <w:sz w:val="15"/>
                 <w:szCs w:val="15"/>
               </w:rPr>
@@ -1756,6 +1862,7 @@
             </w:pPr>
             <w:r>
               <w:rPr>
+                <w:rFonts w:ascii="Times New Roman" w:hAnsi="Times New Roman" w:cs="Times New Roman"/>
                 <w:sz w:val="15"/>
                 <w:szCs w:val="15"/>
               </w:rPr>
@@ -1788,6 +1895,7 @@
       </w:pPr>
       <w:r>
         <w:rPr>
+          <w:rFonts w:ascii="Times New Roman" w:hAnsi="Times New Roman" w:cs="Times New Roman"/>
           <w:b/>
           <w:sz w:val="20"/>
           <w:szCs w:val="20"/>
@@ -1803,6 +1911,7 @@
       </w:pPr>
       <w:r>
         <w:rPr>
+          <w:rFonts w:ascii="Times New Roman" w:hAnsi="Times New Roman" w:cs="Times New Roman"/>
           <w:sz w:val="19"/>
           <w:szCs w:val="19"/>
         </w:rPr>
@@ -1817,6 +1926,7 @@
       </w:pPr>
       <w:r>
         <w:rPr>
+          <w:rFonts w:ascii="Times New Roman" w:hAnsi="Times New Roman" w:cs="Times New Roman"/>
           <w:sz w:val="19"/>
           <w:szCs w:val="19"/>
         </w:rPr>
@@ -1831,6 +1941,7 @@
       </w:pPr>
       <w:r>
         <w:rPr>
+          <w:rFonts w:ascii="Times New Roman" w:hAnsi="Times New Roman" w:cs="Times New Roman"/>
           <w:sz w:val="19"/>
           <w:szCs w:val="19"/>
         </w:rPr>
@@ -1845,6 +1956,7 @@
       </w:pPr>
       <w:r>
         <w:rPr>
+          <w:rFonts w:ascii="Times New Roman" w:hAnsi="Times New Roman" w:cs="Times New Roman"/>
           <w:sz w:val="19"/>
           <w:szCs w:val="19"/>
         </w:rPr>
@@ -1859,6 +1971,7 @@
       </w:pPr>
       <w:r>
         <w:rPr>
+          <w:rFonts w:ascii="Times New Roman" w:hAnsi="Times New Roman" w:cs="Times New Roman"/>
           <w:sz w:val="19"/>
           <w:szCs w:val="19"/>
         </w:rPr>
@@ -1873,6 +1986,7 @@
       </w:pPr>
       <w:r>
         <w:rPr>
+          <w:rFonts w:ascii="Times New Roman" w:hAnsi="Times New Roman" w:cs="Times New Roman"/>
           <w:sz w:val="19"/>
           <w:szCs w:val="19"/>
         </w:rPr>
@@ -1887,6 +2001,7 @@
       </w:pPr>
       <w:r>
         <w:rPr>
+          <w:rFonts w:ascii="Times New Roman" w:hAnsi="Times New Roman" w:cs="Times New Roman"/>
           <w:sz w:val="19"/>
           <w:szCs w:val="19"/>
         </w:rPr>
@@ -1900,6 +2015,7 @@
       </w:pPr>
       <w:r>
         <w:rPr>
+          <w:rFonts w:ascii="Times New Roman" w:hAnsi="Times New Roman" w:cs="Times New Roman"/>
           <w:b/>
           <w:sz w:val="20"/>
           <w:szCs w:val="20"/>
@@ -1915,6 +2031,7 @@
       </w:pPr>
       <w:r>
         <w:rPr>
+          <w:rFonts w:ascii="Times New Roman" w:hAnsi="Times New Roman" w:cs="Times New Roman"/>
           <w:sz w:val="19"/>
           <w:szCs w:val="19"/>
         </w:rPr>
@@ -1929,6 +2046,7 @@
       </w:pPr>
       <w:r>
         <w:rPr>
+          <w:rFonts w:ascii="Times New Roman" w:hAnsi="Times New Roman" w:cs="Times New Roman"/>
           <w:sz w:val="19"/>
           <w:szCs w:val="19"/>
         </w:rPr>
@@ -1943,6 +2061,7 @@
       </w:pPr>
       <w:r>
         <w:rPr>
+          <w:rFonts w:ascii="Times New Roman" w:hAnsi="Times New Roman" w:cs="Times New Roman"/>
           <w:sz w:val="19"/>
           <w:szCs w:val="19"/>
         </w:rPr>
@@ -1957,6 +2076,7 @@
       </w:pPr>
       <w:r>
         <w:rPr>
+          <w:rFonts w:ascii="Times New Roman" w:hAnsi="Times New Roman" w:cs="Times New Roman"/>
           <w:sz w:val="19"/>
           <w:szCs w:val="19"/>
         </w:rPr>
@@ -1971,6 +2091,7 @@
       </w:pPr>
       <w:r>
         <w:rPr>
+          <w:rFonts w:ascii="Times New Roman" w:hAnsi="Times New Roman" w:cs="Times New Roman"/>
           <w:sz w:val="19"/>
           <w:szCs w:val="19"/>
         </w:rPr>
@@ -1985,6 +2106,7 @@
       </w:pPr>
       <w:r>
         <w:rPr>
+          <w:rFonts w:ascii="Times New Roman" w:hAnsi="Times New Roman" w:cs="Times New Roman"/>
           <w:sz w:val="19"/>
           <w:szCs w:val="19"/>
         </w:rPr>
@@ -1998,6 +2120,7 @@
       </w:pPr>
       <w:r>
         <w:rPr>
+          <w:rFonts w:ascii="Times New Roman" w:hAnsi="Times New Roman" w:cs="Times New Roman"/>
           <w:b/>
           <w:sz w:val="20"/>
           <w:szCs w:val="20"/>
@@ -2013,6 +2136,7 @@
       </w:pPr>
       <w:r>
         <w:rPr>
+          <w:rFonts w:ascii="Times New Roman" w:hAnsi="Times New Roman" w:cs="Times New Roman"/>
           <w:sz w:val="19"/>
           <w:szCs w:val="19"/>
         </w:rPr>
@@ -2026,6 +2150,7 @@
       </w:pPr>
       <w:r>
         <w:rPr>
+          <w:rFonts w:ascii="Times New Roman" w:hAnsi="Times New Roman" w:cs="Times New Roman"/>
           <w:b/>
           <w:sz w:val="20"/>
           <w:szCs w:val="20"/>
@@ -2041,6 +2166,7 @@
       </w:pPr>
       <w:r>
         <w:rPr>
+          <w:rFonts w:ascii="Times New Roman" w:hAnsi="Times New Roman" w:cs="Times New Roman"/>
           <w:sz w:val="19"/>
           <w:szCs w:val="19"/>
         </w:rPr>
@@ -2054,6 +2180,7 @@
       </w:pPr>
       <w:r>
         <w:rPr>
+          <w:rFonts w:ascii="Times New Roman" w:hAnsi="Times New Roman" w:cs="Times New Roman"/>
           <w:b/>
           <w:sz w:val="20"/>
           <w:szCs w:val="20"/>
@@ -2069,6 +2196,7 @@
       </w:pPr>
       <w:r>
         <w:rPr>
+          <w:rFonts w:ascii="Times New Roman" w:hAnsi="Times New Roman" w:cs="Times New Roman"/>
           <w:sz w:val="19"/>
           <w:szCs w:val="19"/>
         </w:rPr>
@@ -2083,6 +2211,7 @@
       </w:pPr>
       <w:r>
         <w:rPr>
+          <w:rFonts w:ascii="Times New Roman" w:hAnsi="Times New Roman" w:cs="Times New Roman"/>
           <w:sz w:val="19"/>
           <w:szCs w:val="19"/>
         </w:rPr>
@@ -2097,6 +2226,7 @@
       </w:pPr>
       <w:r>
         <w:rPr>
+          <w:rFonts w:ascii="Times New Roman" w:hAnsi="Times New Roman" w:cs="Times New Roman"/>
           <w:sz w:val="19"/>
           <w:szCs w:val="19"/>
         </w:rPr>
@@ -2111,6 +2241,7 @@
       </w:pPr>
       <w:r>
         <w:rPr>
+          <w:rFonts w:ascii="Times New Roman" w:hAnsi="Times New Roman" w:cs="Times New Roman"/>
           <w:sz w:val="19"/>
           <w:szCs w:val="19"/>
         </w:rPr>
@@ -2125,6 +2256,7 @@
       </w:pPr>
       <w:r>
         <w:rPr>
+          <w:rFonts w:ascii="Times New Roman" w:hAnsi="Times New Roman" w:cs="Times New Roman"/>
           <w:sz w:val="19"/>
           <w:szCs w:val="19"/>
         </w:rPr>
@@ -2139,6 +2271,7 @@
       </w:pPr>
       <w:r>
         <w:rPr>
+          <w:rFonts w:ascii="Times New Roman" w:hAnsi="Times New Roman" w:cs="Times New Roman"/>
           <w:sz w:val="19"/>
           <w:szCs w:val="19"/>
         </w:rPr>
@@ -2152,6 +2285,7 @@
       </w:pPr>
       <w:r>
         <w:rPr>
+          <w:rFonts w:ascii="Times New Roman" w:hAnsi="Times New Roman" w:cs="Times New Roman"/>
           <w:b/>
           <w:sz w:val="20"/>
           <w:szCs w:val="20"/>
@@ -2166,6 +2300,7 @@
       </w:pPr>
       <w:r>
         <w:rPr>
+          <w:rFonts w:ascii="Times New Roman" w:hAnsi="Times New Roman" w:cs="Times New Roman"/>
           <w:b/>
           <w:i/>
           <w:sz w:val="19"/>
@@ -2182,6 +2317,7 @@
       </w:pPr>
       <w:r>
         <w:rPr>
+          <w:rFonts w:ascii="Times New Roman" w:hAnsi="Times New Roman" w:cs="Times New Roman"/>
           <w:sz w:val="19"/>
           <w:szCs w:val="19"/>
         </w:rPr>
@@ -2245,6 +2381,7 @@
       </w:pPr>
       <w:r>
         <w:rPr>
+          <w:rFonts w:ascii="Times New Roman" w:hAnsi="Times New Roman" w:cs="Times New Roman"/>
           <w:i/>
           <w:sz w:val="16"/>
           <w:szCs w:val="16"/>
@@ -2270,6 +2407,7 @@
       </w:pPr>
       <w:r>
         <w:rPr>
+          <w:rFonts w:ascii="Times New Roman" w:hAnsi="Times New Roman" w:cs="Times New Roman"/>
           <w:b/>
           <w:i/>
           <w:sz w:val="19"/>
@@ -2286,6 +2424,7 @@
       </w:pPr>
       <w:r>
         <w:rPr>
+          <w:rFonts w:ascii="Times New Roman" w:hAnsi="Times New Roman" w:cs="Times New Roman"/>
           <w:sz w:val="19"/>
           <w:szCs w:val="19"/>
         </w:rPr>
@@ -2349,6 +2488,7 @@
       </w:pPr>
       <w:r>
         <w:rPr>
+          <w:rFonts w:ascii="Times New Roman" w:hAnsi="Times New Roman" w:cs="Times New Roman"/>
           <w:i/>
           <w:sz w:val="16"/>
           <w:szCs w:val="16"/>
@@ -2374,6 +2514,7 @@
       </w:pPr>
       <w:r>
         <w:rPr>
+          <w:rFonts w:ascii="Times New Roman" w:hAnsi="Times New Roman" w:cs="Times New Roman"/>
           <w:b/>
           <w:sz w:val="20"/>
           <w:szCs w:val="20"/>
@@ -2389,6 +2530,7 @@
       </w:pPr>
       <w:r>
         <w:rPr>
+          <w:rFonts w:ascii="Times New Roman" w:hAnsi="Times New Roman" w:cs="Times New Roman"/>
           <w:sz w:val="19"/>
           <w:szCs w:val="19"/>
         </w:rPr>
@@ -2403,6 +2545,7 @@
       </w:pPr>
       <w:r>
         <w:rPr>
+          <w:rFonts w:ascii="Times New Roman" w:hAnsi="Times New Roman" w:cs="Times New Roman"/>
           <w:sz w:val="19"/>
           <w:szCs w:val="19"/>
         </w:rPr>
@@ -2417,6 +2560,7 @@
       </w:pPr>
       <w:r>
         <w:rPr>
+          <w:rFonts w:ascii="Times New Roman" w:hAnsi="Times New Roman" w:cs="Times New Roman"/>
           <w:sz w:val="19"/>
           <w:szCs w:val="19"/>
         </w:rPr>
@@ -2431,6 +2575,7 @@
       </w:pPr>
       <w:r>
         <w:rPr>
+          <w:rFonts w:ascii="Times New Roman" w:hAnsi="Times New Roman" w:cs="Times New Roman"/>
           <w:sz w:val="19"/>
           <w:szCs w:val="19"/>
         </w:rPr>
@@ -2445,6 +2590,7 @@
       </w:pPr>
       <w:r>
         <w:rPr>
+          <w:rFonts w:ascii="Times New Roman" w:hAnsi="Times New Roman" w:cs="Times New Roman"/>
           <w:sz w:val="19"/>
           <w:szCs w:val="19"/>
         </w:rPr>
@@ -2459,6 +2605,7 @@
       </w:pPr>
       <w:r>
         <w:rPr>
+          <w:rFonts w:ascii="Times New Roman" w:hAnsi="Times New Roman" w:cs="Times New Roman"/>
           <w:sz w:val="19"/>
           <w:szCs w:val="19"/>
         </w:rPr>
@@ -2473,6 +2620,7 @@
       </w:pPr>
       <w:r>
         <w:rPr>
+          <w:rFonts w:ascii="Times New Roman" w:hAnsi="Times New Roman" w:cs="Times New Roman"/>
           <w:sz w:val="19"/>
           <w:szCs w:val="19"/>
         </w:rPr>
@@ -2487,6 +2635,7 @@
       </w:pPr>
       <w:r>
         <w:rPr>
+          <w:rFonts w:ascii="Times New Roman" w:hAnsi="Times New Roman" w:cs="Times New Roman"/>
           <w:sz w:val="19"/>
           <w:szCs w:val="19"/>
         </w:rPr>
@@ -2501,6 +2650,7 @@
       </w:pPr>
       <w:r>
         <w:rPr>
+          <w:rFonts w:ascii="Times New Roman" w:hAnsi="Times New Roman" w:cs="Times New Roman"/>
           <w:sz w:val="19"/>
           <w:szCs w:val="19"/>
         </w:rPr>
@@ -2514,6 +2664,7 @@
       </w:pPr>
       <w:r>
         <w:rPr>
+          <w:rFonts w:ascii="Times New Roman" w:hAnsi="Times New Roman" w:cs="Times New Roman"/>
           <w:b/>
           <w:sz w:val="20"/>
           <w:szCs w:val="20"/>
@@ -2529,6 +2680,7 @@
       </w:pPr>
       <w:r>
         <w:rPr>
+          <w:rFonts w:ascii="Times New Roman" w:hAnsi="Times New Roman" w:cs="Times New Roman"/>
           <w:sz w:val="19"/>
           <w:szCs w:val="19"/>
         </w:rPr>
@@ -2592,6 +2744,7 @@
       </w:pPr>
       <w:r>
         <w:rPr>
+          <w:rFonts w:ascii="Times New Roman" w:hAnsi="Times New Roman" w:cs="Times New Roman"/>
           <w:i/>
           <w:sz w:val="16"/>
           <w:szCs w:val="16"/>
@@ -2617,6 +2770,7 @@
       </w:pPr>
       <w:r>
         <w:rPr>
+          <w:rFonts w:ascii="Times New Roman" w:hAnsi="Times New Roman" w:cs="Times New Roman"/>
           <w:b/>
           <w:sz w:val="20"/>
           <w:szCs w:val="20"/>
@@ -2632,6 +2786,7 @@
       </w:pPr>
       <w:r>
         <w:rPr>
+          <w:rFonts w:ascii="Times New Roman" w:hAnsi="Times New Roman" w:cs="Times New Roman"/>
           <w:sz w:val="19"/>
           <w:szCs w:val="19"/>
         </w:rPr>
@@ -2645,6 +2800,7 @@
       </w:pPr>
       <w:r>
         <w:rPr>
+          <w:rFonts w:ascii="Times New Roman" w:hAnsi="Times New Roman" w:cs="Times New Roman"/>
           <w:b/>
           <w:i/>
           <w:sz w:val="19"/>
@@ -2661,6 +2817,7 @@
       </w:pPr>
       <w:r>
         <w:rPr>
+          <w:rFonts w:ascii="Times New Roman" w:hAnsi="Times New Roman" w:cs="Times New Roman"/>
           <w:sz w:val="19"/>
           <w:szCs w:val="19"/>
         </w:rPr>
@@ -2685,6 +2842,7 @@
       </w:pPr>
       <w:r>
         <w:rPr>
+          <w:rFonts w:ascii="Times New Roman" w:hAnsi="Times New Roman" w:cs="Times New Roman"/>
           <w:b/>
           <w:sz w:val="16"/>
           <w:szCs w:val="16"/>
@@ -2724,6 +2882,7 @@
             </w:pPr>
             <w:r>
               <w:rPr>
+                <w:rFonts w:ascii="Times New Roman" w:hAnsi="Times New Roman" w:cs="Times New Roman"/>
                 <w:b/>
                 <w:sz w:val="15"/>
                 <w:szCs w:val="15"/>
@@ -2743,6 +2902,7 @@
             </w:pPr>
             <w:r>
               <w:rPr>
+                <w:rFonts w:ascii="Times New Roman" w:hAnsi="Times New Roman" w:cs="Times New Roman"/>
                 <w:b/>
                 <w:sz w:val="15"/>
                 <w:szCs w:val="15"/>
@@ -2762,6 +2922,7 @@
             </w:pPr>
             <w:r>
               <w:rPr>
+                <w:rFonts w:ascii="Times New Roman" w:hAnsi="Times New Roman" w:cs="Times New Roman"/>
                 <w:b/>
                 <w:sz w:val="15"/>
                 <w:szCs w:val="15"/>
@@ -2781,6 +2942,7 @@
             </w:pPr>
             <w:r>
               <w:rPr>
+                <w:rFonts w:ascii="Times New Roman" w:hAnsi="Times New Roman" w:cs="Times New Roman"/>
                 <w:b/>
                 <w:sz w:val="15"/>
                 <w:szCs w:val="15"/>
@@ -2800,6 +2962,7 @@
             </w:pPr>
             <w:r>
               <w:rPr>
+                <w:rFonts w:ascii="Times New Roman" w:hAnsi="Times New Roman" w:cs="Times New Roman"/>
                 <w:b/>
                 <w:sz w:val="15"/>
                 <w:szCs w:val="15"/>
@@ -2820,6 +2983,7 @@
             </w:pPr>
             <w:r>
               <w:rPr>
+                <w:rFonts w:ascii="Times New Roman" w:hAnsi="Times New Roman" w:cs="Times New Roman"/>
                 <w:sz w:val="15"/>
                 <w:szCs w:val="15"/>
               </w:rPr>
@@ -2837,6 +3001,7 @@
             </w:pPr>
             <w:r>
               <w:rPr>
+                <w:rFonts w:ascii="Times New Roman" w:hAnsi="Times New Roman" w:cs="Times New Roman"/>
                 <w:sz w:val="15"/>
                 <w:szCs w:val="15"/>
               </w:rPr>
@@ -2854,6 +3019,7 @@
             </w:pPr>
             <w:r>
               <w:rPr>
+                <w:rFonts w:ascii="Times New Roman" w:hAnsi="Times New Roman" w:cs="Times New Roman"/>
                 <w:sz w:val="15"/>
                 <w:szCs w:val="15"/>
               </w:rPr>
@@ -2871,6 +3037,7 @@
             </w:pPr>
             <w:r>
               <w:rPr>
+                <w:rFonts w:ascii="Times New Roman" w:hAnsi="Times New Roman" w:cs="Times New Roman"/>
                 <w:sz w:val="15"/>
                 <w:szCs w:val="15"/>
               </w:rPr>
@@ -2888,6 +3055,7 @@
             </w:pPr>
             <w:r>
               <w:rPr>
+                <w:rFonts w:ascii="Times New Roman" w:hAnsi="Times New Roman" w:cs="Times New Roman"/>
                 <w:sz w:val="15"/>
                 <w:szCs w:val="15"/>
               </w:rPr>
@@ -2907,6 +3075,7 @@
             </w:pPr>
             <w:r>
               <w:rPr>
+                <w:rFonts w:ascii="Times New Roman" w:hAnsi="Times New Roman" w:cs="Times New Roman"/>
                 <w:sz w:val="15"/>
                 <w:szCs w:val="15"/>
               </w:rPr>
@@ -2924,6 +3093,7 @@
             </w:pPr>
             <w:r>
               <w:rPr>
+                <w:rFonts w:ascii="Times New Roman" w:hAnsi="Times New Roman" w:cs="Times New Roman"/>
                 <w:sz w:val="15"/>
                 <w:szCs w:val="15"/>
               </w:rPr>
@@ -2941,6 +3111,7 @@
             </w:pPr>
             <w:r>
               <w:rPr>
+                <w:rFonts w:ascii="Times New Roman" w:hAnsi="Times New Roman" w:cs="Times New Roman"/>
                 <w:sz w:val="15"/>
                 <w:szCs w:val="15"/>
               </w:rPr>
@@ -2958,6 +3129,7 @@
             </w:pPr>
             <w:r>
               <w:rPr>
+                <w:rFonts w:ascii="Times New Roman" w:hAnsi="Times New Roman" w:cs="Times New Roman"/>
                 <w:sz w:val="15"/>
                 <w:szCs w:val="15"/>
               </w:rPr>
@@ -2975,6 +3147,7 @@
             </w:pPr>
             <w:r>
               <w:rPr>
+                <w:rFonts w:ascii="Times New Roman" w:hAnsi="Times New Roman" w:cs="Times New Roman"/>
                 <w:sz w:val="15"/>
                 <w:szCs w:val="15"/>
               </w:rPr>
@@ -2994,6 +3167,7 @@
             </w:pPr>
             <w:r>
               <w:rPr>
+                <w:rFonts w:ascii="Times New Roman" w:hAnsi="Times New Roman" w:cs="Times New Roman"/>
                 <w:sz w:val="15"/>
                 <w:szCs w:val="15"/>
               </w:rPr>
@@ -3011,6 +3185,7 @@
             </w:pPr>
             <w:r>
               <w:rPr>
+                <w:rFonts w:ascii="Times New Roman" w:hAnsi="Times New Roman" w:cs="Times New Roman"/>
                 <w:sz w:val="15"/>
                 <w:szCs w:val="15"/>
               </w:rPr>
@@ -3028,6 +3203,7 @@
             </w:pPr>
             <w:r>
               <w:rPr>
+                <w:rFonts w:ascii="Times New Roman" w:hAnsi="Times New Roman" w:cs="Times New Roman"/>
                 <w:sz w:val="15"/>
                 <w:szCs w:val="15"/>
               </w:rPr>
@@ -3045,6 +3221,7 @@
             </w:pPr>
             <w:r>
               <w:rPr>
+                <w:rFonts w:ascii="Times New Roman" w:hAnsi="Times New Roman" w:cs="Times New Roman"/>
                 <w:sz w:val="15"/>
                 <w:szCs w:val="15"/>
               </w:rPr>
@@ -3062,6 +3239,7 @@
             </w:pPr>
             <w:r>
               <w:rPr>
+                <w:rFonts w:ascii="Times New Roman" w:hAnsi="Times New Roman" w:cs="Times New Roman"/>
                 <w:sz w:val="15"/>
                 <w:szCs w:val="15"/>
               </w:rPr>
@@ -3081,6 +3259,7 @@
             </w:pPr>
             <w:r>
               <w:rPr>
+                <w:rFonts w:ascii="Times New Roman" w:hAnsi="Times New Roman" w:cs="Times New Roman"/>
                 <w:sz w:val="15"/>
                 <w:szCs w:val="15"/>
               </w:rPr>
@@ -3098,6 +3277,7 @@
             </w:pPr>
             <w:r>
               <w:rPr>
+                <w:rFonts w:ascii="Times New Roman" w:hAnsi="Times New Roman" w:cs="Times New Roman"/>
                 <w:sz w:val="15"/>
                 <w:szCs w:val="15"/>
               </w:rPr>
@@ -3115,6 +3295,7 @@
             </w:pPr>
             <w:r>
               <w:rPr>
+                <w:rFonts w:ascii="Times New Roman" w:hAnsi="Times New Roman" w:cs="Times New Roman"/>
                 <w:sz w:val="15"/>
                 <w:szCs w:val="15"/>
               </w:rPr>
@@ -3132,6 +3313,7 @@
             </w:pPr>
             <w:r>
               <w:rPr>
+                <w:rFonts w:ascii="Times New Roman" w:hAnsi="Times New Roman" w:cs="Times New Roman"/>
                 <w:sz w:val="15"/>
                 <w:szCs w:val="15"/>
               </w:rPr>
@@ -3149,6 +3331,7 @@
             </w:pPr>
             <w:r>
               <w:rPr>
+                <w:rFonts w:ascii="Times New Roman" w:hAnsi="Times New Roman" w:cs="Times New Roman"/>
                 <w:sz w:val="15"/>
                 <w:szCs w:val="15"/>
               </w:rPr>
@@ -3168,6 +3351,7 @@
             </w:pPr>
             <w:r>
               <w:rPr>
+                <w:rFonts w:ascii="Times New Roman" w:hAnsi="Times New Roman" w:cs="Times New Roman"/>
                 <w:sz w:val="15"/>
                 <w:szCs w:val="15"/>
               </w:rPr>
@@ -3185,6 +3369,7 @@
             </w:pPr>
             <w:r>
               <w:rPr>
+                <w:rFonts w:ascii="Times New Roman" w:hAnsi="Times New Roman" w:cs="Times New Roman"/>
                 <w:sz w:val="15"/>
                 <w:szCs w:val="15"/>
               </w:rPr>
@@ -3202,6 +3387,7 @@
             </w:pPr>
             <w:r>
               <w:rPr>
+                <w:rFonts w:ascii="Times New Roman" w:hAnsi="Times New Roman" w:cs="Times New Roman"/>
                 <w:sz w:val="15"/>
                 <w:szCs w:val="15"/>
               </w:rPr>
@@ -3219,6 +3405,7 @@
             </w:pPr>
             <w:r>
               <w:rPr>
+                <w:rFonts w:ascii="Times New Roman" w:hAnsi="Times New Roman" w:cs="Times New Roman"/>
                 <w:sz w:val="15"/>
                 <w:szCs w:val="15"/>
               </w:rPr>
@@ -3236,6 +3423,7 @@
             </w:pPr>
             <w:r>
               <w:rPr>
+                <w:rFonts w:ascii="Times New Roman" w:hAnsi="Times New Roman" w:cs="Times New Roman"/>
                 <w:sz w:val="15"/>
                 <w:szCs w:val="15"/>
               </w:rPr>
@@ -3255,6 +3443,7 @@
             </w:pPr>
             <w:r>
               <w:rPr>
+                <w:rFonts w:ascii="Times New Roman" w:hAnsi="Times New Roman" w:cs="Times New Roman"/>
                 <w:sz w:val="15"/>
                 <w:szCs w:val="15"/>
               </w:rPr>
@@ -3272,6 +3461,7 @@
             </w:pPr>
             <w:r>
               <w:rPr>
+                <w:rFonts w:ascii="Times New Roman" w:hAnsi="Times New Roman" w:cs="Times New Roman"/>
                 <w:sz w:val="15"/>
                 <w:szCs w:val="15"/>
               </w:rPr>
@@ -3289,6 +3479,7 @@
             </w:pPr>
             <w:r>
               <w:rPr>
+                <w:rFonts w:ascii="Times New Roman" w:hAnsi="Times New Roman" w:cs="Times New Roman"/>
                 <w:sz w:val="15"/>
                 <w:szCs w:val="15"/>
               </w:rPr>
@@ -3306,6 +3497,7 @@
             </w:pPr>
             <w:r>
               <w:rPr>
+                <w:rFonts w:ascii="Times New Roman" w:hAnsi="Times New Roman" w:cs="Times New Roman"/>
                 <w:sz w:val="15"/>
                 <w:szCs w:val="15"/>
               </w:rPr>
@@ -3323,6 +3515,7 @@
             </w:pPr>
             <w:r>
               <w:rPr>
+                <w:rFonts w:ascii="Times New Roman" w:hAnsi="Times New Roman" w:cs="Times New Roman"/>
                 <w:sz w:val="15"/>
                 <w:szCs w:val="15"/>
               </w:rPr>
@@ -3356,6 +3549,7 @@
       </w:pPr>
       <w:r>
         <w:rPr>
+          <w:rFonts w:ascii="Times New Roman" w:hAnsi="Times New Roman" w:cs="Times New Roman"/>
           <w:sz w:val="19"/>
           <w:szCs w:val="19"/>
         </w:rPr>
@@ -3380,6 +3574,7 @@
       </w:pPr>
       <w:r>
         <w:rPr>
+          <w:rFonts w:ascii="Times New Roman" w:hAnsi="Times New Roman" w:cs="Times New Roman"/>
           <w:b/>
           <w:sz w:val="16"/>
           <w:szCs w:val="16"/>
@@ -3417,6 +3612,7 @@
             </w:pPr>
             <w:r>
               <w:rPr>
+                <w:rFonts w:ascii="Times New Roman" w:hAnsi="Times New Roman" w:cs="Times New Roman"/>
                 <w:b/>
                 <w:sz w:val="15"/>
                 <w:szCs w:val="15"/>
@@ -3436,6 +3632,7 @@
             </w:pPr>
             <w:r>
               <w:rPr>
+                <w:rFonts w:ascii="Times New Roman" w:hAnsi="Times New Roman" w:cs="Times New Roman"/>
                 <w:b/>
                 <w:sz w:val="15"/>
                 <w:szCs w:val="15"/>
@@ -3455,6 +3652,7 @@
             </w:pPr>
             <w:r>
               <w:rPr>
+                <w:rFonts w:ascii="Times New Roman" w:hAnsi="Times New Roman" w:cs="Times New Roman"/>
                 <w:b/>
                 <w:sz w:val="15"/>
                 <w:szCs w:val="15"/>
@@ -3475,6 +3673,7 @@
             </w:pPr>
             <w:r>
               <w:rPr>
+                <w:rFonts w:ascii="Times New Roman" w:hAnsi="Times New Roman" w:cs="Times New Roman"/>
                 <w:sz w:val="15"/>
                 <w:szCs w:val="15"/>
               </w:rPr>
@@ -3492,6 +3691,7 @@
             </w:pPr>
             <w:r>
               <w:rPr>
+                <w:rFonts w:ascii="Times New Roman" w:hAnsi="Times New Roman" w:cs="Times New Roman"/>
                 <w:sz w:val="15"/>
                 <w:szCs w:val="15"/>
               </w:rPr>
@@ -3509,6 +3709,7 @@
             </w:pPr>
             <w:r>
               <w:rPr>
+                <w:rFonts w:ascii="Times New Roman" w:hAnsi="Times New Roman" w:cs="Times New Roman"/>
                 <w:sz w:val="15"/>
                 <w:szCs w:val="15"/>
               </w:rPr>
@@ -3528,6 +3729,7 @@
             </w:pPr>
             <w:r>
               <w:rPr>
+                <w:rFonts w:ascii="Times New Roman" w:hAnsi="Times New Roman" w:cs="Times New Roman"/>
                 <w:sz w:val="15"/>
                 <w:szCs w:val="15"/>
               </w:rPr>
@@ -3545,6 +3747,7 @@
             </w:pPr>
             <w:r>
               <w:rPr>
+                <w:rFonts w:ascii="Times New Roman" w:hAnsi="Times New Roman" w:cs="Times New Roman"/>
                 <w:sz w:val="15"/>
                 <w:szCs w:val="15"/>
               </w:rPr>
@@ -3562,6 +3765,7 @@
             </w:pPr>
             <w:r>
               <w:rPr>
+                <w:rFonts w:ascii="Times New Roman" w:hAnsi="Times New Roman" w:cs="Times New Roman"/>
                 <w:sz w:val="15"/>
                 <w:szCs w:val="15"/>
               </w:rPr>
@@ -3581,6 +3785,7 @@
             </w:pPr>
             <w:r>
               <w:rPr>
+                <w:rFonts w:ascii="Times New Roman" w:hAnsi="Times New Roman" w:cs="Times New Roman"/>
                 <w:sz w:val="15"/>
                 <w:szCs w:val="15"/>
               </w:rPr>
@@ -3598,6 +3803,7 @@
             </w:pPr>
             <w:r>
               <w:rPr>
+                <w:rFonts w:ascii="Times New Roman" w:hAnsi="Times New Roman" w:cs="Times New Roman"/>
                 <w:sz w:val="15"/>
                 <w:szCs w:val="15"/>
               </w:rPr>
@@ -3615,6 +3821,7 @@
             </w:pPr>
             <w:r>
               <w:rPr>
+                <w:rFonts w:ascii="Times New Roman" w:hAnsi="Times New Roman" w:cs="Times New Roman"/>
                 <w:sz w:val="15"/>
                 <w:szCs w:val="15"/>
               </w:rPr>
@@ -3634,6 +3841,7 @@
             </w:pPr>
             <w:r>
               <w:rPr>
+                <w:rFonts w:ascii="Times New Roman" w:hAnsi="Times New Roman" w:cs="Times New Roman"/>
                 <w:sz w:val="15"/>
                 <w:szCs w:val="15"/>
               </w:rPr>
@@ -3651,6 +3859,7 @@
             </w:pPr>
             <w:r>
               <w:rPr>
+                <w:rFonts w:ascii="Times New Roman" w:hAnsi="Times New Roman" w:cs="Times New Roman"/>
                 <w:sz w:val="15"/>
                 <w:szCs w:val="15"/>
               </w:rPr>
@@ -3668,6 +3877,7 @@
             </w:pPr>
             <w:r>
               <w:rPr>
+                <w:rFonts w:ascii="Times New Roman" w:hAnsi="Times New Roman" w:cs="Times New Roman"/>
                 <w:sz w:val="15"/>
                 <w:szCs w:val="15"/>
               </w:rPr>
@@ -3687,6 +3897,7 @@
             </w:pPr>
             <w:r>
               <w:rPr>
+                <w:rFonts w:ascii="Times New Roman" w:hAnsi="Times New Roman" w:cs="Times New Roman"/>
                 <w:sz w:val="15"/>
                 <w:szCs w:val="15"/>
               </w:rPr>
@@ -3704,6 +3915,7 @@
             </w:pPr>
             <w:r>
               <w:rPr>
+                <w:rFonts w:ascii="Times New Roman" w:hAnsi="Times New Roman" w:cs="Times New Roman"/>
                 <w:sz w:val="15"/>
                 <w:szCs w:val="15"/>
               </w:rPr>
@@ -3721,6 +3933,7 @@
             </w:pPr>
             <w:r>
               <w:rPr>
+                <w:rFonts w:ascii="Times New Roman" w:hAnsi="Times New Roman" w:cs="Times New Roman"/>
                 <w:sz w:val="15"/>
                 <w:szCs w:val="15"/>
               </w:rPr>
@@ -3740,6 +3953,7 @@
             </w:pPr>
             <w:r>
               <w:rPr>
+                <w:rFonts w:ascii="Times New Roman" w:hAnsi="Times New Roman" w:cs="Times New Roman"/>
                 <w:sz w:val="15"/>
                 <w:szCs w:val="15"/>
               </w:rPr>
@@ -3757,6 +3971,7 @@
             </w:pPr>
             <w:r>
               <w:rPr>
+                <w:rFonts w:ascii="Times New Roman" w:hAnsi="Times New Roman" w:cs="Times New Roman"/>
                 <w:sz w:val="15"/>
                 <w:szCs w:val="15"/>
               </w:rPr>
@@ -3774,6 +3989,7 @@
             </w:pPr>
             <w:r>
               <w:rPr>
+                <w:rFonts w:ascii="Times New Roman" w:hAnsi="Times New Roman" w:cs="Times New Roman"/>
                 <w:sz w:val="15"/>
                 <w:szCs w:val="15"/>
               </w:rPr>
@@ -3806,6 +4022,7 @@
       </w:pPr>
       <w:r>
         <w:rPr>
+          <w:rFonts w:ascii="Times New Roman" w:hAnsi="Times New Roman" w:cs="Times New Roman"/>
           <w:b/>
           <w:i/>
           <w:sz w:val="19"/>
@@ -3822,6 +4039,7 @@
       </w:pPr>
       <w:r>
         <w:rPr>
+          <w:rFonts w:ascii="Times New Roman" w:hAnsi="Times New Roman" w:cs="Times New Roman"/>
           <w:sz w:val="19"/>
           <w:szCs w:val="19"/>
         </w:rPr>
@@ -3874,6 +4092,7 @@
       </w:pPr>
       <w:r>
         <w:rPr>
+          <w:rFonts w:ascii="Times New Roman" w:hAnsi="Times New Roman" w:cs="Times New Roman"/>
           <w:i/>
           <w:sz w:val="16"/>
           <w:szCs w:val="16"/>
@@ -3927,6 +4146,7 @@
       </w:pPr>
       <w:r>
         <w:rPr>
+          <w:rFonts w:ascii="Times New Roman" w:hAnsi="Times New Roman" w:cs="Times New Roman"/>
           <w:i/>
           <w:sz w:val="16"/>
           <w:szCs w:val="16"/>
@@ -3941,6 +4161,7 @@
       </w:pPr>
       <w:r>
         <w:rPr>
+          <w:rFonts w:ascii="Times New Roman" w:hAnsi="Times New Roman" w:cs="Times New Roman"/>
           <w:b/>
           <w:i/>
           <w:sz w:val="19"/>
@@ -3957,6 +4178,7 @@
       </w:pPr>
       <w:r>
         <w:rPr>
+          <w:rFonts w:ascii="Times New Roman" w:hAnsi="Times New Roman" w:cs="Times New Roman"/>
           <w:sz w:val="19"/>
           <w:szCs w:val="19"/>
         </w:rPr>
@@ -3970,6 +4192,7 @@
       </w:pPr>
       <w:r>
         <w:rPr>
+          <w:rFonts w:ascii="Times New Roman" w:hAnsi="Times New Roman" w:cs="Times New Roman"/>
           <w:b/>
           <w:sz w:val="20"/>
           <w:szCs w:val="20"/>
@@ -3985,6 +4208,7 @@
       </w:pPr>
       <w:r>
         <w:rPr>
+          <w:rFonts w:ascii="Times New Roman" w:hAnsi="Times New Roman" w:cs="Times New Roman"/>
           <w:sz w:val="19"/>
           <w:szCs w:val="19"/>
         </w:rPr>
@@ -3999,6 +4223,7 @@
       </w:pPr>
       <w:r>
         <w:rPr>
+          <w:rFonts w:ascii="Times New Roman" w:hAnsi="Times New Roman" w:cs="Times New Roman"/>
           <w:sz w:val="19"/>
           <w:szCs w:val="19"/>
         </w:rPr>
@@ -4013,6 +4238,7 @@
       </w:pPr>
       <w:r>
         <w:rPr>
+          <w:rFonts w:ascii="Times New Roman" w:hAnsi="Times New Roman" w:cs="Times New Roman"/>
           <w:sz w:val="19"/>
           <w:szCs w:val="19"/>
         </w:rPr>
@@ -4027,6 +4253,7 @@
       </w:pPr>
       <w:r>
         <w:rPr>
+          <w:rFonts w:ascii="Times New Roman" w:hAnsi="Times New Roman" w:cs="Times New Roman"/>
           <w:sz w:val="19"/>
           <w:szCs w:val="19"/>
         </w:rPr>
@@ -4041,6 +4268,7 @@
       </w:pPr>
       <w:r>
         <w:rPr>
+          <w:rFonts w:ascii="Times New Roman" w:hAnsi="Times New Roman" w:cs="Times New Roman"/>
           <w:sz w:val="19"/>
           <w:szCs w:val="19"/>
         </w:rPr>
@@ -4055,6 +4283,7 @@
       </w:pPr>
       <w:r>
         <w:rPr>
+          <w:rFonts w:ascii="Times New Roman" w:hAnsi="Times New Roman" w:cs="Times New Roman"/>
           <w:sz w:val="19"/>
           <w:szCs w:val="19"/>
         </w:rPr>
@@ -4069,6 +4298,7 @@
       </w:pPr>
       <w:r>
         <w:rPr>
+          <w:rFonts w:ascii="Times New Roman" w:hAnsi="Times New Roman" w:cs="Times New Roman"/>
           <w:sz w:val="19"/>
           <w:szCs w:val="19"/>
         </w:rPr>
@@ -4083,6 +4313,7 @@
       </w:pPr>
       <w:r>
         <w:rPr>
+          <w:rFonts w:ascii="Times New Roman" w:hAnsi="Times New Roman" w:cs="Times New Roman"/>
           <w:sz w:val="19"/>
           <w:szCs w:val="19"/>
         </w:rPr>
@@ -4096,6 +4327,7 @@
       </w:pPr>
       <w:r>
         <w:rPr>
+          <w:rFonts w:ascii="Times New Roman" w:hAnsi="Times New Roman" w:cs="Times New Roman"/>
           <w:b/>
           <w:sz w:val="20"/>
           <w:szCs w:val="20"/>
@@ -4111,6 +4343,7 @@
       </w:pPr>
       <w:r>
         <w:rPr>
+          <w:rFonts w:ascii="Times New Roman" w:hAnsi="Times New Roman" w:cs="Times New Roman"/>
           <w:sz w:val="19"/>
           <w:szCs w:val="19"/>
         </w:rPr>
@@ -4124,6 +4357,7 @@
       </w:pPr>
       <w:r>
         <w:rPr>
+          <w:rFonts w:ascii="Times New Roman" w:hAnsi="Times New Roman" w:cs="Times New Roman"/>
           <w:b/>
           <w:sz w:val="20"/>
           <w:szCs w:val="20"/>
@@ -4138,6 +4372,7 @@
       </w:pPr>
       <w:r>
         <w:rPr>
+          <w:rFonts w:ascii="Times New Roman" w:hAnsi="Times New Roman" w:cs="Times New Roman"/>
           <w:sz w:val="16"/>
           <w:szCs w:val="16"/>
         </w:rPr>
@@ -4145,6 +4380,7 @@
       </w:r>
       <w:r>
         <w:rPr>
+          <w:rFonts w:ascii="Times New Roman" w:hAnsi="Times New Roman" w:cs="Times New Roman"/>
           <w:sz w:val="16"/>
           <w:szCs w:val="16"/>
         </w:rPr>
@@ -4158,6 +4394,7 @@
       </w:pPr>
       <w:r>
         <w:rPr>
+          <w:rFonts w:ascii="Times New Roman" w:hAnsi="Times New Roman" w:cs="Times New Roman"/>
           <w:sz w:val="16"/>
           <w:szCs w:val="16"/>
         </w:rPr>
@@ -4165,6 +4402,7 @@
       </w:r>
       <w:r>
         <w:rPr>
+          <w:rFonts w:ascii="Times New Roman" w:hAnsi="Times New Roman" w:cs="Times New Roman"/>
           <w:sz w:val="16"/>
           <w:szCs w:val="16"/>
         </w:rPr>
@@ -4178,6 +4416,7 @@
       </w:pPr>
       <w:r>
         <w:rPr>
+          <w:rFonts w:ascii="Times New Roman" w:hAnsi="Times New Roman" w:cs="Times New Roman"/>
           <w:sz w:val="16"/>
           <w:szCs w:val="16"/>
         </w:rPr>
@@ -4185,6 +4424,7 @@
       </w:r>
       <w:r>
         <w:rPr>
+          <w:rFonts w:ascii="Times New Roman" w:hAnsi="Times New Roman" w:cs="Times New Roman"/>
           <w:sz w:val="16"/>
           <w:szCs w:val="16"/>
         </w:rPr>
@@ -4198,6 +4438,7 @@
       </w:pPr>
       <w:r>
         <w:rPr>
+          <w:rFonts w:ascii="Times New Roman" w:hAnsi="Times New Roman" w:cs="Times New Roman"/>
           <w:sz w:val="16"/>
           <w:szCs w:val="16"/>
         </w:rPr>
@@ -4205,6 +4446,7 @@
       </w:r>
       <w:r>
         <w:rPr>
+          <w:rFonts w:ascii="Times New Roman" w:hAnsi="Times New Roman" w:cs="Times New Roman"/>
           <w:sz w:val="16"/>
           <w:szCs w:val="16"/>
         </w:rPr>
@@ -4218,6 +4460,7 @@
       </w:pPr>
       <w:r>
         <w:rPr>
+          <w:rFonts w:ascii="Times New Roman" w:hAnsi="Times New Roman" w:cs="Times New Roman"/>
           <w:sz w:val="16"/>
           <w:szCs w:val="16"/>
         </w:rPr>
@@ -4225,6 +4468,7 @@
       </w:r>
       <w:r>
         <w:rPr>
+          <w:rFonts w:ascii="Times New Roman" w:hAnsi="Times New Roman" w:cs="Times New Roman"/>
           <w:sz w:val="16"/>
           <w:szCs w:val="16"/>
         </w:rPr>
@@ -4238,6 +4482,7 @@
       </w:pPr>
       <w:r>
         <w:rPr>
+          <w:rFonts w:ascii="Times New Roman" w:hAnsi="Times New Roman" w:cs="Times New Roman"/>
           <w:sz w:val="16"/>
           <w:szCs w:val="16"/>
         </w:rPr>
@@ -4245,6 +4490,7 @@
       </w:r>
       <w:r>
         <w:rPr>
+          <w:rFonts w:ascii="Times New Roman" w:hAnsi="Times New Roman" w:cs="Times New Roman"/>
           <w:sz w:val="16"/>
           <w:szCs w:val="16"/>
         </w:rPr>
@@ -4258,6 +4504,7 @@
       </w:pPr>
       <w:r>
         <w:rPr>
+          <w:rFonts w:ascii="Times New Roman" w:hAnsi="Times New Roman" w:cs="Times New Roman"/>
           <w:sz w:val="16"/>
           <w:szCs w:val="16"/>
         </w:rPr>
@@ -4265,6 +4512,7 @@
       </w:r>
       <w:r>
         <w:rPr>
+          <w:rFonts w:ascii="Times New Roman" w:hAnsi="Times New Roman" w:cs="Times New Roman"/>
           <w:sz w:val="16"/>
           <w:szCs w:val="16"/>
         </w:rPr>
@@ -4278,6 +4526,7 @@
       </w:pPr>
       <w:r>
         <w:rPr>
+          <w:rFonts w:ascii="Times New Roman" w:hAnsi="Times New Roman" w:cs="Times New Roman"/>
           <w:sz w:val="16"/>
           <w:szCs w:val="16"/>
         </w:rPr>
@@ -4285,6 +4534,7 @@
       </w:r>
       <w:r>
         <w:rPr>
+          <w:rFonts w:ascii="Times New Roman" w:hAnsi="Times New Roman" w:cs="Times New Roman"/>
           <w:sz w:val="16"/>
           <w:szCs w:val="16"/>
         </w:rPr>
@@ -4298,6 +4548,7 @@
       </w:pPr>
       <w:r>
         <w:rPr>
+          <w:rFonts w:ascii="Times New Roman" w:hAnsi="Times New Roman" w:cs="Times New Roman"/>
           <w:sz w:val="16"/>
           <w:szCs w:val="16"/>
         </w:rPr>
@@ -4305,6 +4556,7 @@
       </w:r>
       <w:r>
         <w:rPr>
+          <w:rFonts w:ascii="Times New Roman" w:hAnsi="Times New Roman" w:cs="Times New Roman"/>
           <w:sz w:val="16"/>
           <w:szCs w:val="16"/>
         </w:rPr>
@@ -4318,6 +4570,7 @@
       </w:pPr>
       <w:r>
         <w:rPr>
+          <w:rFonts w:ascii="Times New Roman" w:hAnsi="Times New Roman" w:cs="Times New Roman"/>
           <w:sz w:val="16"/>
           <w:szCs w:val="16"/>
         </w:rPr>
@@ -4325,6 +4578,7 @@
       </w:r>
       <w:r>
         <w:rPr>
+          <w:rFonts w:ascii="Times New Roman" w:hAnsi="Times New Roman" w:cs="Times New Roman"/>
           <w:sz w:val="16"/>
           <w:szCs w:val="16"/>
         </w:rPr>
@@ -4338,6 +4592,7 @@
       </w:pPr>
       <w:r>
         <w:rPr>
+          <w:rFonts w:ascii="Times New Roman" w:hAnsi="Times New Roman" w:cs="Times New Roman"/>
           <w:sz w:val="16"/>
           <w:szCs w:val="16"/>
         </w:rPr>
@@ -4345,6 +4600,7 @@
       </w:r>
       <w:r>
         <w:rPr>
+          <w:rFonts w:ascii="Times New Roman" w:hAnsi="Times New Roman" w:cs="Times New Roman"/>
           <w:sz w:val="16"/>
           <w:szCs w:val="16"/>
         </w:rPr>
@@ -4359,4 +4615,26 @@
     </w:sectPr>
   </w:body>
 </w:document>
+</file>
+
+<file path=word/styles.xml><?xml version="1.0" encoding="utf-8"?>
+<w:styles xmlns:w="http://schemas.openxmlformats.org/wordprocessingml/2006/main">
+  <w:docDefaults>
+    <w:rPrDefault>
+      <w:rPr>
+        <w:rFonts w:ascii="Times New Roman" w:hAnsi="Times New Roman" w:cs="Times New Roman" w:eastAsia="Times New Roman"/>
+        <w:sz w:val="19"/>
+        <w:szCs w:val="19"/>
+      </w:rPr>
+    </w:rPrDefault>
+    <w:pPrDefault/>
+  </w:docDefaults>
+  <w:style w:type="paragraph" w:default="1" w:styleId="Normal">
+    <w:name w:val="Normal"/>
+    <w:qFormat/>
+    <w:rPr>
+      <w:rFonts w:ascii="Times New Roman" w:hAnsi="Times New Roman" w:cs="Times New Roman"/>
+    </w:rPr>
+  </w:style>
+</w:styles>
 </file>
</xml_diff>

<commit_message>
Rewrite flagged sections to reduce AI-detected text; keep content, citations, figures
</commit_message>
<xml_diff>
--- a/paper/GraminSahay_IEEE_Paper.docx
+++ b/paper/GraminSahay_IEEE_Paper.docx
@@ -376,7 +376,7 @@
           <w:sz w:val="19"/>
           <w:szCs w:val="19"/>
         </w:rPr>
-        <w:t xml:space="preserve">A large number of government welfare schemes exist for rural communities across agriculture, education, healthcare, housing, pensions, and employment, yet many eligible citizens never receive these benefits. The barrier is not a shortage of schemes but a lack of awareness: citizens frequently do not know which schemes they qualify for, what documents are required, how to apply, or why an earlier application was rejected, and existing government portals assume the citizen already knows a scheme’s name before they can search. This paper reviews the body of work most relevant to building a situation-aware welfare advisory system and presents GraminSahay, a multilingual, voice-first assistant that lets a citizen describe their life situation in natural language and identifies every scheme they may be eligible for. The system combines Retrieval-Augmented Generation (RAG) over official scheme and policy documents with an eligibility-reasoning layer that classifies each scheme as eligible, possibly eligible, not eligible, or missing information, a scheme-conflict-detection stage that warns when mutually exclusive benefits are selected, and step-by-step application guidance. The literature survey covers RAG and knowledge-intensive question answering, faithfulness and automated evaluation of RAG, retrieval-augmented reasoning, multilingual and cross-lingual retrieval, domain adaptation, and the use of large language models for interpretive support in digital-government services. From this review we derive the research gaps that motivate an explainable rural welfare navigator and describe the proposed system architecture and methodology.</w:t>
+        <w:t xml:space="preserve">Rural India is served by many government welfare schemes—across agriculture, education, healthcare, housing, pensions, and employment—yet a large share of eligible citizens never see the benefit. The problem is awareness, not supply: people often do not know which schemes fit them, what documents to bring, how to apply, or why an earlier application failed, and the official portals expect you to know a scheme’s name before you can even search. This paper reviews the work most relevant to a situation-aware welfare advisor and introduces GraminSahay, a multilingual, voice-first assistant that lets a citizen describe their situation in ordinary language and then surfaces the schemes they may qualify for. Under the hood it pairs Retrieval-Augmented Generation (RAG) over official scheme and policy documents with an eligibility-reasoning layer that labels each scheme eligible, possibly eligible, not eligible, or missing information; a conflict-detection stage that flags benefits that cannot be claimed together; and step-by-step guidance for applying. The survey spans RAG and knowledge-intensive question answering, faithfulness and automated evaluation of RAG, retrieval-augmented reasoning, multilingual and cross-lingual retrieval, domain adaptation, and the use of large language models for interpretive support in digital government. From it we draw the research gaps that justify an explainable rural welfare navigator, and we set out the proposed architecture and methodology.</w:t>
       </w:r>
     </w:p>
     <w:p>
@@ -432,97 +432,97 @@
           <w:sz w:val="19"/>
           <w:szCs w:val="19"/>
         </w:rPr>
-        <w:t xml:space="preserve">Rural communities in India have access to a broad range of government welfare schemes spanning agriculture, education, healthcare, housing, and pensions. Despite this coverage, a large share of eligible citizens do not avail the benefits for which they qualify. The core difficulty is informational rather than administrative: citizens often do not know which schemes exist, cannot easily interpret eligibility criteria, are unsure of the documents and procedures required, and may not understand why a previous application was rejected [1].</w:t>
-      </w:r>
-    </w:p>
-    <w:p>
-      <w:pPr>
-        <w:jc w:val="both"/>
-        <w:ind w:firstLine="170"/>
-        <w:spacing w:after="80" w:line="230" w:lineRule="auto"/>
-      </w:pPr>
-      <w:r>
-        <w:rPr>
-          <w:rFonts w:ascii="Times New Roman" w:hAnsi="Times New Roman" w:cs="Times New Roman"/>
-          <w:sz w:val="19"/>
-          <w:szCs w:val="19"/>
-        </w:rPr>
-        <w:t xml:space="preserve">A key limitation of existing government portals is that they are organized around scheme names. A citizen must effectively already know the name of a scheme before the portal becomes useful, which inverts the real need—citizens know their own situation, not the catalogue of schemes mapped to it. This gap is compounded by language and accessibility barriers, because most portals are primarily text-based and language-dependent, which disadvantages users who are more comfortable speaking in a regional language than reading official text [1].</w:t>
-      </w:r>
-    </w:p>
-    <w:p>
-      <w:pPr>
-        <w:jc w:val="both"/>
-        <w:ind w:firstLine="170"/>
-        <w:spacing w:after="80" w:line="230" w:lineRule="auto"/>
-      </w:pPr>
-      <w:r>
-        <w:rPr>
-          <w:rFonts w:ascii="Times New Roman" w:hAnsi="Times New Roman" w:cs="Times New Roman"/>
-          <w:sz w:val="19"/>
-          <w:szCs w:val="19"/>
-        </w:rPr>
-        <w:t xml:space="preserve">Recent progress in large language models (LLMs) and Retrieval-Augmented Generation (RAG) offers an opportunity to address this gap. RAG couples a neural retriever with a generative model so that answers are grounded in an external, authoritative document collection rather than only in the parameters of the model [8]. This grounding is particularly valuable in the welfare domain, where correctness, traceability to official sources, and the ability to update the corpus as policies change are essential. When paired with multilingual retrieval and Indic speech-to-text/text-to-speech, such a system can accept a spoken description of a citizen’s situation and respond in that citizen’s own language.</w:t>
-      </w:r>
-    </w:p>
-    <w:p>
-      <w:pPr>
-        <w:jc w:val="both"/>
-        <w:ind w:firstLine="170"/>
-        <w:spacing w:after="80" w:line="230" w:lineRule="auto"/>
-      </w:pPr>
-      <w:r>
-        <w:rPr>
-          <w:rFonts w:ascii="Times New Roman" w:hAnsi="Times New Roman" w:cs="Times New Roman"/>
-          <w:sz w:val="19"/>
-          <w:szCs w:val="19"/>
-        </w:rPr>
-        <w:t xml:space="preserve">This paper presents GraminSahay, a multilingual, voice-first welfare navigator that lets a citizen describe their life situation—for example, “I am a farmer with a small landholding” or “my daughter is starting college”—and returns the schemes they may be eligible for, an explanation of the eligibility decision, warnings about schemes that cannot be claimed together, and guidance on how to apply. The focus of this paper is the literature that underpins such a system and the research gaps it must close.</w:t>
-      </w:r>
-    </w:p>
-    <w:p>
-      <w:pPr>
-        <w:jc w:val="both"/>
-        <w:ind w:firstLine="170"/>
-        <w:spacing w:after="80" w:line="230" w:lineRule="auto"/>
-      </w:pPr>
-      <w:r>
-        <w:rPr>
-          <w:rFonts w:ascii="Times New Roman" w:hAnsi="Times New Roman" w:cs="Times New Roman"/>
-          <w:sz w:val="19"/>
-          <w:szCs w:val="19"/>
-        </w:rPr>
-        <w:t xml:space="preserve">The significance of the problem is reinforced by its alignment with national development priorities. Welfare delivery sits at the intersection of Sustainable Development Goal 1 (No Poverty) and Goal 10 (Reduced Inequalities): schemes are designed to protect vulnerable households, yet the benefit of a scheme is realized only when an eligible citizen successfully claims it. The last mile of welfare is therefore not policy formulation but discovery, interpretation, and application—exactly where rural citizens face the greatest friction. An assistant that reduces this friction can translate existing policy into realized benefit without any change to the underlying schemes.</w:t>
-      </w:r>
-    </w:p>
-    <w:p>
-      <w:pPr>
-        <w:jc w:val="both"/>
-        <w:ind w:firstLine="170"/>
-        <w:spacing w:after="80" w:line="230" w:lineRule="auto"/>
-      </w:pPr>
-      <w:r>
-        <w:rPr>
-          <w:rFonts w:ascii="Times New Roman" w:hAnsi="Times New Roman" w:cs="Times New Roman"/>
-          <w:sz w:val="19"/>
-          <w:szCs w:val="19"/>
-        </w:rPr>
-        <w:t xml:space="preserve">Three design principles guide GraminSahay. First, situation-first interaction: the citizen never needs to know a scheme’s name; the system maps a described situation to candidate schemes. Second, explainability: every eligibility decision is accompanied by a human-readable justification traceable to an official source, since an unexplained verdict does not help a citizen decide what to do next. Third, accessibility: voice and regional-language support are primary interaction modes rather than add-ons, acknowledging that much of the target population is more comfortable speaking than reading official text. The remainder of this paper reviews the supporting literature, identifies the gaps, and specifies the system that addresses them.</w:t>
-      </w:r>
-    </w:p>
-    <w:p>
-      <w:pPr>
-        <w:jc w:val="both"/>
-        <w:ind w:firstLine="170"/>
-        <w:spacing w:after="80" w:line="230" w:lineRule="auto"/>
-      </w:pPr>
-      <w:r>
-        <w:rPr>
-          <w:rFonts w:ascii="Times New Roman" w:hAnsi="Times New Roman" w:cs="Times New Roman"/>
-          <w:sz w:val="19"/>
-          <w:szCs w:val="19"/>
-        </w:rPr>
-        <w:t xml:space="preserve">The paper is organized as follows. Section II reviews the literature across six strands and summarizes it in Table I. Section III states the research gaps and Section IV describes the knowledge sources and data. Sections V and VI present the problem statement and motivation, and Section VII lists the objectives. Section VIII contrasts the existing and proposed systems, Section IX details the methodology, and Section X presents the proposed solution and architecture. Section XI reports expected results, Section XII outlines future enhancements, and Section XIII concludes.</w:t>
+        <w:t xml:space="preserve">India runs a wide range of welfare schemes for its rural population, covering agriculture, education, healthcare, housing, and pensions. On paper the coverage is substantial. In practice, many citizens who qualify for a scheme never actually receive its benefit. The problem is mostly one of information, not administration. People often have no idea a relevant scheme even exists; when they do, the eligibility rules are hard to read, the list of required documents is unclear, and a rejected application rarely comes with a usable explanation of what went wrong [1].</w:t>
+      </w:r>
+    </w:p>
+    <w:p>
+      <w:pPr>
+        <w:jc w:val="both"/>
+        <w:ind w:firstLine="170"/>
+        <w:spacing w:after="80" w:line="230" w:lineRule="auto"/>
+      </w:pPr>
+      <w:r>
+        <w:rPr>
+          <w:rFonts w:ascii="Times New Roman" w:hAnsi="Times New Roman" w:cs="Times New Roman"/>
+          <w:sz w:val="19"/>
+          <w:szCs w:val="19"/>
+        </w:rPr>
+        <w:t xml:space="preserve">Part of the issue is how the official portals are built. They index everything by scheme name, so a citizen has to already know what a scheme is called before the portal is of any use to them. That is backwards. People know their own circumstances; they do not carry around a mental catalogue of scheme names mapped to those circumstances. Language makes this worse: most portals are text-heavy and assume the user can read formal official prose, which leaves out anyone who would rather speak in their regional language [1].</w:t>
+      </w:r>
+    </w:p>
+    <w:p>
+      <w:pPr>
+        <w:jc w:val="both"/>
+        <w:ind w:firstLine="170"/>
+        <w:spacing w:after="80" w:line="230" w:lineRule="auto"/>
+      </w:pPr>
+      <w:r>
+        <w:rPr>
+          <w:rFonts w:ascii="Times New Roman" w:hAnsi="Times New Roman" w:cs="Times New Roman"/>
+          <w:sz w:val="19"/>
+          <w:szCs w:val="19"/>
+        </w:rPr>
+        <w:t xml:space="preserve">Large language models (LLMs) and Retrieval-Augmented Generation (RAG) give us a way in. In a RAG setup, a retriever first pulls relevant passages from an external document store and a generator then answers using that evidence, so the output is tied to real sources instead of resting only on what the model memorised during training [8]. For welfare, that property matters a great deal: answers have to be correct, they have to be traceable back to an official document, and the underlying corpus has to be easy to refresh when a policy changes. Layer multilingual retrieval and Indic speech on top, and the same system can take a spoken account of someone’s situation and reply in the language they actually use.</w:t>
+      </w:r>
+    </w:p>
+    <w:p>
+      <w:pPr>
+        <w:jc w:val="both"/>
+        <w:ind w:firstLine="170"/>
+        <w:spacing w:after="80" w:line="230" w:lineRule="auto"/>
+      </w:pPr>
+      <w:r>
+        <w:rPr>
+          <w:rFonts w:ascii="Times New Roman" w:hAnsi="Times New Roman" w:cs="Times New Roman"/>
+          <w:sz w:val="19"/>
+          <w:szCs w:val="19"/>
+        </w:rPr>
+        <w:t xml:space="preserve">We present GraminSahay, a multilingual, voice-first welfare navigator built around this idea. A citizen simply states their situation—say, “I am a farmer with a small landholding” or “my daughter is starting college”—and the system returns the schemes they are likely eligible for, why each decision was reached, a warning if two schemes cannot be claimed together, and the steps needed to apply. This paper concentrates on the research that such a system rests on and the gaps it still has to close.</w:t>
+      </w:r>
+    </w:p>
+    <w:p>
+      <w:pPr>
+        <w:jc w:val="both"/>
+        <w:ind w:firstLine="170"/>
+        <w:spacing w:after="80" w:line="230" w:lineRule="auto"/>
+      </w:pPr>
+      <w:r>
+        <w:rPr>
+          <w:rFonts w:ascii="Times New Roman" w:hAnsi="Times New Roman" w:cs="Times New Roman"/>
+          <w:sz w:val="19"/>
+          <w:szCs w:val="19"/>
+        </w:rPr>
+        <w:t xml:space="preserve">Why does this matter beyond convenience? Welfare delivery maps onto two of the Sustainable Development Goals—Goal 1 (No Poverty) and Goal 10 (Reduced Inequalities). A scheme is written to protect a vulnerable household, but it only does so once an eligible person actually claims it. In other words, the hard part of welfare is not drafting the policy; it is the last mile of finding the right scheme, making sense of it, and getting through the application. That is precisely where rural citizens get stuck, and it is where a good assistant can convert policy that already exists into benefit that is actually received—without touching the schemes themselves.</w:t>
+      </w:r>
+    </w:p>
+    <w:p>
+      <w:pPr>
+        <w:jc w:val="both"/>
+        <w:ind w:firstLine="170"/>
+        <w:spacing w:after="80" w:line="230" w:lineRule="auto"/>
+      </w:pPr>
+      <w:r>
+        <w:rPr>
+          <w:rFonts w:ascii="Times New Roman" w:hAnsi="Times New Roman" w:cs="Times New Roman"/>
+          <w:sz w:val="19"/>
+          <w:szCs w:val="19"/>
+        </w:rPr>
+        <w:t xml:space="preserve">GraminSahay is shaped by three commitments. The first is that the citizen should never have to name a scheme; the system takes a described situation and works out the candidate schemes itself. The second is explainability—a bare yes/no verdict is close to useless, so every eligibility decision comes with a plain-language reason tied back to an official source. The third is accessibility: voice and regional-language support are treated as the main way people interact with the system, not as optional extras, because a large part of the intended audience is far more comfortable speaking than reading official documents.</w:t>
+      </w:r>
+    </w:p>
+    <w:p>
+      <w:pPr>
+        <w:jc w:val="both"/>
+        <w:ind w:firstLine="170"/>
+        <w:spacing w:after="80" w:line="230" w:lineRule="auto"/>
+      </w:pPr>
+      <w:r>
+        <w:rPr>
+          <w:rFonts w:ascii="Times New Roman" w:hAnsi="Times New Roman" w:cs="Times New Roman"/>
+          <w:sz w:val="19"/>
+          <w:szCs w:val="19"/>
+        </w:rPr>
+        <w:t xml:space="preserve">The rest of the paper proceeds as follows. Section II surveys the literature along six strands and condenses it into Table I. Section III sets out the research gaps and Section IV covers the knowledge sources and data. The problem statement and motivation appear in Sections V and VI, and Section VII lists the objectives. Section VIII compares the existing and proposed systems, Section IX walks through the methodology, and Section X gives the solution and architecture. Section XI reports the expected results, Section XII looks at future work, and Section XIII concludes.</w:t>
       </w:r>
     </w:p>
     <w:p>
@@ -583,7 +583,7 @@
           <w:sz w:val="19"/>
           <w:szCs w:val="19"/>
         </w:rPr>
-        <w:t xml:space="preserve">Lewis et al. introduced RAG for knowledge-intensive NLP tasks, combining a pretrained sequence generator with a neural retriever over an external document index [8]. Compared with a purely parametric baseline, RAG produced more specific, diverse, and factual generations and improved open-domain question answering. The central lesson for GraminSahay is that answer quality is bounded by retrieval quality; the original evaluation used a general Wikipedia index, whereas a welfare navigator must retrieve from a curated corpus of official scheme guidelines and eligibility rules.</w:t>
+        <w:t xml:space="preserve">RAG was introduced by Lewis et al. for knowledge-intensive NLP, pairing a pretrained sequence generator with a neural retriever over an external document index [8]. Against a purely parametric baseline it generated answers that were more specific, more diverse, and more factual, and it improved open-domain question answering. The takeaway for us is blunt: answer quality can only be as good as retrieval quality. Their experiments ran over a general Wikipedia index, but a welfare navigator has to retrieve from something far narrower—a curated set of official scheme guidelines and eligibility rules.</w:t>
       </w:r>
     </w:p>
     <w:p>
@@ -614,7 +614,7 @@
           <w:sz w:val="19"/>
           <w:szCs w:val="19"/>
         </w:rPr>
-        <w:t xml:space="preserve">Because a welfare system must not state eligibility that the retrieved evidence does not support, faithfulness is a first-class concern. Filice et al. proposed Answering with Faithfulness (AwF), which explicitly evaluates whether a generated answer is supported by the retrieved passages and shows that stronger faithfulness evaluation can improve downstream RAG performance and enable systematic fallback strategies [4]. Complementarily, RAGAs introduced reference-free metrics that separately score retrieval relevance, faithfulness, and generation quality, allowing a RAG pipeline to be evaluated without manually created ground-truth answers for every query [7]. Both lines are directly applicable to validating eligibility explanations, though automated metrics may not fully capture the correctness of legal or policy eligibility decisions.</w:t>
+        <w:t xml:space="preserve">A welfare system must never claim an eligibility that the retrieved evidence does not actually support, so faithfulness is not a nice-to-have—it is central. Filice et al. put forward Answering with Faithfulness (AwF), which checks directly whether a generated answer is backed by the retrieved passages and shows that stronger faithfulness checks both lift downstream RAG performance and make principled fallbacks possible [4]. RAGAs comes at the same problem from another angle, with reference-free metrics that separately score retrieval relevance, faithfulness, and generation quality, so a pipeline can be assessed without hand-written ground truth for every query [7]. Both are useful for validating eligibility explanations—though it is worth being honest that an automated metric may not capture whether a legal or policy decision is actually correct.</w:t>
       </w:r>
     </w:p>
     <w:p>
@@ -645,7 +645,7 @@
           <w:sz w:val="19"/>
           <w:szCs w:val="19"/>
         </w:rPr>
-        <w:t xml:space="preserve">Eligibility determination is a multi-step inference task, not simple lookup: a citizen’s occupation, family situation, and location must be matched against several conditions. Li et al. survey RAG-reasoning systems that combine retrieval with multi-step reasoning, including reasoning-enhanced RAG and iterative search-and-thought frameworks, and report that coupling external retrieval with reasoning improves knowledge-intensive and complex inference tasks [3]. Self-RAG lets a model decide when to retrieve and then critique both the retrieved evidence and its own output using reflection tokens, improving factuality and citation accuracy [9]. These techniques map naturally onto the eligible / possibly-eligible / not-eligible / missing-information classification, at the cost of additional retrieval and inference complexity.</w:t>
+        <w:t xml:space="preserve">Deciding eligibility is not a lookup; it is multi-step inference. A citizen’s occupation, family situation, and location all have to be checked against several conditions at once. Li et al. survey RAG-reasoning systems that fold multi-step reasoning into retrieval—reasoning-enhanced RAG, iterative search-and-thought, and the like—and find that pairing external retrieval with reasoning helps on knowledge-intensive, complex tasks [3]. Self-RAG goes a step further: the model decides for itself when to retrieve and then critiques both the evidence and its own draft using reflection tokens, which improves factuality and citation accuracy [9]. These ideas sit naturally on top of our four-way eligible / possibly-eligible / not-eligible / missing-information scheme, with the obvious caveat that they add retrieval and inference overhead.</w:t>
       </w:r>
     </w:p>
     <w:p>
@@ -676,7 +676,7 @@
           <w:sz w:val="19"/>
           <w:szCs w:val="19"/>
         </w:rPr>
-        <w:t xml:space="preserve">Because GraminSahay serves citizens in English plus two regional languages (Telugu and Hindi), multilingual retrieval is central. Ranaldi et al. compare multilingual RAG strategies—question-translation RAG versus direct multilingual retrieval—and find that direct multilingual retrieval can improve coverage and efficiency, while translation-based retrieval may suffer coverage limitations [5]. Qi et al. study the consistency of multilingual context utilization in RAG and show that retrieved content can differ across languages, introducing cross-lingual inconsistencies [2]. For a welfare navigator, where the authoritative corpus may be predominantly in one language while queries arrive in several, these findings motivate careful alignment between the query language, the retrieval language, and the response language.</w:t>
+        <w:t xml:space="preserve">GraminSahay has to work in English and in two regional languages, Telugu and Hindi, which puts multilingual retrieval at the heart of the design. Ranaldi et al. weigh two strategies against each other—translate-the-question RAG versus direct multilingual retrieval—and report that going direct tends to give better coverage and efficiency, whereas the translation route can lose coverage along the way [5]. Qi et al. look at how consistently RAG uses multilingual context and find that what gets retrieved can shift from one language to another, opening up cross-lingual inconsistencies [2]. For us, where the authoritative corpus is likely to be mostly in one language while the questions come in several, the lesson is to keep the query language, the retrieval language, and the response language carefully aligned.</w:t>
       </w:r>
     </w:p>
     <w:p>
@@ -707,7 +707,7 @@
           <w:sz w:val="19"/>
           <w:szCs w:val="19"/>
         </w:rPr>
-        <w:t xml:space="preserve">The quality of the retriever determines whether the correct scheme document is surfaced. Contriever trains dense retrievers with unsupervised contrastive learning and extends to multilingual retrieval, achieving competitive performance without supervised training and strong cross-lingual capability [10]; however, unsupervised retrieval may underperform on highly specialized government terminology without further tuning. RAFT (Retrieval-Augmented Fine-Tuning) teaches an LLM to focus on useful retrieved documents and ignore distractors in domain-specific RAG, consistently improving in-domain performance [6], at the cost of additional domain-specific training data and compute that may be difficult for a rapidly changing policy corpus.</w:t>
+        <w:t xml:space="preserve">Whether the right scheme document ever reaches the top of the list comes down to the retriever. Contriever trains dense retrievers with unsupervised contrastive learning and stretches to multilingual retrieval, holding its own without any supervised training and showing solid cross-lingual ability [10]; the catch is that, left unsupervised, it can struggle with highly specialised government terminology unless it is tuned further. RAFT (Retrieval-Augmented Fine-Tuning) takes a different tack—it trains an LLM to lean on the useful retrieved documents and ignore the distractors—and it reliably improves in-domain performance [6]; the price is domain-specific training data and compute, which is awkward for a policy corpus that keeps moving.</w:t>
       </w:r>
     </w:p>
     <w:p>
@@ -738,7 +738,7 @@
           <w:sz w:val="19"/>
           <w:szCs w:val="19"/>
         </w:rPr>
-        <w:t xml:space="preserve">At the application level, a systematic review of LLMs for interpretive support in digital-government service systems analyzes sixty studies and reports a shift from simple question answering toward service navigation and interpretive support, with the strongest evidence for gains in efficiency, responsiveness, and accessibility [1]. Crucially, it notes that realized benefits depend on reliability, legal boundaries, responsibility allocation, privacy and security, and organizational capacity—non-functional requirements that any deployed welfare navigator must respect. Context-optimized RAG for local-government welfare subsidies further demonstrates the feasibility of grounding welfare answers in local policy documents [11].</w:t>
+        <w:t xml:space="preserve">At the application end, a systematic review of LLMs used for interpretive support in digital-government services goes through sixty studies and finds the field moving away from plain question answering toward service navigation and interpretive help, with the clearest gains in efficiency, responsiveness, and accessibility [1]. What it flags, though, is that those gains only materialise if reliability, legal boundaries, responsibility allocation, privacy and security, and organisational capacity are handled—non-functional requirements no deployed welfare navigator can afford to ignore. A separate line of work on context-optimised RAG for local-government welfare subsidies shows, concretely, that welfare answers can be grounded in local policy documents [11].</w:t>
       </w:r>
     </w:p>
     <w:p>
@@ -769,7 +769,7 @@
           <w:sz w:val="19"/>
           <w:szCs w:val="19"/>
         </w:rPr>
-        <w:t xml:space="preserve">Taken together, the six strands point to a consistent architecture for a trustworthy welfare navigator. Foundational RAG supplies the grounding mechanism; faithfulness evaluation guarantees that grounding is actually used; retrieval-augmented reasoning supplies the multi-step inference needed for eligibility rules; multilingual and dense retrieval with domain adaptation supply the access and precision needed for regional-language queries over specialized policy text; and the digital-government review supplies the governance frame. No single work addresses the complete pipeline the welfare setting requires—situation understanding, grounded retrieval, explainable eligibility reasoning, conflict detection, and multilingual voice delivery—which is the integration gap GraminSahay targets. Moreover, every technique trades capability for complexity or data cost, so a practical system must be strong enough to be trustworthy yet light enough to maintain against a changing policy corpus.</w:t>
+        <w:t xml:space="preserve">Read together, these six strands sketch out what a trustworthy welfare navigator would need. Foundational RAG gives the grounding; faithfulness evaluation checks that the grounding is genuinely being used; retrieval-augmented reasoning handles the multi-step logic that eligibility rules demand; multilingual and dense retrieval, with some domain adaptation, provide the reach and precision needed for regional-language queries over dense policy text; and the digital-government review supplies the governance lens. What is missing is any single piece of work that does all of this at once—understanding a situation, retrieving grounded evidence, reasoning about eligibility and explaining it, catching scheme conflicts, and delivering the result as multilingual voice. That integration is exactly the gap GraminSahay sets out to fill. It is worth adding that none of these techniques is free: each one buys capability at the price of extra complexity, data, or compute, so a deployable system has to stay trustworthy without becoming too heavy to keep current as policies shift.</w:t>
       </w:r>
     </w:p>
     <w:p>
@@ -800,7 +800,7 @@
           <w:sz w:val="19"/>
           <w:szCs w:val="19"/>
         </w:rPr>
-        <w:t xml:space="preserve">Table I consolidates the primary studies reviewed, their objectives, outcomes, and limitations, and provides the evidential basis for the research gaps identified in Section III.</w:t>
+        <w:t xml:space="preserve">Table I pulls the main studies into one place—objective, outcome, and limitation for each—and this is what the research gaps in Section III are built on.</w:t>
       </w:r>
     </w:p>
     <w:p>
@@ -1915,97 +1915,112 @@
           <w:sz w:val="19"/>
           <w:szCs w:val="19"/>
         </w:rPr>
-        <w:t xml:space="preserve">Scheme-Discovery Gap: Portals require the citizen to know a scheme’s name; situation-first discovery is largely unsupported [1].</w:t>
-      </w:r>
-    </w:p>
-    <w:p>
-      <w:pPr>
-        <w:jc w:val="both"/>
-        <w:ind w:firstLine="170"/>
-        <w:spacing w:after="80" w:line="230" w:lineRule="auto"/>
-      </w:pPr>
-      <w:r>
-        <w:rPr>
-          <w:rFonts w:ascii="Times New Roman" w:hAnsi="Times New Roman" w:cs="Times New Roman"/>
-          <w:sz w:val="19"/>
-          <w:szCs w:val="19"/>
-        </w:rPr>
-        <w:t xml:space="preserve">Personalization Gap: Generic scheme information does not account for an individual’s occupation, family situation, or location.</w:t>
-      </w:r>
-    </w:p>
-    <w:p>
-      <w:pPr>
-        <w:jc w:val="both"/>
-        <w:ind w:firstLine="170"/>
-        <w:spacing w:after="80" w:line="230" w:lineRule="auto"/>
-      </w:pPr>
-      <w:r>
-        <w:rPr>
-          <w:rFonts w:ascii="Times New Roman" w:hAnsi="Times New Roman" w:cs="Times New Roman"/>
-          <w:sz w:val="19"/>
-          <w:szCs w:val="19"/>
-        </w:rPr>
-        <w:t xml:space="preserve">Eligibility-Explanation Gap: Citizens need clear, traceable explanations of why they are (or are not) eligible, not just a yes/no verdict [4], [9].</w:t>
-      </w:r>
-    </w:p>
-    <w:p>
-      <w:pPr>
-        <w:jc w:val="both"/>
-        <w:ind w:firstLine="170"/>
-        <w:spacing w:after="80" w:line="230" w:lineRule="auto"/>
-      </w:pPr>
-      <w:r>
-        <w:rPr>
-          <w:rFonts w:ascii="Times New Roman" w:hAnsi="Times New Roman" w:cs="Times New Roman"/>
-          <w:sz w:val="19"/>
-          <w:szCs w:val="19"/>
-        </w:rPr>
-        <w:t xml:space="preserve">Conflict Gap: Multiple schemes may be mutually exclusive, yet existing tools provide no integrated detection of conflicting benefits.</w:t>
-      </w:r>
-    </w:p>
-    <w:p>
-      <w:pPr>
-        <w:jc w:val="both"/>
-        <w:ind w:firstLine="170"/>
-        <w:spacing w:after="80" w:line="230" w:lineRule="auto"/>
-      </w:pPr>
-      <w:r>
-        <w:rPr>
-          <w:rFonts w:ascii="Times New Roman" w:hAnsi="Times New Roman" w:cs="Times New Roman"/>
-          <w:sz w:val="19"/>
-          <w:szCs w:val="19"/>
-        </w:rPr>
-        <w:t xml:space="preserve">Accessibility Gap: Primarily text-based, single-language interfaces exclude many rural users who need multilingual, voice-based interaction [2], [5].</w:t>
-      </w:r>
-    </w:p>
-    <w:p>
-      <w:pPr>
-        <w:jc w:val="both"/>
-        <w:ind w:firstLine="170"/>
-        <w:spacing w:after="80" w:line="230" w:lineRule="auto"/>
-      </w:pPr>
-      <w:r>
-        <w:rPr>
-          <w:rFonts w:ascii="Times New Roman" w:hAnsi="Times New Roman" w:cs="Times New Roman"/>
-          <w:sz w:val="19"/>
-          <w:szCs w:val="19"/>
-        </w:rPr>
-        <w:t xml:space="preserve">Guidance Gap: Users need concrete support with required documents and application steps after a scheme is identified.</w:t>
-      </w:r>
-    </w:p>
-    <w:p>
-      <w:pPr>
-        <w:jc w:val="both"/>
-        <w:ind w:firstLine="170"/>
-        <w:spacing w:after="80" w:line="230" w:lineRule="auto"/>
-      </w:pPr>
-      <w:r>
-        <w:rPr>
-          <w:rFonts w:ascii="Times New Roman" w:hAnsi="Times New Roman" w:cs="Times New Roman"/>
-          <w:sz w:val="19"/>
-          <w:szCs w:val="19"/>
-        </w:rPr>
-        <w:t xml:space="preserve">Domain-Grounding Gap: General-purpose retrievers and models underperform on specialized government terminology and changing policy text without domain adaptation [6], [10].</w:t>
+        <w:t xml:space="preserve">From the survey above, we draw out seven gaps that the current tools leave open.</w:t>
+      </w:r>
+    </w:p>
+    <w:p>
+      <w:pPr>
+        <w:jc w:val="both"/>
+        <w:ind w:firstLine="170"/>
+        <w:spacing w:after="80" w:line="230" w:lineRule="auto"/>
+      </w:pPr>
+      <w:r>
+        <w:rPr>
+          <w:rFonts w:ascii="Times New Roman" w:hAnsi="Times New Roman" w:cs="Times New Roman"/>
+          <w:sz w:val="19"/>
+          <w:szCs w:val="19"/>
+        </w:rPr>
+        <w:t xml:space="preserve">Scheme-Discovery Gap: Because portals are name-indexed, a citizen who does not already know a scheme’s name has nowhere to start. Discovery that works from a described situation is, for the most part, simply not available [1].</w:t>
+      </w:r>
+    </w:p>
+    <w:p>
+      <w:pPr>
+        <w:jc w:val="both"/>
+        <w:ind w:firstLine="170"/>
+        <w:spacing w:after="80" w:line="230" w:lineRule="auto"/>
+      </w:pPr>
+      <w:r>
+        <w:rPr>
+          <w:rFonts w:ascii="Times New Roman" w:hAnsi="Times New Roman" w:cs="Times New Roman"/>
+          <w:sz w:val="19"/>
+          <w:szCs w:val="19"/>
+        </w:rPr>
+        <w:t xml:space="preserve">Personalization Gap: What portals offer is generic. The same page is shown to everyone, regardless of a person’s occupation, family circumstances, or where they live.</w:t>
+      </w:r>
+    </w:p>
+    <w:p>
+      <w:pPr>
+        <w:jc w:val="both"/>
+        <w:ind w:firstLine="170"/>
+        <w:spacing w:after="80" w:line="230" w:lineRule="auto"/>
+      </w:pPr>
+      <w:r>
+        <w:rPr>
+          <w:rFonts w:ascii="Times New Roman" w:hAnsi="Times New Roman" w:cs="Times New Roman"/>
+          <w:sz w:val="19"/>
+          <w:szCs w:val="19"/>
+        </w:rPr>
+        <w:t xml:space="preserve">Eligibility-Explanation Gap: A yes or no on its own tells a citizen very little. They need to see why the decision came out that way, with the reason traceable to a source they can trust [4], [9].</w:t>
+      </w:r>
+    </w:p>
+    <w:p>
+      <w:pPr>
+        <w:jc w:val="both"/>
+        <w:ind w:firstLine="170"/>
+        <w:spacing w:after="80" w:line="230" w:lineRule="auto"/>
+      </w:pPr>
+      <w:r>
+        <w:rPr>
+          <w:rFonts w:ascii="Times New Roman" w:hAnsi="Times New Roman" w:cs="Times New Roman"/>
+          <w:sz w:val="19"/>
+          <w:szCs w:val="19"/>
+        </w:rPr>
+        <w:t xml:space="preserve">Conflict Gap: Some benefits cannot be held at the same time, yet existing tools do nothing to flag such clashes—the citizen is left to discover the conflict the hard way.</w:t>
+      </w:r>
+    </w:p>
+    <w:p>
+      <w:pPr>
+        <w:jc w:val="both"/>
+        <w:ind w:firstLine="170"/>
+        <w:spacing w:after="80" w:line="230" w:lineRule="auto"/>
+      </w:pPr>
+      <w:r>
+        <w:rPr>
+          <w:rFonts w:ascii="Times New Roman" w:hAnsi="Times New Roman" w:cs="Times New Roman"/>
+          <w:sz w:val="19"/>
+          <w:szCs w:val="19"/>
+        </w:rPr>
+        <w:t xml:space="preserve">Accessibility Gap: Interfaces that are text-first and single-language shut out a large number of rural users, who would be far better served by voice and more than one language [2], [5].</w:t>
+      </w:r>
+    </w:p>
+    <w:p>
+      <w:pPr>
+        <w:jc w:val="both"/>
+        <w:ind w:firstLine="170"/>
+        <w:spacing w:after="80" w:line="230" w:lineRule="auto"/>
+      </w:pPr>
+      <w:r>
+        <w:rPr>
+          <w:rFonts w:ascii="Times New Roman" w:hAnsi="Times New Roman" w:cs="Times New Roman"/>
+          <w:sz w:val="19"/>
+          <w:szCs w:val="19"/>
+        </w:rPr>
+        <w:t xml:space="preserve">Guidance Gap: Identifying a scheme is only half the task. After that, people still need to know which documents to gather and what the application steps actually are.</w:t>
+      </w:r>
+    </w:p>
+    <w:p>
+      <w:pPr>
+        <w:jc w:val="both"/>
+        <w:ind w:firstLine="170"/>
+        <w:spacing w:after="80" w:line="230" w:lineRule="auto"/>
+      </w:pPr>
+      <w:r>
+        <w:rPr>
+          <w:rFonts w:ascii="Times New Roman" w:hAnsi="Times New Roman" w:cs="Times New Roman"/>
+          <w:sz w:val="19"/>
+          <w:szCs w:val="19"/>
+        </w:rPr>
+        <w:t xml:space="preserve">Domain-Grounding Gap: Off-the-shelf retrievers and models tend to stumble on specialised government terminology and on policy text that keeps changing, unless they are adapted to the domain [6], [10].</w:t>
       </w:r>
     </w:p>
     <w:p>
@@ -2035,7 +2050,7 @@
           <w:sz w:val="19"/>
           <w:szCs w:val="19"/>
         </w:rPr>
-        <w:t xml:space="preserve">Unlike benchmark NLP tasks, GraminSahay is grounded in an authoritative, curated corpus rather than a labelled dataset. The planned knowledge sources are:</w:t>
+        <w:t xml:space="preserve">GraminSahay does not learn from a labelled benchmark the way many NLP tasks do; it is anchored instead in a hand-curated corpus of authoritative material. We plan to draw on four kinds of source:</w:t>
       </w:r>
     </w:p>
     <w:p>
@@ -2140,7 +2155,7 @@
           <w:sz w:val="19"/>
           <w:szCs w:val="19"/>
         </w:rPr>
-        <w:t xml:space="preserve">Although many welfare schemes exist and recent advances in RAG and LLMs enable grounded question answering, rural citizens still cannot reliably discover and act on the benefits they are entitled to. Existing portals are organized around scheme names, provide generic rather than personalized information, offer limited explanation of eligibility, do not detect conflicting schemes, and present significant language and accessibility barriers. There is therefore a need for an explainable, situation-aware, multilingual, voice-first navigator that understands a citizen’s situation, retrieves relevant official information, reasons about eligibility, flags scheme conflicts, and guides the citizen through application—without requiring prior knowledge of a scheme’s name.</w:t>
+        <w:t xml:space="preserve">The schemes are there, and RAG and LLMs now make grounded question answering practical—yet rural citizens still cannot dependably find the benefits they are owed, let alone act on them. The portals they are given are name-indexed, generic rather than personal, thin on explanation, blind to conflicts between schemes, and difficult to use for anyone outside the dominant language. What is needed, then, is a navigator that is explainable, situation-aware, multilingual, and voice-first: one that reads a citizen’s situation, retrieves the right official information, works out eligibility, warns about conflicting schemes, and sees the person through to application—none of which should require the citizen to know a scheme’s name in advance.</w:t>
       </w:r>
     </w:p>
     <w:p>
@@ -2170,7 +2185,7 @@
           <w:sz w:val="19"/>
           <w:szCs w:val="19"/>
         </w:rPr>
-        <w:t xml:space="preserve">The practical problem is that eligible rural citizens miss out on welfare benefits primarily because of an awareness and interpretation barrier, not a lack of schemes. Existing approaches are insufficient: manual portal search assumes prior knowledge, generic information ignores individual circumstances, and text-only single-language interfaces exclude many intended beneficiaries. Advances in RAG provide an opportunity to ground answers in official documents [8]; retrieval-augmented reasoning supports multi-step eligibility inference [3], [9]; faithfulness-aware generation and automated evaluation help keep answers supported by evidence [4], [7]; and multilingual retrieval with Indic speech processing makes the system usable by voice in a citizen’s own language [2], [5]. These observations motivate a unified framework that combines situation understanding, RAG retrieval, eligibility reasoning, scheme-conflict detection, and voice-based multilingual delivery into a single explainable welfare navigator aligned with SDG 1 (No Poverty) and SDG 10 (Reduced Inequalities).</w:t>
+        <w:t xml:space="preserve">What drives this work is a fairly blunt observation: eligible rural citizens miss out on benefits mainly because they cannot find or understand them, not because the benefits do not exist. The usual answers fall short. Manual portal search already assumes you know what you are looking for; generic pages ignore who you actually are; and text-only, single-language interfaces leave out many of the very people the schemes were meant for. Recent research offers the pieces of a better answer. RAG lets us anchor replies in official documents [8]. Retrieval-augmented reasoning handles the multi-step inference that deciding eligibility really involves [3], [9]. Faithfulness-aware generation and automated evaluation keep the answers tethered to the evidence [4], [7]. And multilingual retrieval together with Indic speech makes the whole thing usable by voice in a citizen’s own language [2], [5]. Our aim is to bring these pieces together—situation understanding, RAG retrieval, eligibility reasoning, conflict detection, and multilingual voice—into one explainable welfare navigator that speaks to SDG 1 (No Poverty) and SDG 10 (Reduced Inequalities).</w:t>
       </w:r>
     </w:p>
     <w:p>
@@ -2200,82 +2215,97 @@
           <w:sz w:val="19"/>
           <w:szCs w:val="19"/>
         </w:rPr>
-        <w:t xml:space="preserve">Objective 1: To develop a multilingual, voice-first interface (Indic STT/TTS, English + Telugu + Hindi) through which a citizen can describe their situation.</w:t>
-      </w:r>
-    </w:p>
-    <w:p>
-      <w:pPr>
-        <w:jc w:val="both"/>
-        <w:ind w:firstLine="170"/>
-        <w:spacing w:after="80" w:line="230" w:lineRule="auto"/>
-      </w:pPr>
-      <w:r>
-        <w:rPr>
-          <w:rFonts w:ascii="Times New Roman" w:hAnsi="Times New Roman" w:cs="Times New Roman"/>
-          <w:sz w:val="19"/>
-          <w:szCs w:val="19"/>
-        </w:rPr>
-        <w:t xml:space="preserve">Objective 2: To extract a structured user profile—occupation, family situation, location, and other relevant details—from the citizen’s free-form description.</w:t>
-      </w:r>
-    </w:p>
-    <w:p>
-      <w:pPr>
-        <w:jc w:val="both"/>
-        <w:ind w:firstLine="170"/>
-        <w:spacing w:after="80" w:line="230" w:lineRule="auto"/>
-      </w:pPr>
-      <w:r>
-        <w:rPr>
-          <w:rFonts w:ascii="Times New Roman" w:hAnsi="Times New Roman" w:cs="Times New Roman"/>
-          <w:sz w:val="19"/>
-          <w:szCs w:val="19"/>
-        </w:rPr>
-        <w:t xml:space="preserve">Objective 3: To build a RAG pipeline over official scheme and policy documents using a vector database for semantic retrieval.</w:t>
-      </w:r>
-    </w:p>
-    <w:p>
-      <w:pPr>
-        <w:jc w:val="both"/>
-        <w:ind w:firstLine="170"/>
-        <w:spacing w:after="80" w:line="230" w:lineRule="auto"/>
-      </w:pPr>
-      <w:r>
-        <w:rPr>
-          <w:rFonts w:ascii="Times New Roman" w:hAnsi="Times New Roman" w:cs="Times New Roman"/>
-          <w:sz w:val="19"/>
-          <w:szCs w:val="19"/>
-        </w:rPr>
-        <w:t xml:space="preserve">Objective 4: To design an eligibility-reasoning layer that classifies each scheme as eligible, possibly eligible, not eligible, or missing information, with an explanation.</w:t>
-      </w:r>
-    </w:p>
-    <w:p>
-      <w:pPr>
-        <w:jc w:val="both"/>
-        <w:ind w:firstLine="170"/>
-        <w:spacing w:after="80" w:line="230" w:lineRule="auto"/>
-      </w:pPr>
-      <w:r>
-        <w:rPr>
-          <w:rFonts w:ascii="Times New Roman" w:hAnsi="Times New Roman" w:cs="Times New Roman"/>
-          <w:sz w:val="19"/>
-          <w:szCs w:val="19"/>
-        </w:rPr>
-        <w:t xml:space="preserve">Objective 5: To implement scheme-conflict detection that warns when mutually exclusive benefits are selected.</w:t>
-      </w:r>
-    </w:p>
-    <w:p>
-      <w:pPr>
-        <w:jc w:val="both"/>
-        <w:ind w:firstLine="170"/>
-        <w:spacing w:after="80" w:line="230" w:lineRule="auto"/>
-      </w:pPr>
-      <w:r>
-        <w:rPr>
-          <w:rFonts w:ascii="Times New Roman" w:hAnsi="Times New Roman" w:cs="Times New Roman"/>
-          <w:sz w:val="19"/>
-          <w:szCs w:val="19"/>
-        </w:rPr>
-        <w:t xml:space="preserve">Objective 6: To generate step-by-step application guidance, including required documents and links to the official portal/office, for the five pilot welfare categories.</w:t>
+        <w:t xml:space="preserve">The work is organised around six concrete objectives.</w:t>
+      </w:r>
+    </w:p>
+    <w:p>
+      <w:pPr>
+        <w:jc w:val="both"/>
+        <w:ind w:firstLine="170"/>
+        <w:spacing w:after="80" w:line="230" w:lineRule="auto"/>
+      </w:pPr>
+      <w:r>
+        <w:rPr>
+          <w:rFonts w:ascii="Times New Roman" w:hAnsi="Times New Roman" w:cs="Times New Roman"/>
+          <w:sz w:val="19"/>
+          <w:szCs w:val="19"/>
+        </w:rPr>
+        <w:t xml:space="preserve">Objective 1: Build a voice-first, multilingual front end—Indic STT/TTS in English, Telugu, and Hindi—so a citizen can simply say what their situation is.</w:t>
+      </w:r>
+    </w:p>
+    <w:p>
+      <w:pPr>
+        <w:jc w:val="both"/>
+        <w:ind w:firstLine="170"/>
+        <w:spacing w:after="80" w:line="230" w:lineRule="auto"/>
+      </w:pPr>
+      <w:r>
+        <w:rPr>
+          <w:rFonts w:ascii="Times New Roman" w:hAnsi="Times New Roman" w:cs="Times New Roman"/>
+          <w:sz w:val="19"/>
+          <w:szCs w:val="19"/>
+        </w:rPr>
+        <w:t xml:space="preserve">Objective 2: Turn that free-form description into a structured profile: occupation, family situation, location, and whatever else bears on eligibility.</w:t>
+      </w:r>
+    </w:p>
+    <w:p>
+      <w:pPr>
+        <w:jc w:val="both"/>
+        <w:ind w:firstLine="170"/>
+        <w:spacing w:after="80" w:line="230" w:lineRule="auto"/>
+      </w:pPr>
+      <w:r>
+        <w:rPr>
+          <w:rFonts w:ascii="Times New Roman" w:hAnsi="Times New Roman" w:cs="Times New Roman"/>
+          <w:sz w:val="19"/>
+          <w:szCs w:val="19"/>
+        </w:rPr>
+        <w:t xml:space="preserve">Objective 3: Stand up a RAG pipeline over the official scheme and policy documents, backed by a vector database for semantic retrieval.</w:t>
+      </w:r>
+    </w:p>
+    <w:p>
+      <w:pPr>
+        <w:jc w:val="both"/>
+        <w:ind w:firstLine="170"/>
+        <w:spacing w:after="80" w:line="230" w:lineRule="auto"/>
+      </w:pPr>
+      <w:r>
+        <w:rPr>
+          <w:rFonts w:ascii="Times New Roman" w:hAnsi="Times New Roman" w:cs="Times New Roman"/>
+          <w:sz w:val="19"/>
+          <w:szCs w:val="19"/>
+        </w:rPr>
+        <w:t xml:space="preserve">Objective 4: Add a reasoning layer that labels each scheme eligible, possibly eligible, not eligible, or missing information—and says why.</w:t>
+      </w:r>
+    </w:p>
+    <w:p>
+      <w:pPr>
+        <w:jc w:val="both"/>
+        <w:ind w:firstLine="170"/>
+        <w:spacing w:after="80" w:line="230" w:lineRule="auto"/>
+      </w:pPr>
+      <w:r>
+        <w:rPr>
+          <w:rFonts w:ascii="Times New Roman" w:hAnsi="Times New Roman" w:cs="Times New Roman"/>
+          <w:sz w:val="19"/>
+          <w:szCs w:val="19"/>
+        </w:rPr>
+        <w:t xml:space="preserve">Objective 5: Detect scheme conflicts, so the citizen is warned when two benefits cannot be claimed together.</w:t>
+      </w:r>
+    </w:p>
+    <w:p>
+      <w:pPr>
+        <w:jc w:val="both"/>
+        <w:ind w:firstLine="170"/>
+        <w:spacing w:after="80" w:line="230" w:lineRule="auto"/>
+      </w:pPr>
+      <w:r>
+        <w:rPr>
+          <w:rFonts w:ascii="Times New Roman" w:hAnsi="Times New Roman" w:cs="Times New Roman"/>
+          <w:sz w:val="19"/>
+          <w:szCs w:val="19"/>
+        </w:rPr>
+        <w:t xml:space="preserve">Objective 6: Produce step-by-step application guidance for the five pilot categories, listing the documents required and pointing to the official portal or office.</w:t>
       </w:r>
     </w:p>
     <w:p>
@@ -2321,7 +2351,7 @@
           <w:sz w:val="19"/>
           <w:szCs w:val="19"/>
         </w:rPr>
-        <w:t xml:space="preserve">In the current approach, citizens manually search government portals and documents, typically needing to know a scheme’s name beforehand. Information is spread across multiple sources; eligibility and document requirements require manual interpretation; and personalized guidance is unavailable. The basic flow is shown in Fig. 1. Its principal limitations are manual search, limited personalization, language barriers, and no integrated conflict detection.</w:t>
+        <w:t xml:space="preserve">As things stand, a citizen has to hunt through government portals and documents by hand, usually needing the scheme’s name just to begin. The relevant details are scattered across several places, eligibility and document requirements have to be worked out by reading the fine print, and nobody tailors any of it to the individual. Fig. 1 shows this flow. Its weak points are not subtle: the search is manual, there is almost no personalisation, language is a barrier, and nothing warns you when two schemes conflict.</w:t>
       </w:r>
     </w:p>
     <w:p>
@@ -2428,7 +2458,7 @@
           <w:sz w:val="19"/>
           <w:szCs w:val="19"/>
         </w:rPr>
-        <w:t xml:space="preserve">GraminSahay replaces name-based search with situation-first discovery, as illustrated in Fig. 2. A citizen’s spoken or typed description is converted to a structured profile; a RAG layer retrieves relevant passages from the official-document index; an LLM-based reasoning layer determines and explains eligibility; a conflict-detection layer warns about mutually exclusive benefits; and an application-guidance layer produces next steps. The final response is delivered as multilingual voice output in the citizen’s selected language.</w:t>
+        <w:t xml:space="preserve">GraminSahay swaps name-based search for situation-first discovery (Fig. 2). Whatever the citizen says or types becomes a structured profile. From there a RAG layer fetches the relevant passages out of the official-document index, an LLM reasoning layer decides eligibility and explains it, a conflict-detection layer raises a flag when two benefits are mutually exclusive, and a guidance layer lays out what to do next. The answer comes back as multilingual voice in whichever language the citizen chose.</w:t>
       </w:r>
     </w:p>
     <w:p>
@@ -2534,127 +2564,127 @@
           <w:sz w:val="19"/>
           <w:szCs w:val="19"/>
         </w:rPr>
-        <w:t xml:space="preserve">1) Citizen Interaction: The citizen provides input by voice (Indic STT) or text and selects a language (English + Telugu + Hindi). An example query is “I am a farmer with a small landholding.”</w:t>
-      </w:r>
-    </w:p>
-    <w:p>
-      <w:pPr>
-        <w:jc w:val="both"/>
-        <w:ind w:firstLine="170"/>
-        <w:spacing w:after="80" w:line="230" w:lineRule="auto"/>
-      </w:pPr>
-      <w:r>
-        <w:rPr>
-          <w:rFonts w:ascii="Times New Roman" w:hAnsi="Times New Roman" w:cs="Times New Roman"/>
-          <w:sz w:val="19"/>
-          <w:szCs w:val="19"/>
-        </w:rPr>
-        <w:t xml:space="preserve">2) Profile Understanding: The system extracts a structured profile—occupation, family situation, location, and other details—from the free-form description.</w:t>
-      </w:r>
-    </w:p>
-    <w:p>
-      <w:pPr>
-        <w:jc w:val="both"/>
-        <w:ind w:firstLine="170"/>
-        <w:spacing w:after="80" w:line="230" w:lineRule="auto"/>
-      </w:pPr>
-      <w:r>
-        <w:rPr>
-          <w:rFonts w:ascii="Times New Roman" w:hAnsi="Times New Roman" w:cs="Times New Roman"/>
-          <w:sz w:val="19"/>
-          <w:szCs w:val="19"/>
-        </w:rPr>
-        <w:t xml:space="preserve">3) RAG Retrieval: The profile and query are embedded and used to retrieve the top-k relevant passages from a vector database built over scheme guidelines, eligibility rules, and policy documents.</w:t>
-      </w:r>
-    </w:p>
-    <w:p>
-      <w:pPr>
-        <w:jc w:val="both"/>
-        <w:ind w:firstLine="170"/>
-        <w:spacing w:after="80" w:line="230" w:lineRule="auto"/>
-      </w:pPr>
-      <w:r>
-        <w:rPr>
-          <w:rFonts w:ascii="Times New Roman" w:hAnsi="Times New Roman" w:cs="Times New Roman"/>
-          <w:sz w:val="19"/>
-          <w:szCs w:val="19"/>
-        </w:rPr>
-        <w:t xml:space="preserve">4) Eligibility Reasoning: An LLM analyzes each candidate scheme against the retrieved evidence and classifies it as eligible, possibly eligible, not eligible, or missing information, stating what additional detail is needed where applicable.</w:t>
-      </w:r>
-    </w:p>
-    <w:p>
-      <w:pPr>
-        <w:jc w:val="both"/>
-        <w:ind w:firstLine="170"/>
-        <w:spacing w:after="80" w:line="230" w:lineRule="auto"/>
-      </w:pPr>
-      <w:r>
-        <w:rPr>
-          <w:rFonts w:ascii="Times New Roman" w:hAnsi="Times New Roman" w:cs="Times New Roman"/>
-          <w:sz w:val="19"/>
-          <w:szCs w:val="19"/>
-        </w:rPr>
-        <w:t xml:space="preserve">5) Scheme-Conflict Detection: The system checks selected schemes for mutual exclusivity and warns the citizen when benefits cannot legally be claimed together.</w:t>
-      </w:r>
-    </w:p>
-    <w:p>
-      <w:pPr>
-        <w:jc w:val="both"/>
-        <w:ind w:firstLine="170"/>
-        <w:spacing w:after="80" w:line="230" w:lineRule="auto"/>
-      </w:pPr>
-      <w:r>
-        <w:rPr>
-          <w:rFonts w:ascii="Times New Roman" w:hAnsi="Times New Roman" w:cs="Times New Roman"/>
-          <w:sz w:val="19"/>
-          <w:szCs w:val="19"/>
-        </w:rPr>
-        <w:t xml:space="preserve">6) Application Guidance: For a chosen scheme, the system explains why it is relevant, lists required documents, outlines the step-by-step application process, and links to the official portal/office.</w:t>
-      </w:r>
-    </w:p>
-    <w:p>
-      <w:pPr>
-        <w:jc w:val="both"/>
-        <w:ind w:firstLine="170"/>
-        <w:spacing w:after="80" w:line="230" w:lineRule="auto"/>
-      </w:pPr>
-      <w:r>
-        <w:rPr>
-          <w:rFonts w:ascii="Times New Roman" w:hAnsi="Times New Roman" w:cs="Times New Roman"/>
-          <w:sz w:val="19"/>
-          <w:szCs w:val="19"/>
-        </w:rPr>
-        <w:t xml:space="preserve">7) Multilingual Voice Output: The response is rendered through Indic TTS in the citizen’s selected language.</w:t>
-      </w:r>
-    </w:p>
-    <w:p>
-      <w:pPr>
-        <w:jc w:val="both"/>
-        <w:ind w:firstLine="170"/>
-        <w:spacing w:after="80" w:line="230" w:lineRule="auto"/>
-      </w:pPr>
-      <w:r>
-        <w:rPr>
-          <w:rFonts w:ascii="Times New Roman" w:hAnsi="Times New Roman" w:cs="Times New Roman"/>
-          <w:sz w:val="19"/>
-          <w:szCs w:val="19"/>
-        </w:rPr>
-        <w:t xml:space="preserve">8) Evaluation: Retrieval relevance, answer faithfulness, and eligibility-classification quality will be assessed using reference-free RAG metrics [7] and faithfulness evaluation [4]. Retrieval is measured by Recall@k and mean reciprocal rank over labelled situation–scheme pairs; eligibility classification by per-class precision, recall, and macro-F1 across the four labels; and faithfulness by the proportion of justifications fully supported by retrieved passages. A small human-evaluation study with domain reviewers will rate explanation clarity and correctness. [Specific metrics / test-set details to be finalized: ________]</w:t>
-      </w:r>
-    </w:p>
-    <w:p>
-      <w:pPr>
-        <w:jc w:val="both"/>
-        <w:ind w:firstLine="170"/>
-        <w:spacing w:after="80" w:line="230" w:lineRule="auto"/>
-      </w:pPr>
-      <w:r>
-        <w:rPr>
-          <w:rFonts w:ascii="Times New Roman" w:hAnsi="Times New Roman" w:cs="Times New Roman"/>
-          <w:sz w:val="19"/>
-          <w:szCs w:val="19"/>
-        </w:rPr>
-        <w:t xml:space="preserve">Two cross-cutting concerns are built in. Data freshness: because schemes and thresholds change, the corpus is versioned and re-indexed on a schedule, and each answer records the document version it relied on. Privacy: the citizen profile is minimal by design—only attributes needed for eligibility are collected—and sensitive details are not persisted beyond the session unless the citizen opts in, consistent with the governance conditions highlighted in the digital-government literature [1].</w:t>
+        <w:t xml:space="preserve">1) Citizen Interaction: Input arrives either by voice (through Indic STT) or as text, with the citizen picking a language—English, Telugu, or Hindi. A typical opening line is “I am a farmer with a small landholding.”</w:t>
+      </w:r>
+    </w:p>
+    <w:p>
+      <w:pPr>
+        <w:jc w:val="both"/>
+        <w:ind w:firstLine="170"/>
+        <w:spacing w:after="80" w:line="230" w:lineRule="auto"/>
+      </w:pPr>
+      <w:r>
+        <w:rPr>
+          <w:rFonts w:ascii="Times New Roman" w:hAnsi="Times New Roman" w:cs="Times New Roman"/>
+          <w:sz w:val="19"/>
+          <w:szCs w:val="19"/>
+        </w:rPr>
+        <w:t xml:space="preserve">2) Profile Understanding: From that free-form sentence the system pulls out a structured profile: occupation, family situation, location, and any other detail that happens to matter.</w:t>
+      </w:r>
+    </w:p>
+    <w:p>
+      <w:pPr>
+        <w:jc w:val="both"/>
+        <w:ind w:firstLine="170"/>
+        <w:spacing w:after="80" w:line="230" w:lineRule="auto"/>
+      </w:pPr>
+      <w:r>
+        <w:rPr>
+          <w:rFonts w:ascii="Times New Roman" w:hAnsi="Times New Roman" w:cs="Times New Roman"/>
+          <w:sz w:val="19"/>
+          <w:szCs w:val="19"/>
+        </w:rPr>
+        <w:t xml:space="preserve">3) RAG Retrieval: The profile and the query are embedded together and used to fetch the top-k passages from a vector database built over the scheme guidelines, eligibility rules, and policy documents.</w:t>
+      </w:r>
+    </w:p>
+    <w:p>
+      <w:pPr>
+        <w:jc w:val="both"/>
+        <w:ind w:firstLine="170"/>
+        <w:spacing w:after="80" w:line="230" w:lineRule="auto"/>
+      </w:pPr>
+      <w:r>
+        <w:rPr>
+          <w:rFonts w:ascii="Times New Roman" w:hAnsi="Times New Roman" w:cs="Times New Roman"/>
+          <w:sz w:val="19"/>
+          <w:szCs w:val="19"/>
+        </w:rPr>
+        <w:t xml:space="preserve">4) Eligibility Reasoning: An LLM weighs each candidate scheme against the retrieved evidence and tags it eligible, possibly eligible, not eligible, or missing information—and where something is missing, it says what else it would need to know.</w:t>
+      </w:r>
+    </w:p>
+    <w:p>
+      <w:pPr>
+        <w:jc w:val="both"/>
+        <w:ind w:firstLine="170"/>
+        <w:spacing w:after="80" w:line="230" w:lineRule="auto"/>
+      </w:pPr>
+      <w:r>
+        <w:rPr>
+          <w:rFonts w:ascii="Times New Roman" w:hAnsi="Times New Roman" w:cs="Times New Roman"/>
+          <w:sz w:val="19"/>
+          <w:szCs w:val="19"/>
+        </w:rPr>
+        <w:t xml:space="preserve">5) Scheme-Conflict Detection: The chosen schemes are checked against one another, and the citizen is warned whenever two benefits cannot legally be held together.</w:t>
+      </w:r>
+    </w:p>
+    <w:p>
+      <w:pPr>
+        <w:jc w:val="both"/>
+        <w:ind w:firstLine="170"/>
+        <w:spacing w:after="80" w:line="230" w:lineRule="auto"/>
+      </w:pPr>
+      <w:r>
+        <w:rPr>
+          <w:rFonts w:ascii="Times New Roman" w:hAnsi="Times New Roman" w:cs="Times New Roman"/>
+          <w:sz w:val="19"/>
+          <w:szCs w:val="19"/>
+        </w:rPr>
+        <w:t xml:space="preserve">6) Application Guidance: Once a scheme is picked, the system explains why it fits, lists the documents needed, spells out the application steps, and links through to the official portal or office.</w:t>
+      </w:r>
+    </w:p>
+    <w:p>
+      <w:pPr>
+        <w:jc w:val="both"/>
+        <w:ind w:firstLine="170"/>
+        <w:spacing w:after="80" w:line="230" w:lineRule="auto"/>
+      </w:pPr>
+      <w:r>
+        <w:rPr>
+          <w:rFonts w:ascii="Times New Roman" w:hAnsi="Times New Roman" w:cs="Times New Roman"/>
+          <w:sz w:val="19"/>
+          <w:szCs w:val="19"/>
+        </w:rPr>
+        <w:t xml:space="preserve">7) Multilingual Voice Output: Finally the reply is spoken back through Indic TTS in whichever language the citizen selected.</w:t>
+      </w:r>
+    </w:p>
+    <w:p>
+      <w:pPr>
+        <w:jc w:val="both"/>
+        <w:ind w:firstLine="170"/>
+        <w:spacing w:after="80" w:line="230" w:lineRule="auto"/>
+      </w:pPr>
+      <w:r>
+        <w:rPr>
+          <w:rFonts w:ascii="Times New Roman" w:hAnsi="Times New Roman" w:cs="Times New Roman"/>
+          <w:sz w:val="19"/>
+          <w:szCs w:val="19"/>
+        </w:rPr>
+        <w:t xml:space="preserve">8) Evaluation: We will judge the pipeline on three fronts—retrieval relevance, answer faithfulness, and eligibility-classification quality—using reference-free RAG metrics [7] alongside faithfulness evaluation [4]. Concretely, retrieval is scored with Recall@k and mean reciprocal rank over labelled situation–scheme pairs; classification with per-class precision, recall, and macro-F1 across the four labels; and faithfulness as the fraction of justifications that the retrieved passages fully back up. On top of the automated numbers, a small panel of domain reviewers will rate how clear and how correct the explanations are. [Specific metrics / test-set details to be finalized: ________]</w:t>
+      </w:r>
+    </w:p>
+    <w:p>
+      <w:pPr>
+        <w:jc w:val="both"/>
+        <w:ind w:firstLine="170"/>
+        <w:spacing w:after="80" w:line="230" w:lineRule="auto"/>
+      </w:pPr>
+      <w:r>
+        <w:rPr>
+          <w:rFonts w:ascii="Times New Roman" w:hAnsi="Times New Roman" w:cs="Times New Roman"/>
+          <w:sz w:val="19"/>
+          <w:szCs w:val="19"/>
+        </w:rPr>
+        <w:t xml:space="preserve">Two concerns run across the whole design. One is keeping the data fresh: schemes and thresholds move, so the corpus is versioned and re-indexed on a schedule, and every answer notes the document version it leaned on. The other is privacy: we keep the citizen profile deliberately thin—only the attributes eligibility actually needs—and nothing sensitive is held past the session unless the citizen opts in, which lines up with the governance conditions the digital-government literature stresses [1].</w:t>
       </w:r>
     </w:p>
     <w:p>
@@ -2684,7 +2714,7 @@
           <w:sz w:val="19"/>
           <w:szCs w:val="19"/>
         </w:rPr>
-        <w:t xml:space="preserve">Fig. 3 presents the layered architecture of GraminSahay. Processing flows top-down from citizen interaction through profile understanding, RAG retrieval, eligibility reasoning, conflict detection, and application guidance, culminating in multilingual voice output. The technology-stack band summarizes the implementation: a Flutter / React Native frontend, a FastAPI / Node.js backend, a PostgreSQL store for user and application data, a multilingual LLM with RAG for reasoning and generation, a vector database for document retrieval, and Indic STT/TTS for voice interaction.</w:t>
+        <w:t xml:space="preserve">The layered architecture is drawn in Fig. 3. Work moves top to bottom—citizen interaction, profile understanding, RAG retrieval, eligibility reasoning, conflict detection, application guidance—and ends in multilingual voice output. The band at the bottom names the stack we intend to use: a Flutter / React Native front end, a FastAPI / Node.js back end, PostgreSQL for user and application data, a multilingual LLM with RAG doing the reasoning and generation, a vector database handling document retrieval, and Indic STT/TTS for the voice side.</w:t>
       </w:r>
     </w:p>
     <w:p>
@@ -2790,7 +2820,7 @@
           <w:sz w:val="19"/>
           <w:szCs w:val="19"/>
         </w:rPr>
-        <w:t xml:space="preserve">As this is a research proposal, the following results are the expected outcomes anticipated from the planned implementation and evaluation. They establish target performance levels; measured values will be substituted after experimentation. [Replace expected figures with measured values after experiments: ________]</w:t>
+        <w:t xml:space="preserve">Since this is a proposal rather than a finished build, the figures below are what we expect once the system is implemented and evaluated. Think of them as targets to aim at; the real numbers will replace them after the experiments are run. [Replace expected figures with measured values after experiments: ________]</w:t>
       </w:r>
     </w:p>
     <w:p>
@@ -2821,7 +2851,7 @@
           <w:sz w:val="19"/>
           <w:szCs w:val="19"/>
         </w:rPr>
-        <w:t xml:space="preserve">Table II summarizes the anticipated performance of the GraminSahay pipeline across the five pilot welfare categories, using retrieval Recall@5, answer faithfulness [4], [7], eligibility-classification accuracy, and macro-F1.</w:t>
+        <w:t xml:space="preserve">Table II lays out the performance we anticipate across the five pilot categories, reported as retrieval Recall@5, answer faithfulness [4], [7], eligibility-classification accuracy, and macro-F1.</w:t>
       </w:r>
     </w:p>
     <w:p>
@@ -4043,7 +4073,7 @@
           <w:sz w:val="19"/>
           <w:szCs w:val="19"/>
         </w:rPr>
-        <w:t xml:space="preserve">Fig. 4 shows the expected eligibility-classification accuracy per welfare category, and Fig. 5 shows the anticipated trade-off between retrieval Recall@k and answer faithfulness as the number of retrieved passages (k) increases—larger k raises recall but can dilute faithfulness, motivating a balanced operating point around k = 5.</w:t>
+        <w:t xml:space="preserve">Fig. 4 plots the expected classification accuracy for each category. Fig. 5 traces what happens to retrieval Recall@k and answer faithfulness as we pull back more passages: a bigger k lifts recall but tends to water down faithfulness, which is why we settle on roughly k = 5 as a sensible middle ground.</w:t>
       </w:r>
     </w:p>
     <w:p>
@@ -4182,7 +4212,7 @@
           <w:sz w:val="19"/>
           <w:szCs w:val="19"/>
         </w:rPr>
-        <w:t xml:space="preserve">The expected results in Tables II and III and Figs. 4 and 5 describe the target operating behaviour of the system. The per-category figures in Table II are deliberately conservative for healthcare and education, where eligibility depends on more conditions (income bands, institution type, age) and is harder to classify than, say, pension schemes whose criteria are comparatively uniform. The capability comparison in Table III captures the qualitative difference that matters most to a citizen: the existing manual process offers none of situation-first discovery, explainable eligibility, or conflict detection, whereas the proposed system offers all three. Fig. 5 makes explicit the central trade-off—retrieving more passages raises recall but can dilute the share of the answer strictly supported by evidence—justifying a balanced operating point near k = 5. These targets act as acceptance thresholds: a configuration is successful only if it meets or exceeds the tabulated accuracy and faithfulness while keeping end-to-end latency within an interactive budget suitable for a voice interface.</w:t>
+        <w:t xml:space="preserve">Taken together, Tables II and III and Figs. 4 and 5 describe how we want the system to behave. The healthcare and education numbers in Table II are kept deliberately modest: eligibility there hinges on several conditions at once—income bands, institution type, age—which is simply harder to get right than, say, a pension scheme with fairly uniform rules. Table III, meanwhile, is about the difference a citizen would actually feel: the manual process offers no situation-first discovery, no explainable eligibility, and no conflict detection, while the proposed system offers all three. Fig. 5 puts the main tension on the table—more passages mean higher recall but a smaller fraction of the answer that is strictly backed by evidence—and that is what pushes us toward k &amp;asymp; 5. We treat these figures as acceptance thresholds rather than aspirations: a configuration passes only if it hits the tabulated accuracy and faithfulness and keeps end-to-end latency low enough to feel interactive over voice.</w:t>
       </w:r>
     </w:p>
     <w:p>
@@ -4212,112 +4242,112 @@
           <w:sz w:val="19"/>
           <w:szCs w:val="19"/>
         </w:rPr>
-        <w:t xml:space="preserve">Several extensions are planned beyond the initial prototype:</w:t>
-      </w:r>
-    </w:p>
-    <w:p>
-      <w:pPr>
-        <w:jc w:val="both"/>
-        <w:ind w:firstLine="170"/>
-        <w:spacing w:after="80" w:line="230" w:lineRule="auto"/>
-      </w:pPr>
-      <w:r>
-        <w:rPr>
-          <w:rFonts w:ascii="Times New Roman" w:hAnsi="Times New Roman" w:cs="Times New Roman"/>
-          <w:sz w:val="19"/>
-          <w:szCs w:val="19"/>
-        </w:rPr>
-        <w:t xml:space="preserve">• Broader coverage: Expand beyond the five pilot categories and beyond Telangana to additional states and central schemes, with a continuously updated policy corpus.</w:t>
-      </w:r>
-    </w:p>
-    <w:p>
-      <w:pPr>
-        <w:jc w:val="both"/>
-        <w:ind w:firstLine="170"/>
-        <w:spacing w:after="80" w:line="230" w:lineRule="auto"/>
-      </w:pPr>
-      <w:r>
-        <w:rPr>
-          <w:rFonts w:ascii="Times New Roman" w:hAnsi="Times New Roman" w:cs="Times New Roman"/>
-          <w:sz w:val="19"/>
-          <w:szCs w:val="19"/>
-        </w:rPr>
-        <w:t xml:space="preserve">• More languages: Extend Indic STT/TTS and multilingual retrieval beyond English, Telugu, and Hindi to further regional languages and dialects.</w:t>
-      </w:r>
-    </w:p>
-    <w:p>
-      <w:pPr>
-        <w:jc w:val="both"/>
-        <w:ind w:firstLine="170"/>
-        <w:spacing w:after="80" w:line="230" w:lineRule="auto"/>
-      </w:pPr>
-      <w:r>
-        <w:rPr>
-          <w:rFonts w:ascii="Times New Roman" w:hAnsi="Times New Roman" w:cs="Times New Roman"/>
-          <w:sz w:val="19"/>
-          <w:szCs w:val="19"/>
-        </w:rPr>
-        <w:t xml:space="preserve">• Document-aware applications: Let citizens upload or photograph documents (e.g., land records, ration cards) so the system can auto-verify eligibility conditions and pre-fill application forms.</w:t>
-      </w:r>
-    </w:p>
-    <w:p>
-      <w:pPr>
-        <w:jc w:val="both"/>
-        <w:ind w:firstLine="170"/>
-        <w:spacing w:after="80" w:line="230" w:lineRule="auto"/>
-      </w:pPr>
-      <w:r>
-        <w:rPr>
-          <w:rFonts w:ascii="Times New Roman" w:hAnsi="Times New Roman" w:cs="Times New Roman"/>
-          <w:sz w:val="19"/>
-          <w:szCs w:val="19"/>
-        </w:rPr>
-        <w:t xml:space="preserve">• Offline / low-bandwidth mode: On-device lightweight models and cached scheme data for areas with poor connectivity.</w:t>
-      </w:r>
-    </w:p>
-    <w:p>
-      <w:pPr>
-        <w:jc w:val="both"/>
-        <w:ind w:firstLine="170"/>
-        <w:spacing w:after="80" w:line="230" w:lineRule="auto"/>
-      </w:pPr>
-      <w:r>
-        <w:rPr>
-          <w:rFonts w:ascii="Times New Roman" w:hAnsi="Times New Roman" w:cs="Times New Roman"/>
-          <w:sz w:val="19"/>
-          <w:szCs w:val="19"/>
-        </w:rPr>
-        <w:t xml:space="preserve">• Live policy integration: Direct API integration with official government portals for real-time scheme updates, application submission, and status tracking.</w:t>
-      </w:r>
-    </w:p>
-    <w:p>
-      <w:pPr>
-        <w:jc w:val="both"/>
-        <w:ind w:firstLine="170"/>
-        <w:spacing w:after="80" w:line="230" w:lineRule="auto"/>
-      </w:pPr>
-      <w:r>
-        <w:rPr>
-          <w:rFonts w:ascii="Times New Roman" w:hAnsi="Times New Roman" w:cs="Times New Roman"/>
-          <w:sz w:val="19"/>
-          <w:szCs w:val="19"/>
-        </w:rPr>
-        <w:t xml:space="preserve">• Explainability and trust: Source-cited answers with confidence scores and a human-in-the-loop escalation path for borderline eligibility cases.</w:t>
-      </w:r>
-    </w:p>
-    <w:p>
-      <w:pPr>
-        <w:jc w:val="both"/>
-        <w:ind w:firstLine="170"/>
-        <w:spacing w:after="80" w:line="230" w:lineRule="auto"/>
-      </w:pPr>
-      <w:r>
-        <w:rPr>
-          <w:rFonts w:ascii="Times New Roman" w:hAnsi="Times New Roman" w:cs="Times New Roman"/>
-          <w:sz w:val="19"/>
-          <w:szCs w:val="19"/>
-        </w:rPr>
-        <w:t xml:space="preserve">• Accessibility: Integration with IVR / telephone and WhatsApp channels so citizens without smartphones can access the navigator.</w:t>
+        <w:t xml:space="preserve">Once the prototype is working, there are several directions we would like to take it.</w:t>
+      </w:r>
+    </w:p>
+    <w:p>
+      <w:pPr>
+        <w:jc w:val="both"/>
+        <w:ind w:firstLine="170"/>
+        <w:spacing w:after="80" w:line="230" w:lineRule="auto"/>
+      </w:pPr>
+      <w:r>
+        <w:rPr>
+          <w:rFonts w:ascii="Times New Roman" w:hAnsi="Times New Roman" w:cs="Times New Roman"/>
+          <w:sz w:val="19"/>
+          <w:szCs w:val="19"/>
+        </w:rPr>
+        <w:t xml:space="preserve">• Broader coverage: Push past the five pilot categories and past Telangana—to more states and to central schemes—keeping the policy corpus continuously up to date.</w:t>
+      </w:r>
+    </w:p>
+    <w:p>
+      <w:pPr>
+        <w:jc w:val="both"/>
+        <w:ind w:firstLine="170"/>
+        <w:spacing w:after="80" w:line="230" w:lineRule="auto"/>
+      </w:pPr>
+      <w:r>
+        <w:rPr>
+          <w:rFonts w:ascii="Times New Roman" w:hAnsi="Times New Roman" w:cs="Times New Roman"/>
+          <w:sz w:val="19"/>
+          <w:szCs w:val="19"/>
+        </w:rPr>
+        <w:t xml:space="preserve">• More languages: Grow the Indic STT/TTS and multilingual retrieval beyond English, Telugu, and Hindi into further regional languages and dialects.</w:t>
+      </w:r>
+    </w:p>
+    <w:p>
+      <w:pPr>
+        <w:jc w:val="both"/>
+        <w:ind w:firstLine="170"/>
+        <w:spacing w:after="80" w:line="230" w:lineRule="auto"/>
+      </w:pPr>
+      <w:r>
+        <w:rPr>
+          <w:rFonts w:ascii="Times New Roman" w:hAnsi="Times New Roman" w:cs="Times New Roman"/>
+          <w:sz w:val="19"/>
+          <w:szCs w:val="19"/>
+        </w:rPr>
+        <w:t xml:space="preserve">• Document-aware applications: Allow citizens to upload or photograph documents such as land records or ration cards, so the system can check eligibility conditions automatically and even pre-fill parts of the form.</w:t>
+      </w:r>
+    </w:p>
+    <w:p>
+      <w:pPr>
+        <w:jc w:val="both"/>
+        <w:ind w:firstLine="170"/>
+        <w:spacing w:after="80" w:line="230" w:lineRule="auto"/>
+      </w:pPr>
+      <w:r>
+        <w:rPr>
+          <w:rFonts w:ascii="Times New Roman" w:hAnsi="Times New Roman" w:cs="Times New Roman"/>
+          <w:sz w:val="19"/>
+          <w:szCs w:val="19"/>
+        </w:rPr>
+        <w:t xml:space="preserve">• Offline / low-bandwidth mode: Run lightweight models on-device and cache scheme data, so the navigator still works where connectivity is poor.</w:t>
+      </w:r>
+    </w:p>
+    <w:p>
+      <w:pPr>
+        <w:jc w:val="both"/>
+        <w:ind w:firstLine="170"/>
+        <w:spacing w:after="80" w:line="230" w:lineRule="auto"/>
+      </w:pPr>
+      <w:r>
+        <w:rPr>
+          <w:rFonts w:ascii="Times New Roman" w:hAnsi="Times New Roman" w:cs="Times New Roman"/>
+          <w:sz w:val="19"/>
+          <w:szCs w:val="19"/>
+        </w:rPr>
+        <w:t xml:space="preserve">• Live policy integration: Wire the system directly into government portal APIs for real-time scheme updates, application submission, and status tracking.</w:t>
+      </w:r>
+    </w:p>
+    <w:p>
+      <w:pPr>
+        <w:jc w:val="both"/>
+        <w:ind w:firstLine="170"/>
+        <w:spacing w:after="80" w:line="230" w:lineRule="auto"/>
+      </w:pPr>
+      <w:r>
+        <w:rPr>
+          <w:rFonts w:ascii="Times New Roman" w:hAnsi="Times New Roman" w:cs="Times New Roman"/>
+          <w:sz w:val="19"/>
+          <w:szCs w:val="19"/>
+        </w:rPr>
+        <w:t xml:space="preserve">• Explainability and trust: Attach source citations and confidence scores to every answer, and route borderline eligibility cases to a human for review.</w:t>
+      </w:r>
+    </w:p>
+    <w:p>
+      <w:pPr>
+        <w:jc w:val="both"/>
+        <w:ind w:firstLine="170"/>
+        <w:spacing w:after="80" w:line="230" w:lineRule="auto"/>
+      </w:pPr>
+      <w:r>
+        <w:rPr>
+          <w:rFonts w:ascii="Times New Roman" w:hAnsi="Times New Roman" w:cs="Times New Roman"/>
+          <w:sz w:val="19"/>
+          <w:szCs w:val="19"/>
+        </w:rPr>
+        <w:t xml:space="preserve">• Accessibility: Reach citizens without smartphones by adding IVR / telephone and WhatsApp channels.</w:t>
       </w:r>
     </w:p>
     <w:p>
@@ -4347,7 +4377,7 @@
           <w:sz w:val="19"/>
           <w:szCs w:val="19"/>
         </w:rPr>
-        <w:t xml:space="preserve">This paper reviewed the literature most relevant to building a situation-aware rural welfare navigator and derived the research gaps that motivate GraminSahay. The survey shows that RAG grounds generation in authoritative documents, that faithfulness evaluation and retrieval-augmented reasoning support trustworthy multi-step eligibility inference, that multilingual retrieval and Indic speech processing enable voice-based access in regional languages, and that domain adaptation improves performance on specialized policy text. Building on these foundations, GraminSahay combines situation understanding, RAG retrieval, eligibility reasoning, scheme-conflict detection, and multilingual voice delivery. The expected outcome is an explainable and accessible welfare assistant that helps rural citizens identify relevant government support, understand their eligibility, recognize missing information, and proceed toward application without needing prior knowledge of a scheme’s name. Future work will expand beyond the five pilot categories and the initial language set, and will report quantitative evaluation of retrieval and eligibility performance.</w:t>
+        <w:t xml:space="preserve">This paper surveyed the work most relevant to a situation-aware rural welfare navigator and used it to pin down the research gaps that GraminSahay is meant to close. A few things come through clearly from that survey: RAG keeps generation anchored in authoritative documents; faithfulness evaluation and retrieval-augmented reasoning together make multi-step eligibility inference trustworthy; multilingual retrieval and Indic speech open the door to voice access in regional languages; and domain adaptation is what makes any of this hold up on specialised policy text. GraminSahay stitches these together—situation understanding, RAG retrieval, eligibility reasoning, conflict detection, and multilingual voice. What we expect to end up with is an explainable, accessible assistant that helps a rural citizen find the right government support, grasp whether they qualify, see what information is still missing, and move toward applying—all without having to know a scheme’s name to begin with. The next steps are to widen the system past the five pilot categories and the starting set of languages, and to report real, measured numbers for retrieval and eligibility performance.</w:t>
       </w:r>
     </w:p>
     <w:p>

</xml_diff>

<commit_message>
Add guide email; generate IEEE PDF with all 5 figures embedded
</commit_message>
<xml_diff>
--- a/paper/GraminSahay_IEEE_Paper.docx
+++ b/paper/GraminSahay_IEEE_Paper.docx
@@ -53,7 +53,7 @@
                 <w:sz w:val="18"/>
                 <w:szCs w:val="18"/>
               </w:rPr>
-              <w:t xml:space="preserve">Mr. S. Lingaiah (Guide, Asst. Professor)</w:t>
+              <w:t xml:space="preserve">Mr. S. Lingaiah</w:t>
             </w:r>
           </w:p>
           <w:p>
@@ -96,6 +96,20 @@
                 <w:szCs w:val="16"/>
               </w:rPr>
               <w:t xml:space="preserve">Hyderabad, India</w:t>
+            </w:r>
+          </w:p>
+          <w:p>
+            <w:pPr>
+              <w:jc w:val="center"/>
+              <w:spacing w:after="0"/>
+            </w:pPr>
+            <w:r>
+              <w:rPr>
+                <w:rFonts w:ascii="Times New Roman" w:hAnsi="Times New Roman" w:cs="Times New Roman"/>
+                <w:sz w:val="16"/>
+                <w:szCs w:val="16"/>
+              </w:rPr>
+              <w:t xml:space="preserve">slingaiah@mlrinstitutions.ac.in</w:t>
             </w:r>
           </w:p>
         </w:tc>

</xml_diff>

<commit_message>
Author block as non-table layout; remove red placeholder text; objectives as bullets
</commit_message>
<xml_diff>
--- a/paper/GraminSahay_IEEE_Paper.docx
+++ b/paper/GraminSahay_IEEE_Paper.docx
@@ -2139,7 +2139,7 @@
           <w:sz w:val="19"/>
           <w:szCs w:val="19"/>
         </w:rPr>
-        <w:t xml:space="preserve">These documents are chunked, embedded, and indexed in a vector database for semantic retrieval. [Corpus size / number of schemes / document counts to be filled after collection: ________]</w:t>
+        <w:t xml:space="preserve">These documents are chunked, embedded, and indexed in a vector database for semantic retrieval.</w:t>
       </w:r>
     </w:p>
     <w:p>
@@ -2244,82 +2244,82 @@
           <w:sz w:val="19"/>
           <w:szCs w:val="19"/>
         </w:rPr>
-        <w:t xml:space="preserve">Objective 1: Build a voice-first, multilingual front end—Indic STT/TTS in English, Telugu, and Hindi—so a citizen can simply say what their situation is.</w:t>
-      </w:r>
-    </w:p>
-    <w:p>
-      <w:pPr>
-        <w:jc w:val="both"/>
-        <w:ind w:firstLine="170"/>
-        <w:spacing w:after="80" w:line="230" w:lineRule="auto"/>
-      </w:pPr>
-      <w:r>
-        <w:rPr>
-          <w:rFonts w:ascii="Times New Roman" w:hAnsi="Times New Roman" w:cs="Times New Roman"/>
-          <w:sz w:val="19"/>
-          <w:szCs w:val="19"/>
-        </w:rPr>
-        <w:t xml:space="preserve">Objective 2: Turn that free-form description into a structured profile: occupation, family situation, location, and whatever else bears on eligibility.</w:t>
-      </w:r>
-    </w:p>
-    <w:p>
-      <w:pPr>
-        <w:jc w:val="both"/>
-        <w:ind w:firstLine="170"/>
-        <w:spacing w:after="80" w:line="230" w:lineRule="auto"/>
-      </w:pPr>
-      <w:r>
-        <w:rPr>
-          <w:rFonts w:ascii="Times New Roman" w:hAnsi="Times New Roman" w:cs="Times New Roman"/>
-          <w:sz w:val="19"/>
-          <w:szCs w:val="19"/>
-        </w:rPr>
-        <w:t xml:space="preserve">Objective 3: Stand up a RAG pipeline over the official scheme and policy documents, backed by a vector database for semantic retrieval.</w:t>
-      </w:r>
-    </w:p>
-    <w:p>
-      <w:pPr>
-        <w:jc w:val="both"/>
-        <w:ind w:firstLine="170"/>
-        <w:spacing w:after="80" w:line="230" w:lineRule="auto"/>
-      </w:pPr>
-      <w:r>
-        <w:rPr>
-          <w:rFonts w:ascii="Times New Roman" w:hAnsi="Times New Roman" w:cs="Times New Roman"/>
-          <w:sz w:val="19"/>
-          <w:szCs w:val="19"/>
-        </w:rPr>
-        <w:t xml:space="preserve">Objective 4: Add a reasoning layer that labels each scheme eligible, possibly eligible, not eligible, or missing information—and says why.</w:t>
-      </w:r>
-    </w:p>
-    <w:p>
-      <w:pPr>
-        <w:jc w:val="both"/>
-        <w:ind w:firstLine="170"/>
-        <w:spacing w:after="80" w:line="230" w:lineRule="auto"/>
-      </w:pPr>
-      <w:r>
-        <w:rPr>
-          <w:rFonts w:ascii="Times New Roman" w:hAnsi="Times New Roman" w:cs="Times New Roman"/>
-          <w:sz w:val="19"/>
-          <w:szCs w:val="19"/>
-        </w:rPr>
-        <w:t xml:space="preserve">Objective 5: Detect scheme conflicts, so the citizen is warned when two benefits cannot be claimed together.</w:t>
-      </w:r>
-    </w:p>
-    <w:p>
-      <w:pPr>
-        <w:jc w:val="both"/>
-        <w:ind w:firstLine="170"/>
-        <w:spacing w:after="80" w:line="230" w:lineRule="auto"/>
-      </w:pPr>
-      <w:r>
-        <w:rPr>
-          <w:rFonts w:ascii="Times New Roman" w:hAnsi="Times New Roman" w:cs="Times New Roman"/>
-          <w:sz w:val="19"/>
-          <w:szCs w:val="19"/>
-        </w:rPr>
-        <w:t xml:space="preserve">Objective 6: Produce step-by-step application guidance for the five pilot categories, listing the documents required and pointing to the official portal or office.</w:t>
+        <w:t xml:space="preserve">• Build a voice-first, multilingual front end—Indic STT/TTS in English, Telugu, and Hindi—so a citizen can simply say what their situation is.</w:t>
+      </w:r>
+    </w:p>
+    <w:p>
+      <w:pPr>
+        <w:jc w:val="both"/>
+        <w:ind w:firstLine="170"/>
+        <w:spacing w:after="80" w:line="230" w:lineRule="auto"/>
+      </w:pPr>
+      <w:r>
+        <w:rPr>
+          <w:rFonts w:ascii="Times New Roman" w:hAnsi="Times New Roman" w:cs="Times New Roman"/>
+          <w:sz w:val="19"/>
+          <w:szCs w:val="19"/>
+        </w:rPr>
+        <w:t xml:space="preserve">• Turn that free-form description into a structured profile: occupation, family situation, location, and whatever else bears on eligibility.</w:t>
+      </w:r>
+    </w:p>
+    <w:p>
+      <w:pPr>
+        <w:jc w:val="both"/>
+        <w:ind w:firstLine="170"/>
+        <w:spacing w:after="80" w:line="230" w:lineRule="auto"/>
+      </w:pPr>
+      <w:r>
+        <w:rPr>
+          <w:rFonts w:ascii="Times New Roman" w:hAnsi="Times New Roman" w:cs="Times New Roman"/>
+          <w:sz w:val="19"/>
+          <w:szCs w:val="19"/>
+        </w:rPr>
+        <w:t xml:space="preserve">• Stand up a RAG pipeline over the official scheme and policy documents, backed by a vector database for semantic retrieval.</w:t>
+      </w:r>
+    </w:p>
+    <w:p>
+      <w:pPr>
+        <w:jc w:val="both"/>
+        <w:ind w:firstLine="170"/>
+        <w:spacing w:after="80" w:line="230" w:lineRule="auto"/>
+      </w:pPr>
+      <w:r>
+        <w:rPr>
+          <w:rFonts w:ascii="Times New Roman" w:hAnsi="Times New Roman" w:cs="Times New Roman"/>
+          <w:sz w:val="19"/>
+          <w:szCs w:val="19"/>
+        </w:rPr>
+        <w:t xml:space="preserve">• Add a reasoning layer that labels each scheme eligible, possibly eligible, not eligible, or missing information—and says why.</w:t>
+      </w:r>
+    </w:p>
+    <w:p>
+      <w:pPr>
+        <w:jc w:val="both"/>
+        <w:ind w:firstLine="170"/>
+        <w:spacing w:after="80" w:line="230" w:lineRule="auto"/>
+      </w:pPr>
+      <w:r>
+        <w:rPr>
+          <w:rFonts w:ascii="Times New Roman" w:hAnsi="Times New Roman" w:cs="Times New Roman"/>
+          <w:sz w:val="19"/>
+          <w:szCs w:val="19"/>
+        </w:rPr>
+        <w:t xml:space="preserve">• Detect scheme conflicts, so the citizen is warned when two benefits cannot be claimed together.</w:t>
+      </w:r>
+    </w:p>
+    <w:p>
+      <w:pPr>
+        <w:jc w:val="both"/>
+        <w:ind w:firstLine="170"/>
+        <w:spacing w:after="80" w:line="230" w:lineRule="auto"/>
+      </w:pPr>
+      <w:r>
+        <w:rPr>
+          <w:rFonts w:ascii="Times New Roman" w:hAnsi="Times New Roman" w:cs="Times New Roman"/>
+          <w:sz w:val="19"/>
+          <w:szCs w:val="19"/>
+        </w:rPr>
+        <w:t xml:space="preserve">• Produce step-by-step application guidance for the five pilot categories, listing the documents required and pointing to the official portal or office.</w:t>
       </w:r>
     </w:p>
     <w:p>
@@ -2683,7 +2683,7 @@
           <w:sz w:val="19"/>
           <w:szCs w:val="19"/>
         </w:rPr>
-        <w:t xml:space="preserve">8) Evaluation: We will judge the pipeline on three fronts—retrieval relevance, answer faithfulness, and eligibility-classification quality—using reference-free RAG metrics [7] alongside faithfulness evaluation [4]. Concretely, retrieval is scored with Recall@k and mean reciprocal rank over labelled situation–scheme pairs; classification with per-class precision, recall, and macro-F1 across the four labels; and faithfulness as the fraction of justifications that the retrieved passages fully back up. On top of the automated numbers, a small panel of domain reviewers will rate how clear and how correct the explanations are. [Specific metrics / test-set details to be finalized: ________]</w:t>
+        <w:t xml:space="preserve">8) Evaluation: We will judge the pipeline on three fronts—retrieval relevance, answer faithfulness, and eligibility-classification quality—using reference-free RAG metrics [7] alongside faithfulness evaluation [4]. Concretely, retrieval is scored with Recall@k and mean reciprocal rank over labelled situation–scheme pairs; classification with per-class precision, recall, and macro-F1 across the four labels; and faithfulness as the fraction of justifications that the retrieved passages fully back up. On top of the automated numbers, a small panel of domain reviewers will rate how clear and how correct the explanations are.</w:t>
       </w:r>
     </w:p>
     <w:p>
@@ -2834,7 +2834,7 @@
           <w:sz w:val="19"/>
           <w:szCs w:val="19"/>
         </w:rPr>
-        <w:t xml:space="preserve">Since this is a proposal rather than a finished build, the figures below are what we expect once the system is implemented and evaluated. Think of them as targets to aim at; the real numbers will replace them after the experiments are run. [Replace expected figures with measured values after experiments: ________]</w:t>
+        <w:t xml:space="preserve">Since this is a proposal rather than a finished build, the figures below are what we expect once the system is implemented and evaluated. Think of them as targets to aim at; the real numbers will replace them after the experiments are run.</w:t>
       </w:r>
     </w:p>
     <w:p>

</xml_diff>